<commit_message>
docs: PK1 chapter 8 somewhat done
</commit_message>
<xml_diff>
--- a/51PK Psyhologija karjery/1/PK1_KNT-116m_Onyshchenko_15.docx
+++ b/51PK Psyhologija karjery/1/PK1_KNT-116m_Onyshchenko_15.docx
@@ -4721,6 +4721,255 @@
       </w:pPr>
       <w:r>
         <w:rPr/>
+        <w:t>Зміни, що відбудуться в найближчі 10 років:</w:t>
+      </w:r>
+    </w:p>
+    <w:p>
+      <w:pPr>
+        <w:pStyle w:val="P1"/>
+        <w:widowControl/>
+        <w:numPr>
+          <w:ilvl w:val="0"/>
+          <w:numId w:val="18"/>
+        </w:numPr>
+        <w:suppressAutoHyphens w:val="true"/>
+        <w:bidi w:val="0"/>
+        <w:spacing w:lineRule="auto" w:line="360" w:before="0" w:after="0"/>
+        <w:ind w:firstLine="850" w:left="0" w:right="0"/>
+        <w:jc w:val="both"/>
+        <w:rPr/>
+      </w:pPr>
+      <w:r>
+        <w:rPr/>
+        <w:t>штучний інтелект може стати повноцінним помічником</w:t>
+      </w:r>
+    </w:p>
+    <w:p>
+      <w:pPr>
+        <w:pStyle w:val="P1"/>
+        <w:widowControl/>
+        <w:numPr>
+          <w:ilvl w:val="0"/>
+          <w:numId w:val="18"/>
+        </w:numPr>
+        <w:suppressAutoHyphens w:val="true"/>
+        <w:bidi w:val="0"/>
+        <w:spacing w:lineRule="auto" w:line="360" w:before="0" w:after="0"/>
+        <w:ind w:firstLine="850" w:left="0" w:right="0"/>
+        <w:jc w:val="both"/>
+        <w:rPr/>
+      </w:pPr>
+      <w:r>
+        <w:rPr/>
+        <w:t>розповсюдження хмарних технологій та кібербезпеки</w:t>
+      </w:r>
+    </w:p>
+    <w:p>
+      <w:pPr>
+        <w:pStyle w:val="P1"/>
+        <w:rPr/>
+      </w:pPr>
+      <w:r>
+        <w:rPr/>
+        <w:t>Компетентності, що будуть затребувані:</w:t>
+      </w:r>
+    </w:p>
+    <w:p>
+      <w:pPr>
+        <w:pStyle w:val="P1"/>
+        <w:widowControl/>
+        <w:numPr>
+          <w:ilvl w:val="0"/>
+          <w:numId w:val="19"/>
+        </w:numPr>
+        <w:suppressAutoHyphens w:val="true"/>
+        <w:bidi w:val="0"/>
+        <w:spacing w:lineRule="auto" w:line="360" w:before="0" w:after="0"/>
+        <w:ind w:firstLine="850" w:left="0" w:right="0"/>
+        <w:jc w:val="both"/>
+        <w:rPr/>
+      </w:pPr>
+      <w:r>
+        <w:rPr/>
+        <w:t>вміння адаптуватися</w:t>
+      </w:r>
+    </w:p>
+    <w:p>
+      <w:pPr>
+        <w:pStyle w:val="P1"/>
+        <w:widowControl/>
+        <w:numPr>
+          <w:ilvl w:val="0"/>
+          <w:numId w:val="19"/>
+        </w:numPr>
+        <w:suppressAutoHyphens w:val="true"/>
+        <w:bidi w:val="0"/>
+        <w:spacing w:lineRule="auto" w:line="360" w:before="0" w:after="0"/>
+        <w:ind w:firstLine="850" w:left="0" w:right="0"/>
+        <w:jc w:val="both"/>
+        <w:rPr/>
+      </w:pPr>
+      <w:r>
+        <w:rPr/>
+        <w:t>швидке та постійне навчання</w:t>
+      </w:r>
+    </w:p>
+    <w:p>
+      <w:pPr>
+        <w:pStyle w:val="P1"/>
+        <w:rPr/>
+      </w:pPr>
+      <w:r>
+        <w:rPr/>
+        <w:t>Функції, що можуть бути автоматизованими:</w:t>
+      </w:r>
+    </w:p>
+    <w:p>
+      <w:pPr>
+        <w:pStyle w:val="P1"/>
+        <w:widowControl/>
+        <w:numPr>
+          <w:ilvl w:val="0"/>
+          <w:numId w:val="20"/>
+        </w:numPr>
+        <w:suppressAutoHyphens w:val="true"/>
+        <w:bidi w:val="0"/>
+        <w:spacing w:lineRule="auto" w:line="360" w:before="0" w:after="0"/>
+        <w:ind w:firstLine="850" w:left="0" w:right="0"/>
+        <w:jc w:val="both"/>
+        <w:rPr/>
+      </w:pPr>
+      <w:r>
+        <w:rPr/>
+        <w:t>написання коду</w:t>
+      </w:r>
+    </w:p>
+    <w:p>
+      <w:pPr>
+        <w:pStyle w:val="P1"/>
+        <w:widowControl/>
+        <w:numPr>
+          <w:ilvl w:val="0"/>
+          <w:numId w:val="20"/>
+        </w:numPr>
+        <w:suppressAutoHyphens w:val="true"/>
+        <w:bidi w:val="0"/>
+        <w:spacing w:lineRule="auto" w:line="360" w:before="0" w:after="0"/>
+        <w:ind w:firstLine="850" w:left="0" w:right="0"/>
+        <w:jc w:val="both"/>
+        <w:rPr/>
+      </w:pPr>
+      <w:r>
+        <w:rPr/>
+        <w:t>виконання тестів</w:t>
+      </w:r>
+    </w:p>
+    <w:p>
+      <w:pPr>
+        <w:pStyle w:val="P1"/>
+        <w:rPr/>
+      </w:pPr>
+      <w:r>
+        <w:rPr/>
+        <w:t>Компетентності, які залишаться виключно людськими:</w:t>
+      </w:r>
+    </w:p>
+    <w:p>
+      <w:pPr>
+        <w:pStyle w:val="P1"/>
+        <w:widowControl/>
+        <w:numPr>
+          <w:ilvl w:val="0"/>
+          <w:numId w:val="21"/>
+        </w:numPr>
+        <w:suppressAutoHyphens w:val="true"/>
+        <w:bidi w:val="0"/>
+        <w:spacing w:lineRule="auto" w:line="360" w:before="0" w:after="0"/>
+        <w:ind w:firstLine="850" w:left="0" w:right="0"/>
+        <w:jc w:val="both"/>
+        <w:rPr/>
+      </w:pPr>
+      <w:r>
+        <w:rPr/>
+        <w:t>проєктування архітектури систем</w:t>
+      </w:r>
+    </w:p>
+    <w:p>
+      <w:pPr>
+        <w:pStyle w:val="P1"/>
+        <w:widowControl/>
+        <w:numPr>
+          <w:ilvl w:val="0"/>
+          <w:numId w:val="21"/>
+        </w:numPr>
+        <w:suppressAutoHyphens w:val="true"/>
+        <w:bidi w:val="0"/>
+        <w:spacing w:lineRule="auto" w:line="360" w:before="0" w:after="0"/>
+        <w:ind w:firstLine="850" w:left="0" w:right="0"/>
+        <w:jc w:val="both"/>
+        <w:rPr/>
+      </w:pPr>
+      <w:r>
+        <w:rPr/>
+        <w:t>креативність</w:t>
+      </w:r>
+    </w:p>
+    <w:p>
+      <w:pPr>
+        <w:pStyle w:val="P1"/>
+        <w:rPr/>
+      </w:pPr>
+      <w:r>
+        <w:rPr/>
+      </w:r>
+    </w:p>
+    <w:p>
+      <w:pPr>
+        <w:pStyle w:val="H3"/>
+        <w:rPr/>
+      </w:pPr>
+      <w:r>
+        <w:rPr/>
+        <w:t>Аналітичний висновок</w:t>
+      </w:r>
+    </w:p>
+    <w:p>
+      <w:pPr>
+        <w:pStyle w:val="P1"/>
+        <w:rPr/>
+      </w:pPr>
+      <w:r>
+        <w:rPr/>
+      </w:r>
+    </w:p>
+    <w:p>
+      <w:pPr>
+        <w:pStyle w:val="P1"/>
+        <w:rPr/>
+      </w:pPr>
+      <w:r>
+        <w:rPr/>
+        <w:t>Отримані результати були очікуваними, оскільки галузь штучного інтелекту стрімко розвивається. Переведення фокусу розробників на розробку архітектури систем, кібербезпеку та хмарні технології є логічним кроком.</w:t>
+      </w:r>
+    </w:p>
+    <w:p>
+      <w:pPr>
+        <w:pStyle w:val="P1"/>
+        <w:rPr/>
+      </w:pPr>
+      <w:r>
+        <w:rPr/>
+        <w:t>Погоджуюсь з твердженнями про те, що людина має залишатися відповідальною за розробку складних систем та виконання креативних задач.</w:t>
+      </w:r>
+    </w:p>
+    <w:p>
+      <w:pPr>
+        <w:pStyle w:val="P1"/>
+        <w:rPr/>
+      </w:pPr>
+      <w:r>
+        <w:rPr/>
+        <w:t>Твердження, що потребують перевірки це те, що штучний інтелект стане повноцінним помічником розробника. Хоч ця галузь і розвивається швидко останнім часом, однак якість відповідей від таких систем все ще залишається опосередкованою.</w:t>
       </w:r>
     </w:p>
     <w:sectPr>
@@ -6978,6 +7227,554 @@
     </w:lvl>
   </w:abstractNum>
   <w:abstractNum w:abstractNumId="18">
+    <w:lvl w:ilvl="0">
+      <w:start w:val="1"/>
+      <w:numFmt w:val="bullet"/>
+      <w:lvlText w:val=""/>
+      <w:lvlJc w:val="left"/>
+      <w:pPr>
+        <w:tabs>
+          <w:tab w:val="num" w:pos="720"/>
+        </w:tabs>
+        <w:ind w:left="720" w:hanging="360"/>
+      </w:pPr>
+      <w:rPr>
+        <w:rFonts w:ascii="Symbol" w:hAnsi="Symbol" w:cs="Symbol" w:hint="default"/>
+      </w:rPr>
+    </w:lvl>
+    <w:lvl w:ilvl="1">
+      <w:start w:val="1"/>
+      <w:numFmt w:val="bullet"/>
+      <w:lvlText w:val="◦"/>
+      <w:lvlJc w:val="left"/>
+      <w:pPr>
+        <w:tabs>
+          <w:tab w:val="num" w:pos="1080"/>
+        </w:tabs>
+        <w:ind w:left="1080" w:hanging="360"/>
+      </w:pPr>
+      <w:rPr>
+        <w:rFonts w:ascii="OpenSymbol" w:hAnsi="OpenSymbol" w:cs="OpenSymbol" w:hint="default"/>
+      </w:rPr>
+    </w:lvl>
+    <w:lvl w:ilvl="2">
+      <w:start w:val="1"/>
+      <w:numFmt w:val="bullet"/>
+      <w:lvlText w:val="▪"/>
+      <w:lvlJc w:val="left"/>
+      <w:pPr>
+        <w:tabs>
+          <w:tab w:val="num" w:pos="1440"/>
+        </w:tabs>
+        <w:ind w:left="1440" w:hanging="360"/>
+      </w:pPr>
+      <w:rPr>
+        <w:rFonts w:ascii="OpenSymbol" w:hAnsi="OpenSymbol" w:cs="OpenSymbol" w:hint="default"/>
+      </w:rPr>
+    </w:lvl>
+    <w:lvl w:ilvl="3">
+      <w:start w:val="1"/>
+      <w:numFmt w:val="bullet"/>
+      <w:lvlText w:val=""/>
+      <w:lvlJc w:val="left"/>
+      <w:pPr>
+        <w:tabs>
+          <w:tab w:val="num" w:pos="1800"/>
+        </w:tabs>
+        <w:ind w:left="1800" w:hanging="360"/>
+      </w:pPr>
+      <w:rPr>
+        <w:rFonts w:ascii="Symbol" w:hAnsi="Symbol" w:cs="Symbol" w:hint="default"/>
+      </w:rPr>
+    </w:lvl>
+    <w:lvl w:ilvl="4">
+      <w:start w:val="1"/>
+      <w:numFmt w:val="bullet"/>
+      <w:lvlText w:val="◦"/>
+      <w:lvlJc w:val="left"/>
+      <w:pPr>
+        <w:tabs>
+          <w:tab w:val="num" w:pos="2160"/>
+        </w:tabs>
+        <w:ind w:left="2160" w:hanging="360"/>
+      </w:pPr>
+      <w:rPr>
+        <w:rFonts w:ascii="OpenSymbol" w:hAnsi="OpenSymbol" w:cs="OpenSymbol" w:hint="default"/>
+      </w:rPr>
+    </w:lvl>
+    <w:lvl w:ilvl="5">
+      <w:start w:val="1"/>
+      <w:numFmt w:val="bullet"/>
+      <w:lvlText w:val="▪"/>
+      <w:lvlJc w:val="left"/>
+      <w:pPr>
+        <w:tabs>
+          <w:tab w:val="num" w:pos="2520"/>
+        </w:tabs>
+        <w:ind w:left="2520" w:hanging="360"/>
+      </w:pPr>
+      <w:rPr>
+        <w:rFonts w:ascii="OpenSymbol" w:hAnsi="OpenSymbol" w:cs="OpenSymbol" w:hint="default"/>
+      </w:rPr>
+    </w:lvl>
+    <w:lvl w:ilvl="6">
+      <w:start w:val="1"/>
+      <w:numFmt w:val="bullet"/>
+      <w:lvlText w:val=""/>
+      <w:lvlJc w:val="left"/>
+      <w:pPr>
+        <w:tabs>
+          <w:tab w:val="num" w:pos="2880"/>
+        </w:tabs>
+        <w:ind w:left="2880" w:hanging="360"/>
+      </w:pPr>
+      <w:rPr>
+        <w:rFonts w:ascii="Symbol" w:hAnsi="Symbol" w:cs="Symbol" w:hint="default"/>
+      </w:rPr>
+    </w:lvl>
+    <w:lvl w:ilvl="7">
+      <w:start w:val="1"/>
+      <w:numFmt w:val="bullet"/>
+      <w:lvlText w:val="◦"/>
+      <w:lvlJc w:val="left"/>
+      <w:pPr>
+        <w:tabs>
+          <w:tab w:val="num" w:pos="3240"/>
+        </w:tabs>
+        <w:ind w:left="3240" w:hanging="360"/>
+      </w:pPr>
+      <w:rPr>
+        <w:rFonts w:ascii="OpenSymbol" w:hAnsi="OpenSymbol" w:cs="OpenSymbol" w:hint="default"/>
+      </w:rPr>
+    </w:lvl>
+    <w:lvl w:ilvl="8">
+      <w:start w:val="1"/>
+      <w:numFmt w:val="bullet"/>
+      <w:lvlText w:val="▪"/>
+      <w:lvlJc w:val="left"/>
+      <w:pPr>
+        <w:tabs>
+          <w:tab w:val="num" w:pos="3600"/>
+        </w:tabs>
+        <w:ind w:left="3600" w:hanging="360"/>
+      </w:pPr>
+      <w:rPr>
+        <w:rFonts w:ascii="OpenSymbol" w:hAnsi="OpenSymbol" w:cs="OpenSymbol" w:hint="default"/>
+      </w:rPr>
+    </w:lvl>
+  </w:abstractNum>
+  <w:abstractNum w:abstractNumId="19">
+    <w:lvl w:ilvl="0">
+      <w:start w:val="1"/>
+      <w:numFmt w:val="bullet"/>
+      <w:lvlText w:val=""/>
+      <w:lvlJc w:val="left"/>
+      <w:pPr>
+        <w:tabs>
+          <w:tab w:val="num" w:pos="720"/>
+        </w:tabs>
+        <w:ind w:left="720" w:hanging="360"/>
+      </w:pPr>
+      <w:rPr>
+        <w:rFonts w:ascii="Symbol" w:hAnsi="Symbol" w:cs="Symbol" w:hint="default"/>
+      </w:rPr>
+    </w:lvl>
+    <w:lvl w:ilvl="1">
+      <w:start w:val="1"/>
+      <w:numFmt w:val="bullet"/>
+      <w:lvlText w:val="◦"/>
+      <w:lvlJc w:val="left"/>
+      <w:pPr>
+        <w:tabs>
+          <w:tab w:val="num" w:pos="1080"/>
+        </w:tabs>
+        <w:ind w:left="1080" w:hanging="360"/>
+      </w:pPr>
+      <w:rPr>
+        <w:rFonts w:ascii="OpenSymbol" w:hAnsi="OpenSymbol" w:cs="OpenSymbol" w:hint="default"/>
+      </w:rPr>
+    </w:lvl>
+    <w:lvl w:ilvl="2">
+      <w:start w:val="1"/>
+      <w:numFmt w:val="bullet"/>
+      <w:lvlText w:val="▪"/>
+      <w:lvlJc w:val="left"/>
+      <w:pPr>
+        <w:tabs>
+          <w:tab w:val="num" w:pos="1440"/>
+        </w:tabs>
+        <w:ind w:left="1440" w:hanging="360"/>
+      </w:pPr>
+      <w:rPr>
+        <w:rFonts w:ascii="OpenSymbol" w:hAnsi="OpenSymbol" w:cs="OpenSymbol" w:hint="default"/>
+      </w:rPr>
+    </w:lvl>
+    <w:lvl w:ilvl="3">
+      <w:start w:val="1"/>
+      <w:numFmt w:val="bullet"/>
+      <w:lvlText w:val=""/>
+      <w:lvlJc w:val="left"/>
+      <w:pPr>
+        <w:tabs>
+          <w:tab w:val="num" w:pos="1800"/>
+        </w:tabs>
+        <w:ind w:left="1800" w:hanging="360"/>
+      </w:pPr>
+      <w:rPr>
+        <w:rFonts w:ascii="Symbol" w:hAnsi="Symbol" w:cs="Symbol" w:hint="default"/>
+      </w:rPr>
+    </w:lvl>
+    <w:lvl w:ilvl="4">
+      <w:start w:val="1"/>
+      <w:numFmt w:val="bullet"/>
+      <w:lvlText w:val="◦"/>
+      <w:lvlJc w:val="left"/>
+      <w:pPr>
+        <w:tabs>
+          <w:tab w:val="num" w:pos="2160"/>
+        </w:tabs>
+        <w:ind w:left="2160" w:hanging="360"/>
+      </w:pPr>
+      <w:rPr>
+        <w:rFonts w:ascii="OpenSymbol" w:hAnsi="OpenSymbol" w:cs="OpenSymbol" w:hint="default"/>
+      </w:rPr>
+    </w:lvl>
+    <w:lvl w:ilvl="5">
+      <w:start w:val="1"/>
+      <w:numFmt w:val="bullet"/>
+      <w:lvlText w:val="▪"/>
+      <w:lvlJc w:val="left"/>
+      <w:pPr>
+        <w:tabs>
+          <w:tab w:val="num" w:pos="2520"/>
+        </w:tabs>
+        <w:ind w:left="2520" w:hanging="360"/>
+      </w:pPr>
+      <w:rPr>
+        <w:rFonts w:ascii="OpenSymbol" w:hAnsi="OpenSymbol" w:cs="OpenSymbol" w:hint="default"/>
+      </w:rPr>
+    </w:lvl>
+    <w:lvl w:ilvl="6">
+      <w:start w:val="1"/>
+      <w:numFmt w:val="bullet"/>
+      <w:lvlText w:val=""/>
+      <w:lvlJc w:val="left"/>
+      <w:pPr>
+        <w:tabs>
+          <w:tab w:val="num" w:pos="2880"/>
+        </w:tabs>
+        <w:ind w:left="2880" w:hanging="360"/>
+      </w:pPr>
+      <w:rPr>
+        <w:rFonts w:ascii="Symbol" w:hAnsi="Symbol" w:cs="Symbol" w:hint="default"/>
+      </w:rPr>
+    </w:lvl>
+    <w:lvl w:ilvl="7">
+      <w:start w:val="1"/>
+      <w:numFmt w:val="bullet"/>
+      <w:lvlText w:val="◦"/>
+      <w:lvlJc w:val="left"/>
+      <w:pPr>
+        <w:tabs>
+          <w:tab w:val="num" w:pos="3240"/>
+        </w:tabs>
+        <w:ind w:left="3240" w:hanging="360"/>
+      </w:pPr>
+      <w:rPr>
+        <w:rFonts w:ascii="OpenSymbol" w:hAnsi="OpenSymbol" w:cs="OpenSymbol" w:hint="default"/>
+      </w:rPr>
+    </w:lvl>
+    <w:lvl w:ilvl="8">
+      <w:start w:val="1"/>
+      <w:numFmt w:val="bullet"/>
+      <w:lvlText w:val="▪"/>
+      <w:lvlJc w:val="left"/>
+      <w:pPr>
+        <w:tabs>
+          <w:tab w:val="num" w:pos="3600"/>
+        </w:tabs>
+        <w:ind w:left="3600" w:hanging="360"/>
+      </w:pPr>
+      <w:rPr>
+        <w:rFonts w:ascii="OpenSymbol" w:hAnsi="OpenSymbol" w:cs="OpenSymbol" w:hint="default"/>
+      </w:rPr>
+    </w:lvl>
+  </w:abstractNum>
+  <w:abstractNum w:abstractNumId="20">
+    <w:lvl w:ilvl="0">
+      <w:start w:val="1"/>
+      <w:numFmt w:val="bullet"/>
+      <w:lvlText w:val=""/>
+      <w:lvlJc w:val="left"/>
+      <w:pPr>
+        <w:tabs>
+          <w:tab w:val="num" w:pos="720"/>
+        </w:tabs>
+        <w:ind w:left="720" w:hanging="360"/>
+      </w:pPr>
+      <w:rPr>
+        <w:rFonts w:ascii="Symbol" w:hAnsi="Symbol" w:cs="Symbol" w:hint="default"/>
+      </w:rPr>
+    </w:lvl>
+    <w:lvl w:ilvl="1">
+      <w:start w:val="1"/>
+      <w:numFmt w:val="bullet"/>
+      <w:lvlText w:val="◦"/>
+      <w:lvlJc w:val="left"/>
+      <w:pPr>
+        <w:tabs>
+          <w:tab w:val="num" w:pos="1080"/>
+        </w:tabs>
+        <w:ind w:left="1080" w:hanging="360"/>
+      </w:pPr>
+      <w:rPr>
+        <w:rFonts w:ascii="OpenSymbol" w:hAnsi="OpenSymbol" w:cs="OpenSymbol" w:hint="default"/>
+      </w:rPr>
+    </w:lvl>
+    <w:lvl w:ilvl="2">
+      <w:start w:val="1"/>
+      <w:numFmt w:val="bullet"/>
+      <w:lvlText w:val="▪"/>
+      <w:lvlJc w:val="left"/>
+      <w:pPr>
+        <w:tabs>
+          <w:tab w:val="num" w:pos="1440"/>
+        </w:tabs>
+        <w:ind w:left="1440" w:hanging="360"/>
+      </w:pPr>
+      <w:rPr>
+        <w:rFonts w:ascii="OpenSymbol" w:hAnsi="OpenSymbol" w:cs="OpenSymbol" w:hint="default"/>
+      </w:rPr>
+    </w:lvl>
+    <w:lvl w:ilvl="3">
+      <w:start w:val="1"/>
+      <w:numFmt w:val="bullet"/>
+      <w:lvlText w:val=""/>
+      <w:lvlJc w:val="left"/>
+      <w:pPr>
+        <w:tabs>
+          <w:tab w:val="num" w:pos="1800"/>
+        </w:tabs>
+        <w:ind w:left="1800" w:hanging="360"/>
+      </w:pPr>
+      <w:rPr>
+        <w:rFonts w:ascii="Symbol" w:hAnsi="Symbol" w:cs="Symbol" w:hint="default"/>
+      </w:rPr>
+    </w:lvl>
+    <w:lvl w:ilvl="4">
+      <w:start w:val="1"/>
+      <w:numFmt w:val="bullet"/>
+      <w:lvlText w:val="◦"/>
+      <w:lvlJc w:val="left"/>
+      <w:pPr>
+        <w:tabs>
+          <w:tab w:val="num" w:pos="2160"/>
+        </w:tabs>
+        <w:ind w:left="2160" w:hanging="360"/>
+      </w:pPr>
+      <w:rPr>
+        <w:rFonts w:ascii="OpenSymbol" w:hAnsi="OpenSymbol" w:cs="OpenSymbol" w:hint="default"/>
+      </w:rPr>
+    </w:lvl>
+    <w:lvl w:ilvl="5">
+      <w:start w:val="1"/>
+      <w:numFmt w:val="bullet"/>
+      <w:lvlText w:val="▪"/>
+      <w:lvlJc w:val="left"/>
+      <w:pPr>
+        <w:tabs>
+          <w:tab w:val="num" w:pos="2520"/>
+        </w:tabs>
+        <w:ind w:left="2520" w:hanging="360"/>
+      </w:pPr>
+      <w:rPr>
+        <w:rFonts w:ascii="OpenSymbol" w:hAnsi="OpenSymbol" w:cs="OpenSymbol" w:hint="default"/>
+      </w:rPr>
+    </w:lvl>
+    <w:lvl w:ilvl="6">
+      <w:start w:val="1"/>
+      <w:numFmt w:val="bullet"/>
+      <w:lvlText w:val=""/>
+      <w:lvlJc w:val="left"/>
+      <w:pPr>
+        <w:tabs>
+          <w:tab w:val="num" w:pos="2880"/>
+        </w:tabs>
+        <w:ind w:left="2880" w:hanging="360"/>
+      </w:pPr>
+      <w:rPr>
+        <w:rFonts w:ascii="Symbol" w:hAnsi="Symbol" w:cs="Symbol" w:hint="default"/>
+      </w:rPr>
+    </w:lvl>
+    <w:lvl w:ilvl="7">
+      <w:start w:val="1"/>
+      <w:numFmt w:val="bullet"/>
+      <w:lvlText w:val="◦"/>
+      <w:lvlJc w:val="left"/>
+      <w:pPr>
+        <w:tabs>
+          <w:tab w:val="num" w:pos="3240"/>
+        </w:tabs>
+        <w:ind w:left="3240" w:hanging="360"/>
+      </w:pPr>
+      <w:rPr>
+        <w:rFonts w:ascii="OpenSymbol" w:hAnsi="OpenSymbol" w:cs="OpenSymbol" w:hint="default"/>
+      </w:rPr>
+    </w:lvl>
+    <w:lvl w:ilvl="8">
+      <w:start w:val="1"/>
+      <w:numFmt w:val="bullet"/>
+      <w:lvlText w:val="▪"/>
+      <w:lvlJc w:val="left"/>
+      <w:pPr>
+        <w:tabs>
+          <w:tab w:val="num" w:pos="3600"/>
+        </w:tabs>
+        <w:ind w:left="3600" w:hanging="360"/>
+      </w:pPr>
+      <w:rPr>
+        <w:rFonts w:ascii="OpenSymbol" w:hAnsi="OpenSymbol" w:cs="OpenSymbol" w:hint="default"/>
+      </w:rPr>
+    </w:lvl>
+  </w:abstractNum>
+  <w:abstractNum w:abstractNumId="21">
+    <w:lvl w:ilvl="0">
+      <w:start w:val="1"/>
+      <w:numFmt w:val="bullet"/>
+      <w:lvlText w:val=""/>
+      <w:lvlJc w:val="left"/>
+      <w:pPr>
+        <w:tabs>
+          <w:tab w:val="num" w:pos="720"/>
+        </w:tabs>
+        <w:ind w:left="720" w:hanging="360"/>
+      </w:pPr>
+      <w:rPr>
+        <w:rFonts w:ascii="Symbol" w:hAnsi="Symbol" w:cs="Symbol" w:hint="default"/>
+      </w:rPr>
+    </w:lvl>
+    <w:lvl w:ilvl="1">
+      <w:start w:val="1"/>
+      <w:numFmt w:val="bullet"/>
+      <w:lvlText w:val="◦"/>
+      <w:lvlJc w:val="left"/>
+      <w:pPr>
+        <w:tabs>
+          <w:tab w:val="num" w:pos="1080"/>
+        </w:tabs>
+        <w:ind w:left="1080" w:hanging="360"/>
+      </w:pPr>
+      <w:rPr>
+        <w:rFonts w:ascii="OpenSymbol" w:hAnsi="OpenSymbol" w:cs="OpenSymbol" w:hint="default"/>
+      </w:rPr>
+    </w:lvl>
+    <w:lvl w:ilvl="2">
+      <w:start w:val="1"/>
+      <w:numFmt w:val="bullet"/>
+      <w:lvlText w:val="▪"/>
+      <w:lvlJc w:val="left"/>
+      <w:pPr>
+        <w:tabs>
+          <w:tab w:val="num" w:pos="1440"/>
+        </w:tabs>
+        <w:ind w:left="1440" w:hanging="360"/>
+      </w:pPr>
+      <w:rPr>
+        <w:rFonts w:ascii="OpenSymbol" w:hAnsi="OpenSymbol" w:cs="OpenSymbol" w:hint="default"/>
+      </w:rPr>
+    </w:lvl>
+    <w:lvl w:ilvl="3">
+      <w:start w:val="1"/>
+      <w:numFmt w:val="bullet"/>
+      <w:lvlText w:val=""/>
+      <w:lvlJc w:val="left"/>
+      <w:pPr>
+        <w:tabs>
+          <w:tab w:val="num" w:pos="1800"/>
+        </w:tabs>
+        <w:ind w:left="1800" w:hanging="360"/>
+      </w:pPr>
+      <w:rPr>
+        <w:rFonts w:ascii="Symbol" w:hAnsi="Symbol" w:cs="Symbol" w:hint="default"/>
+      </w:rPr>
+    </w:lvl>
+    <w:lvl w:ilvl="4">
+      <w:start w:val="1"/>
+      <w:numFmt w:val="bullet"/>
+      <w:lvlText w:val="◦"/>
+      <w:lvlJc w:val="left"/>
+      <w:pPr>
+        <w:tabs>
+          <w:tab w:val="num" w:pos="2160"/>
+        </w:tabs>
+        <w:ind w:left="2160" w:hanging="360"/>
+      </w:pPr>
+      <w:rPr>
+        <w:rFonts w:ascii="OpenSymbol" w:hAnsi="OpenSymbol" w:cs="OpenSymbol" w:hint="default"/>
+      </w:rPr>
+    </w:lvl>
+    <w:lvl w:ilvl="5">
+      <w:start w:val="1"/>
+      <w:numFmt w:val="bullet"/>
+      <w:lvlText w:val="▪"/>
+      <w:lvlJc w:val="left"/>
+      <w:pPr>
+        <w:tabs>
+          <w:tab w:val="num" w:pos="2520"/>
+        </w:tabs>
+        <w:ind w:left="2520" w:hanging="360"/>
+      </w:pPr>
+      <w:rPr>
+        <w:rFonts w:ascii="OpenSymbol" w:hAnsi="OpenSymbol" w:cs="OpenSymbol" w:hint="default"/>
+      </w:rPr>
+    </w:lvl>
+    <w:lvl w:ilvl="6">
+      <w:start w:val="1"/>
+      <w:numFmt w:val="bullet"/>
+      <w:lvlText w:val=""/>
+      <w:lvlJc w:val="left"/>
+      <w:pPr>
+        <w:tabs>
+          <w:tab w:val="num" w:pos="2880"/>
+        </w:tabs>
+        <w:ind w:left="2880" w:hanging="360"/>
+      </w:pPr>
+      <w:rPr>
+        <w:rFonts w:ascii="Symbol" w:hAnsi="Symbol" w:cs="Symbol" w:hint="default"/>
+      </w:rPr>
+    </w:lvl>
+    <w:lvl w:ilvl="7">
+      <w:start w:val="1"/>
+      <w:numFmt w:val="bullet"/>
+      <w:lvlText w:val="◦"/>
+      <w:lvlJc w:val="left"/>
+      <w:pPr>
+        <w:tabs>
+          <w:tab w:val="num" w:pos="3240"/>
+        </w:tabs>
+        <w:ind w:left="3240" w:hanging="360"/>
+      </w:pPr>
+      <w:rPr>
+        <w:rFonts w:ascii="OpenSymbol" w:hAnsi="OpenSymbol" w:cs="OpenSymbol" w:hint="default"/>
+      </w:rPr>
+    </w:lvl>
+    <w:lvl w:ilvl="8">
+      <w:start w:val="1"/>
+      <w:numFmt w:val="bullet"/>
+      <w:lvlText w:val="▪"/>
+      <w:lvlJc w:val="left"/>
+      <w:pPr>
+        <w:tabs>
+          <w:tab w:val="num" w:pos="3600"/>
+        </w:tabs>
+        <w:ind w:left="3600" w:hanging="360"/>
+      </w:pPr>
+      <w:rPr>
+        <w:rFonts w:ascii="OpenSymbol" w:hAnsi="OpenSymbol" w:cs="OpenSymbol" w:hint="default"/>
+      </w:rPr>
+    </w:lvl>
+  </w:abstractNum>
+  <w:abstractNum w:abstractNumId="22">
     <w:lvl w:ilvl="0">
       <w:start w:val="1"/>
       <w:numFmt w:val="none"/>
@@ -7149,6 +7946,18 @@
   </w:num>
   <w:num w:numId="18">
     <w:abstractNumId w:val="18"/>
+  </w:num>
+  <w:num w:numId="19">
+    <w:abstractNumId w:val="19"/>
+  </w:num>
+  <w:num w:numId="20">
+    <w:abstractNumId w:val="20"/>
+  </w:num>
+  <w:num w:numId="21">
+    <w:abstractNumId w:val="21"/>
+  </w:num>
+  <w:num w:numId="22">
+    <w:abstractNumId w:val="22"/>
   </w:num>
 </w:numbering>
 </file>

</xml_diff>

<commit_message>
feat: IM class done
</commit_message>
<xml_diff>
--- a/51PK Psyhologija karjery/1/PK1_KNT-116m_Onyshchenko_15.docx
+++ b/51PK Psyhologija karjery/1/PK1_KNT-116m_Onyshchenko_15.docx
@@ -149,15 +149,7 @@
       </w:pPr>
       <w:r>
         <w:rPr/>
-        <w:t>Тема «</w:t>
-      </w:r>
-      <w:r>
-        <w:rPr/>
-        <w:t>П</w:t>
-      </w:r>
-      <w:r>
-        <w:rPr/>
-        <w:t>сихологія кар'єри як наука та сучасні тенденції професійного розвитку»</w:t>
+        <w:t>Тема «Психологія кар'єри як наука та сучасні тенденції професійного розвитку»</w:t>
       </w:r>
     </w:p>
     <w:p>
@@ -385,11 +377,7 @@
       </w:pPr>
       <w:r>
         <w:rPr/>
-        <w:t>202</w:t>
-      </w:r>
-      <w:r>
-        <w:rPr/>
-        <w:t>6</w:t>
+        <w:t>2026</w:t>
       </w:r>
     </w:p>
     <w:p>
@@ -436,15 +424,7 @@
       </w:pPr>
       <w:r>
         <w:rPr/>
-        <w:t xml:space="preserve">Метою роботи є </w:t>
-      </w:r>
-      <w:r>
-        <w:rPr/>
-        <w:t>с</w:t>
-      </w:r>
-      <w:r>
-        <w:rPr/>
-        <w:t>формувати у здобувачів вищої освіти цілісне уявлення про психологію кар'єри як сучасний міждисциплінарний науковий напрям, розкрити психологічні закономірності професійного розвитку особистості, ознайомити із сучасними моделями кар'єри, тенденціями трансформації ринку праці та специфікою професійного розвитку випускників різних галузей знань.</w:t>
+        <w:t>Метою роботи є сформувати у здобувачів вищої освіти цілісне уявлення про психологію кар'єри як сучасний міждисциплінарний науковий напрям, розкрити психологічні закономірності професійного розвитку особистості, ознайомити із сучасними моделями кар'єри, тенденціями трансформації ринку праці та специфікою професійного розвитку випускників різних галузей знань.</w:t>
       </w:r>
     </w:p>
     <w:p>
@@ -911,14 +891,14 @@
         </w:tblCellMar>
       </w:tblPr>
       <w:tblGrid>
-        <w:gridCol w:w="5543"/>
-        <w:gridCol w:w="1357"/>
+        <w:gridCol w:w="5542"/>
+        <w:gridCol w:w="1358"/>
       </w:tblGrid>
       <w:tr>
         <w:trPr/>
         <w:tc>
           <w:tcPr>
-            <w:tcW w:w="5543" w:type="dxa"/>
+            <w:tcW w:w="5542" w:type="dxa"/>
             <w:tcBorders>
               <w:top w:val="single" w:sz="4" w:space="0" w:color="000000"/>
               <w:left w:val="single" w:sz="4" w:space="0" w:color="000000"/>
@@ -927,7 +907,7 @@
           </w:tcPr>
           <w:p>
             <w:pPr>
-              <w:pStyle w:val="Style16"/>
+              <w:pStyle w:val="user4"/>
               <w:spacing w:lineRule="auto" w:line="240"/>
               <w:ind w:hanging="0" w:left="0"/>
               <w:rPr>
@@ -946,7 +926,7 @@
         </w:tc>
         <w:tc>
           <w:tcPr>
-            <w:tcW w:w="1357" w:type="dxa"/>
+            <w:tcW w:w="1358" w:type="dxa"/>
             <w:tcBorders>
               <w:top w:val="single" w:sz="4" w:space="0" w:color="000000"/>
               <w:left w:val="single" w:sz="4" w:space="0" w:color="000000"/>
@@ -956,7 +936,7 @@
           </w:tcPr>
           <w:p>
             <w:pPr>
-              <w:pStyle w:val="Style16"/>
+              <w:pStyle w:val="user4"/>
               <w:spacing w:lineRule="auto" w:line="240"/>
               <w:ind w:hanging="0" w:left="0"/>
               <w:rPr>
@@ -978,7 +958,7 @@
         <w:trPr/>
         <w:tc>
           <w:tcPr>
-            <w:tcW w:w="5543" w:type="dxa"/>
+            <w:tcW w:w="5542" w:type="dxa"/>
             <w:tcBorders>
               <w:left w:val="single" w:sz="4" w:space="0" w:color="000000"/>
               <w:bottom w:val="single" w:sz="4" w:space="0" w:color="000000"/>
@@ -986,7 +966,7 @@
           </w:tcPr>
           <w:p>
             <w:pPr>
-              <w:pStyle w:val="Style16"/>
+              <w:pStyle w:val="user4"/>
               <w:spacing w:lineRule="auto" w:line="240"/>
               <w:ind w:hanging="0" w:left="0"/>
               <w:rPr/>
@@ -999,7 +979,7 @@
         </w:tc>
         <w:tc>
           <w:tcPr>
-            <w:tcW w:w="1357" w:type="dxa"/>
+            <w:tcW w:w="1358" w:type="dxa"/>
             <w:tcBorders>
               <w:left w:val="single" w:sz="4" w:space="0" w:color="000000"/>
               <w:bottom w:val="single" w:sz="4" w:space="0" w:color="000000"/>
@@ -1008,7 +988,7 @@
           </w:tcPr>
           <w:p>
             <w:pPr>
-              <w:pStyle w:val="Style16"/>
+              <w:pStyle w:val="user4"/>
               <w:spacing w:lineRule="auto" w:line="240"/>
               <w:ind w:hanging="0" w:left="0"/>
               <w:rPr/>
@@ -1023,7 +1003,7 @@
         <w:trPr/>
         <w:tc>
           <w:tcPr>
-            <w:tcW w:w="5543" w:type="dxa"/>
+            <w:tcW w:w="5542" w:type="dxa"/>
             <w:tcBorders>
               <w:left w:val="single" w:sz="4" w:space="0" w:color="000000"/>
               <w:bottom w:val="single" w:sz="4" w:space="0" w:color="000000"/>
@@ -1031,7 +1011,7 @@
           </w:tcPr>
           <w:p>
             <w:pPr>
-              <w:pStyle w:val="Style16"/>
+              <w:pStyle w:val="user4"/>
               <w:spacing w:lineRule="auto" w:line="240"/>
               <w:ind w:hanging="0" w:left="0"/>
               <w:rPr/>
@@ -1044,7 +1024,7 @@
         </w:tc>
         <w:tc>
           <w:tcPr>
-            <w:tcW w:w="1357" w:type="dxa"/>
+            <w:tcW w:w="1358" w:type="dxa"/>
             <w:tcBorders>
               <w:left w:val="single" w:sz="4" w:space="0" w:color="000000"/>
               <w:bottom w:val="single" w:sz="4" w:space="0" w:color="000000"/>
@@ -1053,7 +1033,7 @@
           </w:tcPr>
           <w:p>
             <w:pPr>
-              <w:pStyle w:val="Style16"/>
+              <w:pStyle w:val="user4"/>
               <w:spacing w:lineRule="auto" w:line="240"/>
               <w:ind w:hanging="0" w:left="0"/>
               <w:rPr/>
@@ -1068,7 +1048,7 @@
         <w:trPr/>
         <w:tc>
           <w:tcPr>
-            <w:tcW w:w="5543" w:type="dxa"/>
+            <w:tcW w:w="5542" w:type="dxa"/>
             <w:tcBorders>
               <w:left w:val="single" w:sz="4" w:space="0" w:color="000000"/>
               <w:bottom w:val="single" w:sz="4" w:space="0" w:color="000000"/>
@@ -1076,7 +1056,7 @@
           </w:tcPr>
           <w:p>
             <w:pPr>
-              <w:pStyle w:val="Style16"/>
+              <w:pStyle w:val="user4"/>
               <w:spacing w:lineRule="auto" w:line="240"/>
               <w:ind w:hanging="0" w:left="0"/>
               <w:rPr/>
@@ -1089,7 +1069,7 @@
         </w:tc>
         <w:tc>
           <w:tcPr>
-            <w:tcW w:w="1357" w:type="dxa"/>
+            <w:tcW w:w="1358" w:type="dxa"/>
             <w:tcBorders>
               <w:left w:val="single" w:sz="4" w:space="0" w:color="000000"/>
               <w:bottom w:val="single" w:sz="4" w:space="0" w:color="000000"/>
@@ -1098,7 +1078,7 @@
           </w:tcPr>
           <w:p>
             <w:pPr>
-              <w:pStyle w:val="Style16"/>
+              <w:pStyle w:val="user4"/>
               <w:spacing w:lineRule="auto" w:line="240"/>
               <w:ind w:hanging="0" w:left="0"/>
               <w:rPr/>
@@ -1113,7 +1093,7 @@
         <w:trPr/>
         <w:tc>
           <w:tcPr>
-            <w:tcW w:w="5543" w:type="dxa"/>
+            <w:tcW w:w="5542" w:type="dxa"/>
             <w:tcBorders>
               <w:left w:val="single" w:sz="4" w:space="0" w:color="000000"/>
               <w:bottom w:val="single" w:sz="4" w:space="0" w:color="000000"/>
@@ -1121,7 +1101,7 @@
           </w:tcPr>
           <w:p>
             <w:pPr>
-              <w:pStyle w:val="Style16"/>
+              <w:pStyle w:val="user4"/>
               <w:spacing w:lineRule="auto" w:line="240"/>
               <w:ind w:hanging="0" w:left="0"/>
               <w:rPr/>
@@ -1134,7 +1114,7 @@
         </w:tc>
         <w:tc>
           <w:tcPr>
-            <w:tcW w:w="1357" w:type="dxa"/>
+            <w:tcW w:w="1358" w:type="dxa"/>
             <w:tcBorders>
               <w:left w:val="single" w:sz="4" w:space="0" w:color="000000"/>
               <w:bottom w:val="single" w:sz="4" w:space="0" w:color="000000"/>
@@ -1143,7 +1123,7 @@
           </w:tcPr>
           <w:p>
             <w:pPr>
-              <w:pStyle w:val="Style16"/>
+              <w:pStyle w:val="user4"/>
               <w:spacing w:lineRule="auto" w:line="240"/>
               <w:ind w:hanging="0" w:left="0"/>
               <w:rPr/>
@@ -1158,7 +1138,7 @@
         <w:trPr/>
         <w:tc>
           <w:tcPr>
-            <w:tcW w:w="5543" w:type="dxa"/>
+            <w:tcW w:w="5542" w:type="dxa"/>
             <w:tcBorders>
               <w:left w:val="single" w:sz="4" w:space="0" w:color="000000"/>
               <w:bottom w:val="single" w:sz="4" w:space="0" w:color="000000"/>
@@ -1166,7 +1146,7 @@
           </w:tcPr>
           <w:p>
             <w:pPr>
-              <w:pStyle w:val="Style16"/>
+              <w:pStyle w:val="user4"/>
               <w:spacing w:lineRule="auto" w:line="240"/>
               <w:ind w:hanging="0" w:left="0"/>
               <w:rPr/>
@@ -1179,7 +1159,7 @@
         </w:tc>
         <w:tc>
           <w:tcPr>
-            <w:tcW w:w="1357" w:type="dxa"/>
+            <w:tcW w:w="1358" w:type="dxa"/>
             <w:tcBorders>
               <w:left w:val="single" w:sz="4" w:space="0" w:color="000000"/>
               <w:bottom w:val="single" w:sz="4" w:space="0" w:color="000000"/>
@@ -1188,7 +1168,7 @@
           </w:tcPr>
           <w:p>
             <w:pPr>
-              <w:pStyle w:val="Style16"/>
+              <w:pStyle w:val="user4"/>
               <w:spacing w:lineRule="auto" w:line="240"/>
               <w:ind w:hanging="0" w:left="0"/>
               <w:rPr/>
@@ -1719,14 +1699,14 @@
         </w:tblCellMar>
       </w:tblPr>
       <w:tblGrid>
-        <w:gridCol w:w="4513"/>
-        <w:gridCol w:w="4513"/>
+        <w:gridCol w:w="4512"/>
+        <w:gridCol w:w="4514"/>
       </w:tblGrid>
       <w:tr>
         <w:trPr/>
         <w:tc>
           <w:tcPr>
-            <w:tcW w:w="4513" w:type="dxa"/>
+            <w:tcW w:w="4512" w:type="dxa"/>
             <w:tcBorders>
               <w:top w:val="single" w:sz="4" w:space="0" w:color="000000"/>
               <w:left w:val="single" w:sz="4" w:space="0" w:color="000000"/>
@@ -1735,7 +1715,7 @@
           </w:tcPr>
           <w:p>
             <w:pPr>
-              <w:pStyle w:val="Style16"/>
+              <w:pStyle w:val="user4"/>
               <w:ind w:hanging="0" w:left="0"/>
               <w:rPr/>
             </w:pPr>
@@ -1747,7 +1727,7 @@
         </w:tc>
         <w:tc>
           <w:tcPr>
-            <w:tcW w:w="4513" w:type="dxa"/>
+            <w:tcW w:w="4514" w:type="dxa"/>
             <w:tcBorders>
               <w:top w:val="single" w:sz="4" w:space="0" w:color="000000"/>
               <w:left w:val="single" w:sz="4" w:space="0" w:color="000000"/>
@@ -1757,7 +1737,7 @@
           </w:tcPr>
           <w:p>
             <w:pPr>
-              <w:pStyle w:val="Style16"/>
+              <w:pStyle w:val="user4"/>
               <w:ind w:hanging="0" w:left="0"/>
               <w:rPr/>
             </w:pPr>
@@ -1792,14 +1772,14 @@
         </w:tblCellMar>
       </w:tblPr>
       <w:tblGrid>
-        <w:gridCol w:w="4513"/>
-        <w:gridCol w:w="4513"/>
+        <w:gridCol w:w="4512"/>
+        <w:gridCol w:w="4514"/>
       </w:tblGrid>
       <w:tr>
         <w:trPr/>
         <w:tc>
           <w:tcPr>
-            <w:tcW w:w="4513" w:type="dxa"/>
+            <w:tcW w:w="4512" w:type="dxa"/>
             <w:tcBorders>
               <w:top w:val="single" w:sz="4" w:space="0" w:color="000000"/>
               <w:left w:val="single" w:sz="4" w:space="0" w:color="000000"/>
@@ -1808,7 +1788,7 @@
           </w:tcPr>
           <w:p>
             <w:pPr>
-              <w:pStyle w:val="Style16"/>
+              <w:pStyle w:val="user4"/>
               <w:ind w:hanging="0" w:left="0"/>
               <w:rPr/>
             </w:pPr>
@@ -1820,7 +1800,7 @@
         </w:tc>
         <w:tc>
           <w:tcPr>
-            <w:tcW w:w="4513" w:type="dxa"/>
+            <w:tcW w:w="4514" w:type="dxa"/>
             <w:tcBorders>
               <w:top w:val="single" w:sz="4" w:space="0" w:color="000000"/>
               <w:left w:val="single" w:sz="4" w:space="0" w:color="000000"/>
@@ -1830,7 +1810,7 @@
           </w:tcPr>
           <w:p>
             <w:pPr>
-              <w:pStyle w:val="Style16"/>
+              <w:pStyle w:val="user4"/>
               <w:ind w:hanging="0" w:left="0"/>
               <w:rPr/>
             </w:pPr>
@@ -3034,11 +3014,7 @@
       </w:pPr>
       <w:r>
         <w:rPr/>
-        <w:t xml:space="preserve">3 </w:t>
-      </w:r>
-      <w:r>
-        <w:rPr/>
-        <w:t>Практична вправа 1</w:t>
+        <w:t>3 Практична вправа 1</w:t>
       </w:r>
     </w:p>
     <w:p>
@@ -3086,7 +3062,7 @@
           </w:tcPr>
           <w:p>
             <w:pPr>
-              <w:pStyle w:val="Style16"/>
+              <w:pStyle w:val="user4"/>
               <w:spacing w:lineRule="auto" w:line="240"/>
               <w:ind w:hanging="0" w:left="0"/>
               <w:rPr>
@@ -3115,7 +3091,7 @@
           </w:tcPr>
           <w:p>
             <w:pPr>
-              <w:pStyle w:val="Style16"/>
+              <w:pStyle w:val="user4"/>
               <w:spacing w:lineRule="auto" w:line="240"/>
               <w:ind w:hanging="0" w:left="0"/>
               <w:rPr>
@@ -3145,7 +3121,7 @@
           </w:tcPr>
           <w:p>
             <w:pPr>
-              <w:pStyle w:val="Style16"/>
+              <w:pStyle w:val="user4"/>
               <w:spacing w:lineRule="auto" w:line="240"/>
               <w:ind w:hanging="0" w:left="0"/>
               <w:rPr/>
@@ -3167,7 +3143,7 @@
           </w:tcPr>
           <w:p>
             <w:pPr>
-              <w:pStyle w:val="Style16"/>
+              <w:pStyle w:val="user4"/>
               <w:spacing w:lineRule="auto" w:line="240"/>
               <w:ind w:hanging="0" w:left="0"/>
               <w:rPr/>
@@ -3191,7 +3167,7 @@
           </w:tcPr>
           <w:p>
             <w:pPr>
-              <w:pStyle w:val="Style16"/>
+              <w:pStyle w:val="user4"/>
               <w:spacing w:lineRule="auto" w:line="240"/>
               <w:ind w:hanging="0" w:left="0"/>
               <w:rPr/>
@@ -3213,7 +3189,7 @@
           </w:tcPr>
           <w:p>
             <w:pPr>
-              <w:pStyle w:val="Style16"/>
+              <w:pStyle w:val="user4"/>
               <w:spacing w:lineRule="auto" w:line="240"/>
               <w:ind w:hanging="0" w:left="0"/>
               <w:rPr/>
@@ -3237,7 +3213,7 @@
           </w:tcPr>
           <w:p>
             <w:pPr>
-              <w:pStyle w:val="Style16"/>
+              <w:pStyle w:val="user4"/>
               <w:spacing w:lineRule="auto" w:line="240"/>
               <w:ind w:hanging="0" w:left="0"/>
               <w:rPr/>
@@ -3259,7 +3235,7 @@
           </w:tcPr>
           <w:p>
             <w:pPr>
-              <w:pStyle w:val="Style16"/>
+              <w:pStyle w:val="user4"/>
               <w:spacing w:lineRule="auto" w:line="240"/>
               <w:ind w:hanging="0" w:left="0"/>
               <w:rPr/>
@@ -3283,7 +3259,7 @@
           </w:tcPr>
           <w:p>
             <w:pPr>
-              <w:pStyle w:val="Style16"/>
+              <w:pStyle w:val="user4"/>
               <w:spacing w:lineRule="auto" w:line="240"/>
               <w:ind w:hanging="0" w:left="0"/>
               <w:rPr/>
@@ -3305,7 +3281,7 @@
           </w:tcPr>
           <w:p>
             <w:pPr>
-              <w:pStyle w:val="Style16"/>
+              <w:pStyle w:val="user4"/>
               <w:spacing w:lineRule="auto" w:line="240"/>
               <w:ind w:hanging="0" w:left="0"/>
               <w:rPr/>
@@ -3329,7 +3305,7 @@
           </w:tcPr>
           <w:p>
             <w:pPr>
-              <w:pStyle w:val="Style16"/>
+              <w:pStyle w:val="user4"/>
               <w:spacing w:lineRule="auto" w:line="240"/>
               <w:ind w:hanging="0" w:left="0"/>
               <w:rPr/>
@@ -3351,7 +3327,7 @@
           </w:tcPr>
           <w:p>
             <w:pPr>
-              <w:pStyle w:val="Style16"/>
+              <w:pStyle w:val="user4"/>
               <w:spacing w:lineRule="auto" w:line="240"/>
               <w:ind w:hanging="0" w:left="0"/>
               <w:rPr/>
@@ -3749,14 +3725,14 @@
         </w:tblCellMar>
       </w:tblPr>
       <w:tblGrid>
-        <w:gridCol w:w="3460"/>
-        <w:gridCol w:w="4650"/>
+        <w:gridCol w:w="3459"/>
+        <w:gridCol w:w="4651"/>
       </w:tblGrid>
       <w:tr>
         <w:trPr/>
         <w:tc>
           <w:tcPr>
-            <w:tcW w:w="3460" w:type="dxa"/>
+            <w:tcW w:w="3459" w:type="dxa"/>
             <w:tcBorders>
               <w:top w:val="single" w:sz="4" w:space="0" w:color="000000"/>
               <w:left w:val="single" w:sz="4" w:space="0" w:color="000000"/>
@@ -3765,7 +3741,7 @@
           </w:tcPr>
           <w:p>
             <w:pPr>
-              <w:pStyle w:val="Style16"/>
+              <w:pStyle w:val="user4"/>
               <w:spacing w:lineRule="auto" w:line="240"/>
               <w:ind w:hanging="0" w:left="0"/>
               <w:rPr>
@@ -3784,7 +3760,7 @@
         </w:tc>
         <w:tc>
           <w:tcPr>
-            <w:tcW w:w="4650" w:type="dxa"/>
+            <w:tcW w:w="4651" w:type="dxa"/>
             <w:tcBorders>
               <w:top w:val="single" w:sz="4" w:space="0" w:color="000000"/>
               <w:left w:val="single" w:sz="4" w:space="0" w:color="000000"/>
@@ -3794,7 +3770,7 @@
           </w:tcPr>
           <w:p>
             <w:pPr>
-              <w:pStyle w:val="Style16"/>
+              <w:pStyle w:val="user4"/>
               <w:spacing w:lineRule="auto" w:line="240"/>
               <w:ind w:hanging="0" w:left="0"/>
               <w:rPr>
@@ -3816,7 +3792,7 @@
         <w:trPr/>
         <w:tc>
           <w:tcPr>
-            <w:tcW w:w="3460" w:type="dxa"/>
+            <w:tcW w:w="3459" w:type="dxa"/>
             <w:tcBorders>
               <w:left w:val="single" w:sz="4" w:space="0" w:color="000000"/>
               <w:bottom w:val="single" w:sz="4" w:space="0" w:color="000000"/>
@@ -3824,7 +3800,7 @@
           </w:tcPr>
           <w:p>
             <w:pPr>
-              <w:pStyle w:val="Style16"/>
+              <w:pStyle w:val="user4"/>
               <w:spacing w:lineRule="auto" w:line="240"/>
               <w:ind w:hanging="0" w:left="0"/>
               <w:rPr/>
@@ -3837,7 +3813,7 @@
         </w:tc>
         <w:tc>
           <w:tcPr>
-            <w:tcW w:w="4650" w:type="dxa"/>
+            <w:tcW w:w="4651" w:type="dxa"/>
             <w:tcBorders>
               <w:left w:val="single" w:sz="4" w:space="0" w:color="000000"/>
               <w:bottom w:val="single" w:sz="4" w:space="0" w:color="000000"/>
@@ -3846,7 +3822,7 @@
           </w:tcPr>
           <w:p>
             <w:pPr>
-              <w:pStyle w:val="Style16"/>
+              <w:pStyle w:val="user4"/>
               <w:spacing w:lineRule="auto" w:line="240"/>
               <w:ind w:hanging="0" w:left="0"/>
               <w:rPr/>
@@ -3862,7 +3838,7 @@
         <w:trPr/>
         <w:tc>
           <w:tcPr>
-            <w:tcW w:w="3460" w:type="dxa"/>
+            <w:tcW w:w="3459" w:type="dxa"/>
             <w:tcBorders>
               <w:left w:val="single" w:sz="4" w:space="0" w:color="000000"/>
               <w:bottom w:val="single" w:sz="4" w:space="0" w:color="000000"/>
@@ -3870,7 +3846,7 @@
           </w:tcPr>
           <w:p>
             <w:pPr>
-              <w:pStyle w:val="Style16"/>
+              <w:pStyle w:val="user4"/>
               <w:spacing w:lineRule="auto" w:line="240"/>
               <w:ind w:hanging="0" w:left="0"/>
               <w:rPr/>
@@ -3883,7 +3859,7 @@
         </w:tc>
         <w:tc>
           <w:tcPr>
-            <w:tcW w:w="4650" w:type="dxa"/>
+            <w:tcW w:w="4651" w:type="dxa"/>
             <w:tcBorders>
               <w:left w:val="single" w:sz="4" w:space="0" w:color="000000"/>
               <w:bottom w:val="single" w:sz="4" w:space="0" w:color="000000"/>
@@ -3892,7 +3868,7 @@
           </w:tcPr>
           <w:p>
             <w:pPr>
-              <w:pStyle w:val="Style16"/>
+              <w:pStyle w:val="user4"/>
               <w:spacing w:lineRule="auto" w:line="240"/>
               <w:ind w:hanging="0" w:left="0"/>
               <w:rPr/>
@@ -3908,7 +3884,7 @@
         <w:trPr/>
         <w:tc>
           <w:tcPr>
-            <w:tcW w:w="3460" w:type="dxa"/>
+            <w:tcW w:w="3459" w:type="dxa"/>
             <w:tcBorders>
               <w:left w:val="single" w:sz="4" w:space="0" w:color="000000"/>
               <w:bottom w:val="single" w:sz="4" w:space="0" w:color="000000"/>
@@ -3916,7 +3892,7 @@
           </w:tcPr>
           <w:p>
             <w:pPr>
-              <w:pStyle w:val="Style16"/>
+              <w:pStyle w:val="user4"/>
               <w:spacing w:lineRule="auto" w:line="240"/>
               <w:ind w:hanging="0" w:left="0"/>
               <w:rPr/>
@@ -3929,7 +3905,7 @@
         </w:tc>
         <w:tc>
           <w:tcPr>
-            <w:tcW w:w="4650" w:type="dxa"/>
+            <w:tcW w:w="4651" w:type="dxa"/>
             <w:tcBorders>
               <w:left w:val="single" w:sz="4" w:space="0" w:color="000000"/>
               <w:bottom w:val="single" w:sz="4" w:space="0" w:color="000000"/>
@@ -3938,7 +3914,7 @@
           </w:tcPr>
           <w:p>
             <w:pPr>
-              <w:pStyle w:val="Style16"/>
+              <w:pStyle w:val="user4"/>
               <w:spacing w:lineRule="auto" w:line="240"/>
               <w:ind w:hanging="0" w:left="0"/>
               <w:rPr/>
@@ -3990,7 +3966,7 @@
           </w:tcPr>
           <w:p>
             <w:pPr>
-              <w:pStyle w:val="Style16"/>
+              <w:pStyle w:val="user4"/>
               <w:spacing w:lineRule="auto" w:line="240"/>
               <w:ind w:hanging="0" w:left="0"/>
               <w:rPr>
@@ -4019,7 +3995,7 @@
           </w:tcPr>
           <w:p>
             <w:pPr>
-              <w:pStyle w:val="Style16"/>
+              <w:pStyle w:val="user4"/>
               <w:spacing w:lineRule="auto" w:line="240"/>
               <w:ind w:hanging="0" w:left="0"/>
               <w:rPr>
@@ -4049,7 +4025,7 @@
           </w:tcPr>
           <w:p>
             <w:pPr>
-              <w:pStyle w:val="Style16"/>
+              <w:pStyle w:val="user4"/>
               <w:spacing w:lineRule="auto" w:line="240"/>
               <w:ind w:hanging="0" w:left="0"/>
               <w:rPr/>
@@ -4071,7 +4047,7 @@
           </w:tcPr>
           <w:p>
             <w:pPr>
-              <w:pStyle w:val="Style16"/>
+              <w:pStyle w:val="user4"/>
               <w:spacing w:lineRule="auto" w:line="240"/>
               <w:ind w:hanging="0" w:left="0"/>
               <w:rPr/>
@@ -4095,7 +4071,7 @@
           </w:tcPr>
           <w:p>
             <w:pPr>
-              <w:pStyle w:val="Style16"/>
+              <w:pStyle w:val="user4"/>
               <w:spacing w:lineRule="auto" w:line="240"/>
               <w:ind w:hanging="0" w:left="0"/>
               <w:rPr/>
@@ -4117,7 +4093,7 @@
           </w:tcPr>
           <w:p>
             <w:pPr>
-              <w:pStyle w:val="Style16"/>
+              <w:pStyle w:val="user4"/>
               <w:spacing w:lineRule="auto" w:line="240"/>
               <w:ind w:hanging="0" w:left="0"/>
               <w:rPr/>
@@ -4141,7 +4117,7 @@
           </w:tcPr>
           <w:p>
             <w:pPr>
-              <w:pStyle w:val="Style16"/>
+              <w:pStyle w:val="user4"/>
               <w:spacing w:lineRule="auto" w:line="240"/>
               <w:ind w:hanging="0" w:left="0"/>
               <w:rPr/>
@@ -4163,7 +4139,7 @@
           </w:tcPr>
           <w:p>
             <w:pPr>
-              <w:pStyle w:val="Style16"/>
+              <w:pStyle w:val="user4"/>
               <w:spacing w:lineRule="auto" w:line="240"/>
               <w:ind w:hanging="0" w:left="0"/>
               <w:rPr/>
@@ -4970,6 +4946,447 @@
       <w:r>
         <w:rPr/>
         <w:t>Твердження, що потребують перевірки це те, що штучний інтелект стане повноцінним помічником розробника. Хоч ця галузь і розвивається швидко останнім часом, однак якість відповідей від таких систем все ще залишається опосередкованою.</w:t>
+      </w:r>
+    </w:p>
+    <w:p>
+      <w:pPr>
+        <w:pStyle w:val="P1"/>
+        <w:rPr/>
+      </w:pPr>
+      <w:r>
+        <w:rPr/>
+      </w:r>
+    </w:p>
+    <w:p>
+      <w:pPr>
+        <w:pStyle w:val="H2"/>
+        <w:rPr/>
+      </w:pPr>
+      <w:r>
+        <w:rPr/>
+        <w:t>9 Кейс для аналізу</w:t>
+      </w:r>
+    </w:p>
+    <w:p>
+      <w:pPr>
+        <w:pStyle w:val="P1"/>
+        <w:rPr/>
+      </w:pPr>
+      <w:r>
+        <w:rPr/>
+      </w:r>
+    </w:p>
+    <w:p>
+      <w:pPr>
+        <w:pStyle w:val="P1"/>
+        <w:rPr>
+          <w:lang w:val="uk-UA"/>
+        </w:rPr>
+      </w:pPr>
+      <w:r>
+        <w:rPr>
+          <w:lang w:val="uk-UA"/>
+        </w:rPr>
+        <w:t>Ситуація полягає в тому, що студенту пропонують два варіанти: один зі стабільним кар’єрним зростанням та відповідною заробітною платою, й інший з нестабільним кар’єрним зростанням, але вищою заробітною платою.</w:t>
+      </w:r>
+    </w:p>
+    <w:p>
+      <w:pPr>
+        <w:pStyle w:val="P1"/>
+        <w:rPr>
+          <w:lang w:val="uk-UA"/>
+        </w:rPr>
+      </w:pPr>
+      <w:r>
+        <w:rPr>
+          <w:lang w:val="uk-UA"/>
+        </w:rPr>
+        <w:t>Психологічними чинниками вибору є:</w:t>
+      </w:r>
+    </w:p>
+    <w:p>
+      <w:pPr>
+        <w:pStyle w:val="P1"/>
+        <w:widowControl/>
+        <w:numPr>
+          <w:ilvl w:val="0"/>
+          <w:numId w:val="22"/>
+        </w:numPr>
+        <w:suppressAutoHyphens w:val="true"/>
+        <w:bidi w:val="0"/>
+        <w:spacing w:lineRule="auto" w:line="360" w:before="0" w:after="0"/>
+        <w:ind w:firstLine="850" w:left="0" w:right="0"/>
+        <w:jc w:val="both"/>
+        <w:rPr>
+          <w:lang w:val="uk-UA"/>
+        </w:rPr>
+      </w:pPr>
+      <w:r>
+        <w:rPr>
+          <w:lang w:val="uk-UA"/>
+        </w:rPr>
+        <w:t>професійні компетенції</w:t>
+      </w:r>
+    </w:p>
+    <w:p>
+      <w:pPr>
+        <w:pStyle w:val="P1"/>
+        <w:widowControl/>
+        <w:numPr>
+          <w:ilvl w:val="0"/>
+          <w:numId w:val="22"/>
+        </w:numPr>
+        <w:suppressAutoHyphens w:val="true"/>
+        <w:bidi w:val="0"/>
+        <w:spacing w:lineRule="auto" w:line="360" w:before="0" w:after="0"/>
+        <w:ind w:firstLine="850" w:left="0" w:right="0"/>
+        <w:jc w:val="both"/>
+        <w:rPr>
+          <w:lang w:val="uk-UA"/>
+        </w:rPr>
+      </w:pPr>
+      <w:r>
+        <w:rPr>
+          <w:lang w:val="uk-UA"/>
+        </w:rPr>
+        <w:t>рівень професіоналізму керівництва</w:t>
+      </w:r>
+    </w:p>
+    <w:p>
+      <w:pPr>
+        <w:pStyle w:val="P1"/>
+        <w:rPr>
+          <w:lang w:val="uk-UA"/>
+        </w:rPr>
+      </w:pPr>
+      <w:r>
+        <w:rPr>
+          <w:lang w:val="uk-UA"/>
+        </w:rPr>
+        <w:t>Можливими ризиками є:</w:t>
+      </w:r>
+    </w:p>
+    <w:p>
+      <w:pPr>
+        <w:pStyle w:val="P1"/>
+        <w:widowControl/>
+        <w:numPr>
+          <w:ilvl w:val="0"/>
+          <w:numId w:val="22"/>
+        </w:numPr>
+        <w:suppressAutoHyphens w:val="true"/>
+        <w:bidi w:val="0"/>
+        <w:spacing w:lineRule="auto" w:line="360" w:before="0" w:after="0"/>
+        <w:ind w:firstLine="850" w:left="0" w:right="0"/>
+        <w:jc w:val="both"/>
+        <w:rPr>
+          <w:lang w:val="uk-UA"/>
+        </w:rPr>
+      </w:pPr>
+      <w:r>
+        <w:rPr>
+          <w:lang w:val="uk-UA"/>
+        </w:rPr>
+        <w:t>при виборі другого варіанту втрата роботи в разі неуспіху компанії</w:t>
+      </w:r>
+    </w:p>
+    <w:p>
+      <w:pPr>
+        <w:pStyle w:val="P1"/>
+        <w:widowControl/>
+        <w:numPr>
+          <w:ilvl w:val="0"/>
+          <w:numId w:val="22"/>
+        </w:numPr>
+        <w:suppressAutoHyphens w:val="true"/>
+        <w:bidi w:val="0"/>
+        <w:spacing w:lineRule="auto" w:line="360" w:before="0" w:after="0"/>
+        <w:ind w:firstLine="850" w:left="0" w:right="0"/>
+        <w:jc w:val="both"/>
+        <w:rPr>
+          <w:lang w:val="uk-UA"/>
+        </w:rPr>
+      </w:pPr>
+      <w:r>
+        <w:rPr>
+          <w:lang w:val="uk-UA"/>
+        </w:rPr>
+        <w:t>при виборі першого варіанту відносно нудна пожиттєва кар’єра</w:t>
+      </w:r>
+    </w:p>
+    <w:p>
+      <w:pPr>
+        <w:pStyle w:val="P1"/>
+        <w:rPr>
+          <w:lang w:val="uk-UA"/>
+        </w:rPr>
+      </w:pPr>
+      <w:r>
+        <w:rPr>
+          <w:lang w:val="uk-UA"/>
+        </w:rPr>
+        <w:t>Потенційними перевагами є:</w:t>
+      </w:r>
+    </w:p>
+    <w:p>
+      <w:pPr>
+        <w:pStyle w:val="P1"/>
+        <w:widowControl/>
+        <w:numPr>
+          <w:ilvl w:val="0"/>
+          <w:numId w:val="23"/>
+        </w:numPr>
+        <w:suppressAutoHyphens w:val="true"/>
+        <w:bidi w:val="0"/>
+        <w:spacing w:lineRule="auto" w:line="360" w:before="0" w:after="0"/>
+        <w:ind w:firstLine="850" w:left="0" w:right="0"/>
+        <w:jc w:val="both"/>
+        <w:rPr>
+          <w:lang w:val="uk-UA"/>
+        </w:rPr>
+      </w:pPr>
+      <w:r>
+        <w:rPr>
+          <w:lang w:val="uk-UA"/>
+        </w:rPr>
+        <w:t>при виборі першого варіанту, стабільне кар’єрне зростання</w:t>
+      </w:r>
+    </w:p>
+    <w:p>
+      <w:pPr>
+        <w:pStyle w:val="P1"/>
+        <w:widowControl/>
+        <w:numPr>
+          <w:ilvl w:val="0"/>
+          <w:numId w:val="23"/>
+        </w:numPr>
+        <w:suppressAutoHyphens w:val="true"/>
+        <w:bidi w:val="0"/>
+        <w:spacing w:lineRule="auto" w:line="360" w:before="0" w:after="0"/>
+        <w:ind w:firstLine="850" w:left="0" w:right="0"/>
+        <w:jc w:val="both"/>
+        <w:rPr>
+          <w:lang w:val="uk-UA"/>
+        </w:rPr>
+      </w:pPr>
+      <w:r>
+        <w:rPr>
+          <w:lang w:val="uk-UA"/>
+        </w:rPr>
+        <w:t>при виборі другого варіанту, більша заробітна плата</w:t>
+      </w:r>
+    </w:p>
+    <w:p>
+      <w:pPr>
+        <w:pStyle w:val="P1"/>
+        <w:widowControl/>
+        <w:suppressAutoHyphens w:val="true"/>
+        <w:bidi w:val="0"/>
+        <w:spacing w:lineRule="auto" w:line="360" w:before="0" w:after="0"/>
+        <w:ind w:firstLine="850" w:left="0" w:right="0"/>
+        <w:jc w:val="both"/>
+        <w:rPr>
+          <w:lang w:val="uk-UA"/>
+        </w:rPr>
+      </w:pPr>
+      <w:r>
+        <w:rPr>
+          <w:lang w:val="uk-UA"/>
+        </w:rPr>
+        <w:t>Наступні особистісні якості можуть вплинути на вибір:</w:t>
+      </w:r>
+    </w:p>
+    <w:p>
+      <w:pPr>
+        <w:pStyle w:val="P1"/>
+        <w:widowControl/>
+        <w:numPr>
+          <w:ilvl w:val="0"/>
+          <w:numId w:val="24"/>
+        </w:numPr>
+        <w:suppressAutoHyphens w:val="true"/>
+        <w:bidi w:val="0"/>
+        <w:spacing w:lineRule="auto" w:line="360" w:before="0" w:after="0"/>
+        <w:ind w:firstLine="850" w:left="0" w:right="0"/>
+        <w:jc w:val="both"/>
+        <w:rPr>
+          <w:lang w:val="uk-UA"/>
+        </w:rPr>
+      </w:pPr>
+      <w:r>
+        <w:rPr>
+          <w:lang w:val="uk-UA"/>
+        </w:rPr>
+        <w:t>рішучість</w:t>
+      </w:r>
+    </w:p>
+    <w:p>
+      <w:pPr>
+        <w:pStyle w:val="P1"/>
+        <w:widowControl/>
+        <w:numPr>
+          <w:ilvl w:val="0"/>
+          <w:numId w:val="24"/>
+        </w:numPr>
+        <w:suppressAutoHyphens w:val="true"/>
+        <w:bidi w:val="0"/>
+        <w:spacing w:lineRule="auto" w:line="360" w:before="0" w:after="0"/>
+        <w:ind w:firstLine="850" w:left="0" w:right="0"/>
+        <w:jc w:val="both"/>
+        <w:rPr>
+          <w:lang w:val="uk-UA"/>
+        </w:rPr>
+      </w:pPr>
+      <w:r>
+        <w:rPr>
+          <w:lang w:val="uk-UA"/>
+        </w:rPr>
+        <w:t>стресостійкість</w:t>
+      </w:r>
+    </w:p>
+    <w:p>
+      <w:pPr>
+        <w:pStyle w:val="P1"/>
+        <w:widowControl/>
+        <w:numPr>
+          <w:ilvl w:val="0"/>
+          <w:numId w:val="24"/>
+        </w:numPr>
+        <w:suppressAutoHyphens w:val="true"/>
+        <w:bidi w:val="0"/>
+        <w:spacing w:lineRule="auto" w:line="360" w:before="0" w:after="0"/>
+        <w:ind w:firstLine="850" w:left="0" w:right="0"/>
+        <w:jc w:val="both"/>
+        <w:rPr>
+          <w:lang w:val="uk-UA"/>
+        </w:rPr>
+      </w:pPr>
+      <w:r>
+        <w:rPr>
+          <w:lang w:val="uk-UA"/>
+        </w:rPr>
+        <w:t>здатність до навчання</w:t>
+      </w:r>
+    </w:p>
+    <w:p>
+      <w:pPr>
+        <w:pStyle w:val="P1"/>
+        <w:widowControl/>
+        <w:suppressAutoHyphens w:val="true"/>
+        <w:bidi w:val="0"/>
+        <w:spacing w:lineRule="auto" w:line="360" w:before="0" w:after="0"/>
+        <w:ind w:firstLine="850" w:left="0" w:right="0"/>
+        <w:jc w:val="both"/>
+        <w:rPr>
+          <w:lang w:val="uk-UA"/>
+        </w:rPr>
+      </w:pPr>
+      <w:r>
+        <w:rPr>
+          <w:lang w:val="uk-UA"/>
+        </w:rPr>
+        <w:t>Особисто я би обрав перший варіант через його стабільність, бо мені подобається стабільність, як і говориться в Біблії, що Господь Ісус є Богом миру і порядку.</w:t>
+      </w:r>
+    </w:p>
+    <w:p>
+      <w:pPr>
+        <w:pStyle w:val="P1"/>
+        <w:widowControl/>
+        <w:suppressAutoHyphens w:val="true"/>
+        <w:bidi w:val="0"/>
+        <w:spacing w:lineRule="auto" w:line="360" w:before="0" w:after="0"/>
+        <w:ind w:firstLine="850" w:left="0" w:right="0"/>
+        <w:jc w:val="both"/>
+        <w:rPr>
+          <w:lang w:val="uk-UA"/>
+        </w:rPr>
+      </w:pPr>
+      <w:r>
+        <w:rPr>
+          <w:lang w:val="uk-UA"/>
+        </w:rPr>
+      </w:r>
+    </w:p>
+    <w:p>
+      <w:pPr>
+        <w:pStyle w:val="H2"/>
+        <w:rPr/>
+      </w:pPr>
+      <w:r>
+        <w:rPr/>
+        <w:t>10 Завдання для самостійної роботи</w:t>
+      </w:r>
+    </w:p>
+    <w:p>
+      <w:pPr>
+        <w:pStyle w:val="P1"/>
+        <w:widowControl/>
+        <w:suppressAutoHyphens w:val="true"/>
+        <w:bidi w:val="0"/>
+        <w:spacing w:lineRule="auto" w:line="360" w:before="0" w:after="0"/>
+        <w:ind w:firstLine="850" w:left="0" w:right="0"/>
+        <w:jc w:val="both"/>
+        <w:rPr>
+          <w:lang w:val="uk-UA"/>
+        </w:rPr>
+      </w:pPr>
+      <w:r>
+        <w:rPr>
+          <w:lang w:val="uk-UA"/>
+        </w:rPr>
+      </w:r>
+    </w:p>
+    <w:p>
+      <w:pPr>
+        <w:pStyle w:val="P1"/>
+        <w:widowControl/>
+        <w:suppressAutoHyphens w:val="true"/>
+        <w:bidi w:val="0"/>
+        <w:spacing w:lineRule="auto" w:line="360" w:before="0" w:after="0"/>
+        <w:ind w:firstLine="850" w:left="0" w:right="0"/>
+        <w:jc w:val="both"/>
+        <w:rPr>
+          <w:lang w:val="uk-UA"/>
+        </w:rPr>
+      </w:pPr>
+      <w:r>
+        <w:rPr>
+          <w:lang w:val="uk-UA"/>
+        </w:rPr>
+        <w:t>Глосарій (15 термінів)</w:t>
+      </w:r>
+    </w:p>
+    <w:p>
+      <w:pPr>
+        <w:pStyle w:val="P1"/>
+        <w:widowControl/>
+        <w:numPr>
+          <w:ilvl w:val="0"/>
+          <w:numId w:val="25"/>
+        </w:numPr>
+        <w:suppressAutoHyphens w:val="true"/>
+        <w:bidi w:val="0"/>
+        <w:spacing w:lineRule="auto" w:line="360" w:before="0" w:after="0"/>
+        <w:ind w:firstLine="850" w:left="0" w:right="0"/>
+        <w:jc w:val="both"/>
+        <w:rPr>
+          <w:lang w:val="uk-UA"/>
+        </w:rPr>
+      </w:pPr>
+      <w:r>
+        <w:rPr>
+          <w:lang w:val="uk-UA"/>
+        </w:rPr>
+      </w:r>
+    </w:p>
+    <w:p>
+      <w:pPr>
+        <w:pStyle w:val="h11"/>
+        <w:rPr/>
+      </w:pPr>
+      <w:r>
+        <w:rPr/>
+        <w:t>Питання</w:t>
       </w:r>
     </w:p>
     <w:sectPr>
@@ -7775,6 +8192,518 @@
     </w:lvl>
   </w:abstractNum>
   <w:abstractNum w:abstractNumId="22">
+    <w:lvl w:ilvl="0">
+      <w:start w:val="1"/>
+      <w:numFmt w:val="bullet"/>
+      <w:lvlText w:val=""/>
+      <w:lvlJc w:val="left"/>
+      <w:pPr>
+        <w:tabs>
+          <w:tab w:val="num" w:pos="720"/>
+        </w:tabs>
+        <w:ind w:left="720" w:hanging="360"/>
+      </w:pPr>
+      <w:rPr>
+        <w:rFonts w:ascii="Symbol" w:hAnsi="Symbol" w:cs="Symbol" w:hint="default"/>
+      </w:rPr>
+    </w:lvl>
+    <w:lvl w:ilvl="1">
+      <w:start w:val="1"/>
+      <w:numFmt w:val="bullet"/>
+      <w:lvlText w:val="◦"/>
+      <w:lvlJc w:val="left"/>
+      <w:pPr>
+        <w:tabs>
+          <w:tab w:val="num" w:pos="1080"/>
+        </w:tabs>
+        <w:ind w:left="1080" w:hanging="360"/>
+      </w:pPr>
+      <w:rPr>
+        <w:rFonts w:ascii="OpenSymbol" w:hAnsi="OpenSymbol" w:cs="OpenSymbol" w:hint="default"/>
+      </w:rPr>
+    </w:lvl>
+    <w:lvl w:ilvl="2">
+      <w:start w:val="1"/>
+      <w:numFmt w:val="bullet"/>
+      <w:lvlText w:val="▪"/>
+      <w:lvlJc w:val="left"/>
+      <w:pPr>
+        <w:tabs>
+          <w:tab w:val="num" w:pos="1440"/>
+        </w:tabs>
+        <w:ind w:left="1440" w:hanging="360"/>
+      </w:pPr>
+      <w:rPr>
+        <w:rFonts w:ascii="OpenSymbol" w:hAnsi="OpenSymbol" w:cs="OpenSymbol" w:hint="default"/>
+      </w:rPr>
+    </w:lvl>
+    <w:lvl w:ilvl="3">
+      <w:start w:val="1"/>
+      <w:numFmt w:val="bullet"/>
+      <w:lvlText w:val=""/>
+      <w:lvlJc w:val="left"/>
+      <w:pPr>
+        <w:tabs>
+          <w:tab w:val="num" w:pos="1800"/>
+        </w:tabs>
+        <w:ind w:left="1800" w:hanging="360"/>
+      </w:pPr>
+      <w:rPr>
+        <w:rFonts w:ascii="Symbol" w:hAnsi="Symbol" w:cs="Symbol" w:hint="default"/>
+      </w:rPr>
+    </w:lvl>
+    <w:lvl w:ilvl="4">
+      <w:start w:val="1"/>
+      <w:numFmt w:val="bullet"/>
+      <w:lvlText w:val="◦"/>
+      <w:lvlJc w:val="left"/>
+      <w:pPr>
+        <w:tabs>
+          <w:tab w:val="num" w:pos="2160"/>
+        </w:tabs>
+        <w:ind w:left="2160" w:hanging="360"/>
+      </w:pPr>
+      <w:rPr>
+        <w:rFonts w:ascii="OpenSymbol" w:hAnsi="OpenSymbol" w:cs="OpenSymbol" w:hint="default"/>
+      </w:rPr>
+    </w:lvl>
+    <w:lvl w:ilvl="5">
+      <w:start w:val="1"/>
+      <w:numFmt w:val="bullet"/>
+      <w:lvlText w:val="▪"/>
+      <w:lvlJc w:val="left"/>
+      <w:pPr>
+        <w:tabs>
+          <w:tab w:val="num" w:pos="2520"/>
+        </w:tabs>
+        <w:ind w:left="2520" w:hanging="360"/>
+      </w:pPr>
+      <w:rPr>
+        <w:rFonts w:ascii="OpenSymbol" w:hAnsi="OpenSymbol" w:cs="OpenSymbol" w:hint="default"/>
+      </w:rPr>
+    </w:lvl>
+    <w:lvl w:ilvl="6">
+      <w:start w:val="1"/>
+      <w:numFmt w:val="bullet"/>
+      <w:lvlText w:val=""/>
+      <w:lvlJc w:val="left"/>
+      <w:pPr>
+        <w:tabs>
+          <w:tab w:val="num" w:pos="2880"/>
+        </w:tabs>
+        <w:ind w:left="2880" w:hanging="360"/>
+      </w:pPr>
+      <w:rPr>
+        <w:rFonts w:ascii="Symbol" w:hAnsi="Symbol" w:cs="Symbol" w:hint="default"/>
+      </w:rPr>
+    </w:lvl>
+    <w:lvl w:ilvl="7">
+      <w:start w:val="1"/>
+      <w:numFmt w:val="bullet"/>
+      <w:lvlText w:val="◦"/>
+      <w:lvlJc w:val="left"/>
+      <w:pPr>
+        <w:tabs>
+          <w:tab w:val="num" w:pos="3240"/>
+        </w:tabs>
+        <w:ind w:left="3240" w:hanging="360"/>
+      </w:pPr>
+      <w:rPr>
+        <w:rFonts w:ascii="OpenSymbol" w:hAnsi="OpenSymbol" w:cs="OpenSymbol" w:hint="default"/>
+      </w:rPr>
+    </w:lvl>
+    <w:lvl w:ilvl="8">
+      <w:start w:val="1"/>
+      <w:numFmt w:val="bullet"/>
+      <w:lvlText w:val="▪"/>
+      <w:lvlJc w:val="left"/>
+      <w:pPr>
+        <w:tabs>
+          <w:tab w:val="num" w:pos="3600"/>
+        </w:tabs>
+        <w:ind w:left="3600" w:hanging="360"/>
+      </w:pPr>
+      <w:rPr>
+        <w:rFonts w:ascii="OpenSymbol" w:hAnsi="OpenSymbol" w:cs="OpenSymbol" w:hint="default"/>
+      </w:rPr>
+    </w:lvl>
+  </w:abstractNum>
+  <w:abstractNum w:abstractNumId="23">
+    <w:lvl w:ilvl="0">
+      <w:start w:val="1"/>
+      <w:numFmt w:val="bullet"/>
+      <w:lvlText w:val=""/>
+      <w:lvlJc w:val="left"/>
+      <w:pPr>
+        <w:tabs>
+          <w:tab w:val="num" w:pos="720"/>
+        </w:tabs>
+        <w:ind w:left="720" w:hanging="360"/>
+      </w:pPr>
+      <w:rPr>
+        <w:rFonts w:ascii="Symbol" w:hAnsi="Symbol" w:cs="Symbol" w:hint="default"/>
+      </w:rPr>
+    </w:lvl>
+    <w:lvl w:ilvl="1">
+      <w:start w:val="1"/>
+      <w:numFmt w:val="bullet"/>
+      <w:lvlText w:val="◦"/>
+      <w:lvlJc w:val="left"/>
+      <w:pPr>
+        <w:tabs>
+          <w:tab w:val="num" w:pos="1080"/>
+        </w:tabs>
+        <w:ind w:left="1080" w:hanging="360"/>
+      </w:pPr>
+      <w:rPr>
+        <w:rFonts w:ascii="OpenSymbol" w:hAnsi="OpenSymbol" w:cs="OpenSymbol" w:hint="default"/>
+      </w:rPr>
+    </w:lvl>
+    <w:lvl w:ilvl="2">
+      <w:start w:val="1"/>
+      <w:numFmt w:val="bullet"/>
+      <w:lvlText w:val="▪"/>
+      <w:lvlJc w:val="left"/>
+      <w:pPr>
+        <w:tabs>
+          <w:tab w:val="num" w:pos="1440"/>
+        </w:tabs>
+        <w:ind w:left="1440" w:hanging="360"/>
+      </w:pPr>
+      <w:rPr>
+        <w:rFonts w:ascii="OpenSymbol" w:hAnsi="OpenSymbol" w:cs="OpenSymbol" w:hint="default"/>
+      </w:rPr>
+    </w:lvl>
+    <w:lvl w:ilvl="3">
+      <w:start w:val="1"/>
+      <w:numFmt w:val="bullet"/>
+      <w:lvlText w:val=""/>
+      <w:lvlJc w:val="left"/>
+      <w:pPr>
+        <w:tabs>
+          <w:tab w:val="num" w:pos="1800"/>
+        </w:tabs>
+        <w:ind w:left="1800" w:hanging="360"/>
+      </w:pPr>
+      <w:rPr>
+        <w:rFonts w:ascii="Symbol" w:hAnsi="Symbol" w:cs="Symbol" w:hint="default"/>
+      </w:rPr>
+    </w:lvl>
+    <w:lvl w:ilvl="4">
+      <w:start w:val="1"/>
+      <w:numFmt w:val="bullet"/>
+      <w:lvlText w:val="◦"/>
+      <w:lvlJc w:val="left"/>
+      <w:pPr>
+        <w:tabs>
+          <w:tab w:val="num" w:pos="2160"/>
+        </w:tabs>
+        <w:ind w:left="2160" w:hanging="360"/>
+      </w:pPr>
+      <w:rPr>
+        <w:rFonts w:ascii="OpenSymbol" w:hAnsi="OpenSymbol" w:cs="OpenSymbol" w:hint="default"/>
+      </w:rPr>
+    </w:lvl>
+    <w:lvl w:ilvl="5">
+      <w:start w:val="1"/>
+      <w:numFmt w:val="bullet"/>
+      <w:lvlText w:val="▪"/>
+      <w:lvlJc w:val="left"/>
+      <w:pPr>
+        <w:tabs>
+          <w:tab w:val="num" w:pos="2520"/>
+        </w:tabs>
+        <w:ind w:left="2520" w:hanging="360"/>
+      </w:pPr>
+      <w:rPr>
+        <w:rFonts w:ascii="OpenSymbol" w:hAnsi="OpenSymbol" w:cs="OpenSymbol" w:hint="default"/>
+      </w:rPr>
+    </w:lvl>
+    <w:lvl w:ilvl="6">
+      <w:start w:val="1"/>
+      <w:numFmt w:val="bullet"/>
+      <w:lvlText w:val=""/>
+      <w:lvlJc w:val="left"/>
+      <w:pPr>
+        <w:tabs>
+          <w:tab w:val="num" w:pos="2880"/>
+        </w:tabs>
+        <w:ind w:left="2880" w:hanging="360"/>
+      </w:pPr>
+      <w:rPr>
+        <w:rFonts w:ascii="Symbol" w:hAnsi="Symbol" w:cs="Symbol" w:hint="default"/>
+      </w:rPr>
+    </w:lvl>
+    <w:lvl w:ilvl="7">
+      <w:start w:val="1"/>
+      <w:numFmt w:val="bullet"/>
+      <w:lvlText w:val="◦"/>
+      <w:lvlJc w:val="left"/>
+      <w:pPr>
+        <w:tabs>
+          <w:tab w:val="num" w:pos="3240"/>
+        </w:tabs>
+        <w:ind w:left="3240" w:hanging="360"/>
+      </w:pPr>
+      <w:rPr>
+        <w:rFonts w:ascii="OpenSymbol" w:hAnsi="OpenSymbol" w:cs="OpenSymbol" w:hint="default"/>
+      </w:rPr>
+    </w:lvl>
+    <w:lvl w:ilvl="8">
+      <w:start w:val="1"/>
+      <w:numFmt w:val="bullet"/>
+      <w:lvlText w:val="▪"/>
+      <w:lvlJc w:val="left"/>
+      <w:pPr>
+        <w:tabs>
+          <w:tab w:val="num" w:pos="3600"/>
+        </w:tabs>
+        <w:ind w:left="3600" w:hanging="360"/>
+      </w:pPr>
+      <w:rPr>
+        <w:rFonts w:ascii="OpenSymbol" w:hAnsi="OpenSymbol" w:cs="OpenSymbol" w:hint="default"/>
+      </w:rPr>
+    </w:lvl>
+  </w:abstractNum>
+  <w:abstractNum w:abstractNumId="24">
+    <w:lvl w:ilvl="0">
+      <w:start w:val="1"/>
+      <w:numFmt w:val="decimal"/>
+      <w:lvlText w:val="%1."/>
+      <w:lvlJc w:val="left"/>
+      <w:pPr>
+        <w:tabs>
+          <w:tab w:val="num" w:pos="720"/>
+        </w:tabs>
+        <w:ind w:left="720" w:hanging="360"/>
+      </w:pPr>
+      <w:rPr/>
+    </w:lvl>
+    <w:lvl w:ilvl="1">
+      <w:start w:val="1"/>
+      <w:numFmt w:val="decimal"/>
+      <w:lvlText w:val="%2."/>
+      <w:lvlJc w:val="left"/>
+      <w:pPr>
+        <w:tabs>
+          <w:tab w:val="num" w:pos="1080"/>
+        </w:tabs>
+        <w:ind w:left="1080" w:hanging="360"/>
+      </w:pPr>
+      <w:rPr/>
+    </w:lvl>
+    <w:lvl w:ilvl="2">
+      <w:start w:val="1"/>
+      <w:numFmt w:val="decimal"/>
+      <w:lvlText w:val="%3."/>
+      <w:lvlJc w:val="left"/>
+      <w:pPr>
+        <w:tabs>
+          <w:tab w:val="num" w:pos="1440"/>
+        </w:tabs>
+        <w:ind w:left="1440" w:hanging="360"/>
+      </w:pPr>
+      <w:rPr/>
+    </w:lvl>
+    <w:lvl w:ilvl="3">
+      <w:start w:val="1"/>
+      <w:numFmt w:val="decimal"/>
+      <w:lvlText w:val="%4."/>
+      <w:lvlJc w:val="left"/>
+      <w:pPr>
+        <w:tabs>
+          <w:tab w:val="num" w:pos="1800"/>
+        </w:tabs>
+        <w:ind w:left="1800" w:hanging="360"/>
+      </w:pPr>
+      <w:rPr/>
+    </w:lvl>
+    <w:lvl w:ilvl="4">
+      <w:start w:val="1"/>
+      <w:numFmt w:val="decimal"/>
+      <w:lvlText w:val="%5."/>
+      <w:lvlJc w:val="left"/>
+      <w:pPr>
+        <w:tabs>
+          <w:tab w:val="num" w:pos="2160"/>
+        </w:tabs>
+        <w:ind w:left="2160" w:hanging="360"/>
+      </w:pPr>
+      <w:rPr/>
+    </w:lvl>
+    <w:lvl w:ilvl="5">
+      <w:start w:val="1"/>
+      <w:numFmt w:val="decimal"/>
+      <w:lvlText w:val="%6."/>
+      <w:lvlJc w:val="left"/>
+      <w:pPr>
+        <w:tabs>
+          <w:tab w:val="num" w:pos="2520"/>
+        </w:tabs>
+        <w:ind w:left="2520" w:hanging="360"/>
+      </w:pPr>
+      <w:rPr/>
+    </w:lvl>
+    <w:lvl w:ilvl="6">
+      <w:start w:val="1"/>
+      <w:numFmt w:val="decimal"/>
+      <w:lvlText w:val="%7."/>
+      <w:lvlJc w:val="left"/>
+      <w:pPr>
+        <w:tabs>
+          <w:tab w:val="num" w:pos="2880"/>
+        </w:tabs>
+        <w:ind w:left="2880" w:hanging="360"/>
+      </w:pPr>
+      <w:rPr/>
+    </w:lvl>
+    <w:lvl w:ilvl="7">
+      <w:start w:val="1"/>
+      <w:numFmt w:val="decimal"/>
+      <w:lvlText w:val="%8."/>
+      <w:lvlJc w:val="left"/>
+      <w:pPr>
+        <w:tabs>
+          <w:tab w:val="num" w:pos="3240"/>
+        </w:tabs>
+        <w:ind w:left="3240" w:hanging="360"/>
+      </w:pPr>
+      <w:rPr/>
+    </w:lvl>
+    <w:lvl w:ilvl="8">
+      <w:start w:val="1"/>
+      <w:numFmt w:val="decimal"/>
+      <w:lvlText w:val="%9."/>
+      <w:lvlJc w:val="left"/>
+      <w:pPr>
+        <w:tabs>
+          <w:tab w:val="num" w:pos="3600"/>
+        </w:tabs>
+        <w:ind w:left="3600" w:hanging="360"/>
+      </w:pPr>
+      <w:rPr/>
+    </w:lvl>
+  </w:abstractNum>
+  <w:abstractNum w:abstractNumId="25">
+    <w:lvl w:ilvl="0">
+      <w:start w:val="1"/>
+      <w:numFmt w:val="decimal"/>
+      <w:lvlText w:val="%1."/>
+      <w:lvlJc w:val="left"/>
+      <w:pPr>
+        <w:tabs>
+          <w:tab w:val="num" w:pos="720"/>
+        </w:tabs>
+        <w:ind w:left="720" w:hanging="360"/>
+      </w:pPr>
+      <w:rPr/>
+    </w:lvl>
+    <w:lvl w:ilvl="1">
+      <w:start w:val="1"/>
+      <w:numFmt w:val="decimal"/>
+      <w:lvlText w:val="%2."/>
+      <w:lvlJc w:val="left"/>
+      <w:pPr>
+        <w:tabs>
+          <w:tab w:val="num" w:pos="1080"/>
+        </w:tabs>
+        <w:ind w:left="1080" w:hanging="360"/>
+      </w:pPr>
+      <w:rPr/>
+    </w:lvl>
+    <w:lvl w:ilvl="2">
+      <w:start w:val="1"/>
+      <w:numFmt w:val="decimal"/>
+      <w:lvlText w:val="%3."/>
+      <w:lvlJc w:val="left"/>
+      <w:pPr>
+        <w:tabs>
+          <w:tab w:val="num" w:pos="1440"/>
+        </w:tabs>
+        <w:ind w:left="1440" w:hanging="360"/>
+      </w:pPr>
+      <w:rPr/>
+    </w:lvl>
+    <w:lvl w:ilvl="3">
+      <w:start w:val="1"/>
+      <w:numFmt w:val="decimal"/>
+      <w:lvlText w:val="%4."/>
+      <w:lvlJc w:val="left"/>
+      <w:pPr>
+        <w:tabs>
+          <w:tab w:val="num" w:pos="1800"/>
+        </w:tabs>
+        <w:ind w:left="1800" w:hanging="360"/>
+      </w:pPr>
+      <w:rPr/>
+    </w:lvl>
+    <w:lvl w:ilvl="4">
+      <w:start w:val="1"/>
+      <w:numFmt w:val="decimal"/>
+      <w:lvlText w:val="%5."/>
+      <w:lvlJc w:val="left"/>
+      <w:pPr>
+        <w:tabs>
+          <w:tab w:val="num" w:pos="2160"/>
+        </w:tabs>
+        <w:ind w:left="2160" w:hanging="360"/>
+      </w:pPr>
+      <w:rPr/>
+    </w:lvl>
+    <w:lvl w:ilvl="5">
+      <w:start w:val="1"/>
+      <w:numFmt w:val="decimal"/>
+      <w:lvlText w:val="%6."/>
+      <w:lvlJc w:val="left"/>
+      <w:pPr>
+        <w:tabs>
+          <w:tab w:val="num" w:pos="2520"/>
+        </w:tabs>
+        <w:ind w:left="2520" w:hanging="360"/>
+      </w:pPr>
+      <w:rPr/>
+    </w:lvl>
+    <w:lvl w:ilvl="6">
+      <w:start w:val="1"/>
+      <w:numFmt w:val="decimal"/>
+      <w:lvlText w:val="%7."/>
+      <w:lvlJc w:val="left"/>
+      <w:pPr>
+        <w:tabs>
+          <w:tab w:val="num" w:pos="2880"/>
+        </w:tabs>
+        <w:ind w:left="2880" w:hanging="360"/>
+      </w:pPr>
+      <w:rPr/>
+    </w:lvl>
+    <w:lvl w:ilvl="7">
+      <w:start w:val="1"/>
+      <w:numFmt w:val="decimal"/>
+      <w:lvlText w:val="%8."/>
+      <w:lvlJc w:val="left"/>
+      <w:pPr>
+        <w:tabs>
+          <w:tab w:val="num" w:pos="3240"/>
+        </w:tabs>
+        <w:ind w:left="3240" w:hanging="360"/>
+      </w:pPr>
+      <w:rPr/>
+    </w:lvl>
+    <w:lvl w:ilvl="8">
+      <w:start w:val="1"/>
+      <w:numFmt w:val="decimal"/>
+      <w:lvlText w:val="%9."/>
+      <w:lvlJc w:val="left"/>
+      <w:pPr>
+        <w:tabs>
+          <w:tab w:val="num" w:pos="3600"/>
+        </w:tabs>
+        <w:ind w:left="3600" w:hanging="360"/>
+      </w:pPr>
+      <w:rPr/>
+    </w:lvl>
+  </w:abstractNum>
+  <w:abstractNum w:abstractNumId="26">
     <w:lvl w:ilvl="0">
       <w:start w:val="1"/>
       <w:numFmt w:val="none"/>
@@ -7958,6 +8887,18 @@
   </w:num>
   <w:num w:numId="22">
     <w:abstractNumId w:val="22"/>
+  </w:num>
+  <w:num w:numId="23">
+    <w:abstractNumId w:val="23"/>
+  </w:num>
+  <w:num w:numId="24">
+    <w:abstractNumId w:val="24"/>
+  </w:num>
+  <w:num w:numId="25">
+    <w:abstractNumId w:val="25"/>
+  </w:num>
+  <w:num w:numId="26">
+    <w:abstractNumId w:val="26"/>
   </w:num>
 </w:numbering>
 </file>
@@ -8747,24 +9688,24 @@
       <w:lang w:val="en-US" w:eastAsia="uk-UA"/>
     </w:rPr>
   </w:style>
+  <w:style w:type="character" w:styleId="Style12">
+    <w:name w:val="Символ нумерації"/>
+    <w:qFormat/>
+    <w:rPr/>
+  </w:style>
   <w:style w:type="character" w:styleId="user">
     <w:name w:val="Символ нумерації (user)"/>
     <w:qFormat/>
     <w:rPr/>
   </w:style>
-  <w:style w:type="character" w:styleId="Style12">
-    <w:name w:val="Символ нумерації"/>
-    <w:qFormat/>
-    <w:rPr/>
-  </w:style>
-  <w:style w:type="character" w:styleId="Style13">
-    <w:name w:val="Маркери"/>
+  <w:style w:type="character" w:styleId="user1">
+    <w:name w:val="Маркери (user)"/>
     <w:qFormat/>
     <w:rPr>
       <w:rFonts w:ascii="OpenSymbol" w:hAnsi="OpenSymbol" w:eastAsia="OpenSymbol" w:cs="OpenSymbol"/>
     </w:rPr>
   </w:style>
-  <w:style w:type="paragraph" w:styleId="Style14">
+  <w:style w:type="paragraph" w:styleId="Style13">
     <w:name w:val="Заголовок"/>
     <w:basedOn w:val="Normal"/>
     <w:next w:val="BodyText"/>
@@ -8774,7 +9715,7 @@
       <w:spacing w:before="240" w:after="120"/>
     </w:pPr>
     <w:rPr>
-      <w:rFonts w:ascii="Liberation Sans" w:hAnsi="Liberation Sans" w:eastAsia="Microsoft YaHei" w:cs="Arial Unicode MS"/>
+      <w:rFonts w:ascii="Liberation Sans" w:hAnsi="Liberation Sans" w:eastAsia="Microsoft YaHei" w:cs="Lucida Sans"/>
       <w:sz w:val="28"/>
       <w:szCs w:val="28"/>
     </w:rPr>
@@ -8811,8 +9752,34 @@
       <w:szCs w:val="24"/>
     </w:rPr>
   </w:style>
-  <w:style w:type="paragraph" w:styleId="Style15">
+  <w:style w:type="paragraph" w:styleId="Style14">
     <w:name w:val="Покажчик"/>
+    <w:basedOn w:val="Normal"/>
+    <w:qFormat/>
+    <w:pPr>
+      <w:suppressLineNumbers/>
+    </w:pPr>
+    <w:rPr>
+      <w:rFonts w:cs="Lucida Sans"/>
+    </w:rPr>
+  </w:style>
+  <w:style w:type="paragraph" w:styleId="user2">
+    <w:name w:val="Заголовок (user)"/>
+    <w:basedOn w:val="Normal"/>
+    <w:next w:val="BodyText"/>
+    <w:qFormat/>
+    <w:pPr>
+      <w:keepNext w:val="true"/>
+      <w:spacing w:before="240" w:after="120"/>
+    </w:pPr>
+    <w:rPr>
+      <w:rFonts w:ascii="Liberation Sans" w:hAnsi="Liberation Sans" w:eastAsia="Microsoft YaHei" w:cs="Arial Unicode MS"/>
+      <w:sz w:val="28"/>
+      <w:szCs w:val="28"/>
+    </w:rPr>
+  </w:style>
+  <w:style w:type="paragraph" w:styleId="user3">
+    <w:name w:val="Покажчик (user)"/>
     <w:basedOn w:val="Normal"/>
     <w:qFormat/>
     <w:pPr>
@@ -8822,35 +9789,9 @@
       <w:rFonts w:cs="Arial Unicode MS"/>
     </w:rPr>
   </w:style>
-  <w:style w:type="paragraph" w:styleId="user1">
-    <w:name w:val="Заголовок (user)"/>
-    <w:basedOn w:val="Normal"/>
-    <w:next w:val="BodyText"/>
-    <w:qFormat/>
-    <w:pPr>
-      <w:keepNext w:val="true"/>
-      <w:spacing w:before="240" w:after="120"/>
-    </w:pPr>
-    <w:rPr>
-      <w:rFonts w:ascii="Liberation Sans" w:hAnsi="Liberation Sans" w:eastAsia="Microsoft YaHei" w:cs="Lucida Sans"/>
-      <w:sz w:val="28"/>
-      <w:szCs w:val="28"/>
-    </w:rPr>
-  </w:style>
-  <w:style w:type="paragraph" w:styleId="user2">
-    <w:name w:val="Покажчик (user)"/>
-    <w:basedOn w:val="Normal"/>
-    <w:qFormat/>
-    <w:pPr>
-      <w:suppressLineNumbers/>
-    </w:pPr>
-    <w:rPr>
-      <w:rFonts w:cs="Lucida Sans"/>
-    </w:rPr>
-  </w:style>
   <w:style w:type="paragraph" w:styleId="IndexHeading">
     <w:name w:val="index heading"/>
-    <w:basedOn w:val="Style14"/>
+    <w:basedOn w:val="user2"/>
     <w:pPr/>
     <w:rPr/>
   </w:style>
@@ -9128,8 +10069,8 @@
     </w:pPr>
     <w:rPr/>
   </w:style>
-  <w:style w:type="paragraph" w:styleId="Style16">
-    <w:name w:val="Вміст таблиці"/>
+  <w:style w:type="paragraph" w:styleId="user4">
+    <w:name w:val="Вміст таблиці (user)"/>
     <w:basedOn w:val="Normal"/>
     <w:qFormat/>
     <w:pPr>
@@ -9138,8 +10079,8 @@
     </w:pPr>
     <w:rPr/>
   </w:style>
-  <w:style w:type="numbering" w:styleId="Style17" w:default="1">
-    <w:name w:val="Без маркерів"/>
+  <w:style w:type="numbering" w:styleId="user5" w:default="1">
+    <w:name w:val="Без маркерів (user)"/>
     <w:uiPriority w:val="99"/>
     <w:semiHidden/>
     <w:unhideWhenUsed/>

</xml_diff>

<commit_message>
feat: make the IM hometask
</commit_message>
<xml_diff>
--- a/51PK Psyhologija karjery/1/PK1_KNT-116m_Onyshchenko_15.docx
+++ b/51PK Psyhologija karjery/1/PK1_KNT-116m_Onyshchenko_15.docx
@@ -907,7 +907,7 @@
           </w:tcPr>
           <w:p>
             <w:pPr>
-              <w:pStyle w:val="user4"/>
+              <w:pStyle w:val="Style16"/>
               <w:spacing w:lineRule="auto" w:line="240"/>
               <w:ind w:hanging="0" w:left="0"/>
               <w:rPr>
@@ -936,7 +936,7 @@
           </w:tcPr>
           <w:p>
             <w:pPr>
-              <w:pStyle w:val="user4"/>
+              <w:pStyle w:val="Style16"/>
               <w:spacing w:lineRule="auto" w:line="240"/>
               <w:ind w:hanging="0" w:left="0"/>
               <w:rPr>
@@ -966,7 +966,7 @@
           </w:tcPr>
           <w:p>
             <w:pPr>
-              <w:pStyle w:val="user4"/>
+              <w:pStyle w:val="Style16"/>
               <w:spacing w:lineRule="auto" w:line="240"/>
               <w:ind w:hanging="0" w:left="0"/>
               <w:rPr/>
@@ -988,7 +988,7 @@
           </w:tcPr>
           <w:p>
             <w:pPr>
-              <w:pStyle w:val="user4"/>
+              <w:pStyle w:val="Style16"/>
               <w:spacing w:lineRule="auto" w:line="240"/>
               <w:ind w:hanging="0" w:left="0"/>
               <w:rPr/>
@@ -1011,7 +1011,7 @@
           </w:tcPr>
           <w:p>
             <w:pPr>
-              <w:pStyle w:val="user4"/>
+              <w:pStyle w:val="Style16"/>
               <w:spacing w:lineRule="auto" w:line="240"/>
               <w:ind w:hanging="0" w:left="0"/>
               <w:rPr/>
@@ -1033,7 +1033,7 @@
           </w:tcPr>
           <w:p>
             <w:pPr>
-              <w:pStyle w:val="user4"/>
+              <w:pStyle w:val="Style16"/>
               <w:spacing w:lineRule="auto" w:line="240"/>
               <w:ind w:hanging="0" w:left="0"/>
               <w:rPr/>
@@ -1056,7 +1056,7 @@
           </w:tcPr>
           <w:p>
             <w:pPr>
-              <w:pStyle w:val="user4"/>
+              <w:pStyle w:val="Style16"/>
               <w:spacing w:lineRule="auto" w:line="240"/>
               <w:ind w:hanging="0" w:left="0"/>
               <w:rPr/>
@@ -1078,7 +1078,7 @@
           </w:tcPr>
           <w:p>
             <w:pPr>
-              <w:pStyle w:val="user4"/>
+              <w:pStyle w:val="Style16"/>
               <w:spacing w:lineRule="auto" w:line="240"/>
               <w:ind w:hanging="0" w:left="0"/>
               <w:rPr/>
@@ -1101,7 +1101,7 @@
           </w:tcPr>
           <w:p>
             <w:pPr>
-              <w:pStyle w:val="user4"/>
+              <w:pStyle w:val="Style16"/>
               <w:spacing w:lineRule="auto" w:line="240"/>
               <w:ind w:hanging="0" w:left="0"/>
               <w:rPr/>
@@ -1123,7 +1123,7 @@
           </w:tcPr>
           <w:p>
             <w:pPr>
-              <w:pStyle w:val="user4"/>
+              <w:pStyle w:val="Style16"/>
               <w:spacing w:lineRule="auto" w:line="240"/>
               <w:ind w:hanging="0" w:left="0"/>
               <w:rPr/>
@@ -1146,7 +1146,7 @@
           </w:tcPr>
           <w:p>
             <w:pPr>
-              <w:pStyle w:val="user4"/>
+              <w:pStyle w:val="Style16"/>
               <w:spacing w:lineRule="auto" w:line="240"/>
               <w:ind w:hanging="0" w:left="0"/>
               <w:rPr/>
@@ -1168,7 +1168,7 @@
           </w:tcPr>
           <w:p>
             <w:pPr>
-              <w:pStyle w:val="user4"/>
+              <w:pStyle w:val="Style16"/>
               <w:spacing w:lineRule="auto" w:line="240"/>
               <w:ind w:hanging="0" w:left="0"/>
               <w:rPr/>
@@ -1715,7 +1715,7 @@
           </w:tcPr>
           <w:p>
             <w:pPr>
-              <w:pStyle w:val="user4"/>
+              <w:pStyle w:val="Style16"/>
               <w:ind w:hanging="0" w:left="0"/>
               <w:rPr/>
             </w:pPr>
@@ -1737,7 +1737,7 @@
           </w:tcPr>
           <w:p>
             <w:pPr>
-              <w:pStyle w:val="user4"/>
+              <w:pStyle w:val="Style16"/>
               <w:ind w:hanging="0" w:left="0"/>
               <w:rPr/>
             </w:pPr>
@@ -1788,7 +1788,7 @@
           </w:tcPr>
           <w:p>
             <w:pPr>
-              <w:pStyle w:val="user4"/>
+              <w:pStyle w:val="Style16"/>
               <w:ind w:hanging="0" w:left="0"/>
               <w:rPr/>
             </w:pPr>
@@ -1810,7 +1810,7 @@
           </w:tcPr>
           <w:p>
             <w:pPr>
-              <w:pStyle w:val="user4"/>
+              <w:pStyle w:val="Style16"/>
               <w:ind w:hanging="0" w:left="0"/>
               <w:rPr/>
             </w:pPr>
@@ -3062,7 +3062,7 @@
           </w:tcPr>
           <w:p>
             <w:pPr>
-              <w:pStyle w:val="user4"/>
+              <w:pStyle w:val="Style16"/>
               <w:spacing w:lineRule="auto" w:line="240"/>
               <w:ind w:hanging="0" w:left="0"/>
               <w:rPr>
@@ -3091,7 +3091,7 @@
           </w:tcPr>
           <w:p>
             <w:pPr>
-              <w:pStyle w:val="user4"/>
+              <w:pStyle w:val="Style16"/>
               <w:spacing w:lineRule="auto" w:line="240"/>
               <w:ind w:hanging="0" w:left="0"/>
               <w:rPr>
@@ -3121,7 +3121,7 @@
           </w:tcPr>
           <w:p>
             <w:pPr>
-              <w:pStyle w:val="user4"/>
+              <w:pStyle w:val="Style16"/>
               <w:spacing w:lineRule="auto" w:line="240"/>
               <w:ind w:hanging="0" w:left="0"/>
               <w:rPr/>
@@ -3143,7 +3143,7 @@
           </w:tcPr>
           <w:p>
             <w:pPr>
-              <w:pStyle w:val="user4"/>
+              <w:pStyle w:val="Style16"/>
               <w:spacing w:lineRule="auto" w:line="240"/>
               <w:ind w:hanging="0" w:left="0"/>
               <w:rPr/>
@@ -3167,7 +3167,7 @@
           </w:tcPr>
           <w:p>
             <w:pPr>
-              <w:pStyle w:val="user4"/>
+              <w:pStyle w:val="Style16"/>
               <w:spacing w:lineRule="auto" w:line="240"/>
               <w:ind w:hanging="0" w:left="0"/>
               <w:rPr/>
@@ -3189,7 +3189,7 @@
           </w:tcPr>
           <w:p>
             <w:pPr>
-              <w:pStyle w:val="user4"/>
+              <w:pStyle w:val="Style16"/>
               <w:spacing w:lineRule="auto" w:line="240"/>
               <w:ind w:hanging="0" w:left="0"/>
               <w:rPr/>
@@ -3213,7 +3213,7 @@
           </w:tcPr>
           <w:p>
             <w:pPr>
-              <w:pStyle w:val="user4"/>
+              <w:pStyle w:val="Style16"/>
               <w:spacing w:lineRule="auto" w:line="240"/>
               <w:ind w:hanging="0" w:left="0"/>
               <w:rPr/>
@@ -3235,7 +3235,7 @@
           </w:tcPr>
           <w:p>
             <w:pPr>
-              <w:pStyle w:val="user4"/>
+              <w:pStyle w:val="Style16"/>
               <w:spacing w:lineRule="auto" w:line="240"/>
               <w:ind w:hanging="0" w:left="0"/>
               <w:rPr/>
@@ -3259,7 +3259,7 @@
           </w:tcPr>
           <w:p>
             <w:pPr>
-              <w:pStyle w:val="user4"/>
+              <w:pStyle w:val="Style16"/>
               <w:spacing w:lineRule="auto" w:line="240"/>
               <w:ind w:hanging="0" w:left="0"/>
               <w:rPr/>
@@ -3281,7 +3281,7 @@
           </w:tcPr>
           <w:p>
             <w:pPr>
-              <w:pStyle w:val="user4"/>
+              <w:pStyle w:val="Style16"/>
               <w:spacing w:lineRule="auto" w:line="240"/>
               <w:ind w:hanging="0" w:left="0"/>
               <w:rPr/>
@@ -3305,7 +3305,7 @@
           </w:tcPr>
           <w:p>
             <w:pPr>
-              <w:pStyle w:val="user4"/>
+              <w:pStyle w:val="Style16"/>
               <w:spacing w:lineRule="auto" w:line="240"/>
               <w:ind w:hanging="0" w:left="0"/>
               <w:rPr/>
@@ -3327,7 +3327,7 @@
           </w:tcPr>
           <w:p>
             <w:pPr>
-              <w:pStyle w:val="user4"/>
+              <w:pStyle w:val="Style16"/>
               <w:spacing w:lineRule="auto" w:line="240"/>
               <w:ind w:hanging="0" w:left="0"/>
               <w:rPr/>
@@ -3725,14 +3725,14 @@
         </w:tblCellMar>
       </w:tblPr>
       <w:tblGrid>
-        <w:gridCol w:w="3459"/>
-        <w:gridCol w:w="4651"/>
+        <w:gridCol w:w="3458"/>
+        <w:gridCol w:w="4652"/>
       </w:tblGrid>
       <w:tr>
         <w:trPr/>
         <w:tc>
           <w:tcPr>
-            <w:tcW w:w="3459" w:type="dxa"/>
+            <w:tcW w:w="3458" w:type="dxa"/>
             <w:tcBorders>
               <w:top w:val="single" w:sz="4" w:space="0" w:color="000000"/>
               <w:left w:val="single" w:sz="4" w:space="0" w:color="000000"/>
@@ -3741,7 +3741,7 @@
           </w:tcPr>
           <w:p>
             <w:pPr>
-              <w:pStyle w:val="user4"/>
+              <w:pStyle w:val="Style16"/>
               <w:spacing w:lineRule="auto" w:line="240"/>
               <w:ind w:hanging="0" w:left="0"/>
               <w:rPr>
@@ -3760,7 +3760,7 @@
         </w:tc>
         <w:tc>
           <w:tcPr>
-            <w:tcW w:w="4651" w:type="dxa"/>
+            <w:tcW w:w="4652" w:type="dxa"/>
             <w:tcBorders>
               <w:top w:val="single" w:sz="4" w:space="0" w:color="000000"/>
               <w:left w:val="single" w:sz="4" w:space="0" w:color="000000"/>
@@ -3770,7 +3770,7 @@
           </w:tcPr>
           <w:p>
             <w:pPr>
-              <w:pStyle w:val="user4"/>
+              <w:pStyle w:val="Style16"/>
               <w:spacing w:lineRule="auto" w:line="240"/>
               <w:ind w:hanging="0" w:left="0"/>
               <w:rPr>
@@ -3792,7 +3792,7 @@
         <w:trPr/>
         <w:tc>
           <w:tcPr>
-            <w:tcW w:w="3459" w:type="dxa"/>
+            <w:tcW w:w="3458" w:type="dxa"/>
             <w:tcBorders>
               <w:left w:val="single" w:sz="4" w:space="0" w:color="000000"/>
               <w:bottom w:val="single" w:sz="4" w:space="0" w:color="000000"/>
@@ -3800,7 +3800,7 @@
           </w:tcPr>
           <w:p>
             <w:pPr>
-              <w:pStyle w:val="user4"/>
+              <w:pStyle w:val="Style16"/>
               <w:spacing w:lineRule="auto" w:line="240"/>
               <w:ind w:hanging="0" w:left="0"/>
               <w:rPr/>
@@ -3813,7 +3813,7 @@
         </w:tc>
         <w:tc>
           <w:tcPr>
-            <w:tcW w:w="4651" w:type="dxa"/>
+            <w:tcW w:w="4652" w:type="dxa"/>
             <w:tcBorders>
               <w:left w:val="single" w:sz="4" w:space="0" w:color="000000"/>
               <w:bottom w:val="single" w:sz="4" w:space="0" w:color="000000"/>
@@ -3822,7 +3822,7 @@
           </w:tcPr>
           <w:p>
             <w:pPr>
-              <w:pStyle w:val="user4"/>
+              <w:pStyle w:val="Style16"/>
               <w:spacing w:lineRule="auto" w:line="240"/>
               <w:ind w:hanging="0" w:left="0"/>
               <w:rPr/>
@@ -3838,7 +3838,7 @@
         <w:trPr/>
         <w:tc>
           <w:tcPr>
-            <w:tcW w:w="3459" w:type="dxa"/>
+            <w:tcW w:w="3458" w:type="dxa"/>
             <w:tcBorders>
               <w:left w:val="single" w:sz="4" w:space="0" w:color="000000"/>
               <w:bottom w:val="single" w:sz="4" w:space="0" w:color="000000"/>
@@ -3846,7 +3846,7 @@
           </w:tcPr>
           <w:p>
             <w:pPr>
-              <w:pStyle w:val="user4"/>
+              <w:pStyle w:val="Style16"/>
               <w:spacing w:lineRule="auto" w:line="240"/>
               <w:ind w:hanging="0" w:left="0"/>
               <w:rPr/>
@@ -3859,7 +3859,7 @@
         </w:tc>
         <w:tc>
           <w:tcPr>
-            <w:tcW w:w="4651" w:type="dxa"/>
+            <w:tcW w:w="4652" w:type="dxa"/>
             <w:tcBorders>
               <w:left w:val="single" w:sz="4" w:space="0" w:color="000000"/>
               <w:bottom w:val="single" w:sz="4" w:space="0" w:color="000000"/>
@@ -3868,7 +3868,7 @@
           </w:tcPr>
           <w:p>
             <w:pPr>
-              <w:pStyle w:val="user4"/>
+              <w:pStyle w:val="Style16"/>
               <w:spacing w:lineRule="auto" w:line="240"/>
               <w:ind w:hanging="0" w:left="0"/>
               <w:rPr/>
@@ -3884,7 +3884,7 @@
         <w:trPr/>
         <w:tc>
           <w:tcPr>
-            <w:tcW w:w="3459" w:type="dxa"/>
+            <w:tcW w:w="3458" w:type="dxa"/>
             <w:tcBorders>
               <w:left w:val="single" w:sz="4" w:space="0" w:color="000000"/>
               <w:bottom w:val="single" w:sz="4" w:space="0" w:color="000000"/>
@@ -3892,7 +3892,7 @@
           </w:tcPr>
           <w:p>
             <w:pPr>
-              <w:pStyle w:val="user4"/>
+              <w:pStyle w:val="Style16"/>
               <w:spacing w:lineRule="auto" w:line="240"/>
               <w:ind w:hanging="0" w:left="0"/>
               <w:rPr/>
@@ -3905,7 +3905,7 @@
         </w:tc>
         <w:tc>
           <w:tcPr>
-            <w:tcW w:w="4651" w:type="dxa"/>
+            <w:tcW w:w="4652" w:type="dxa"/>
             <w:tcBorders>
               <w:left w:val="single" w:sz="4" w:space="0" w:color="000000"/>
               <w:bottom w:val="single" w:sz="4" w:space="0" w:color="000000"/>
@@ -3914,7 +3914,7 @@
           </w:tcPr>
           <w:p>
             <w:pPr>
-              <w:pStyle w:val="user4"/>
+              <w:pStyle w:val="Style16"/>
               <w:spacing w:lineRule="auto" w:line="240"/>
               <w:ind w:hanging="0" w:left="0"/>
               <w:rPr/>
@@ -3966,7 +3966,7 @@
           </w:tcPr>
           <w:p>
             <w:pPr>
-              <w:pStyle w:val="user4"/>
+              <w:pStyle w:val="Style16"/>
               <w:spacing w:lineRule="auto" w:line="240"/>
               <w:ind w:hanging="0" w:left="0"/>
               <w:rPr>
@@ -3995,7 +3995,7 @@
           </w:tcPr>
           <w:p>
             <w:pPr>
-              <w:pStyle w:val="user4"/>
+              <w:pStyle w:val="Style16"/>
               <w:spacing w:lineRule="auto" w:line="240"/>
               <w:ind w:hanging="0" w:left="0"/>
               <w:rPr>
@@ -4025,7 +4025,7 @@
           </w:tcPr>
           <w:p>
             <w:pPr>
-              <w:pStyle w:val="user4"/>
+              <w:pStyle w:val="Style16"/>
               <w:spacing w:lineRule="auto" w:line="240"/>
               <w:ind w:hanging="0" w:left="0"/>
               <w:rPr/>
@@ -4047,7 +4047,7 @@
           </w:tcPr>
           <w:p>
             <w:pPr>
-              <w:pStyle w:val="user4"/>
+              <w:pStyle w:val="Style16"/>
               <w:spacing w:lineRule="auto" w:line="240"/>
               <w:ind w:hanging="0" w:left="0"/>
               <w:rPr/>
@@ -4071,7 +4071,7 @@
           </w:tcPr>
           <w:p>
             <w:pPr>
-              <w:pStyle w:val="user4"/>
+              <w:pStyle w:val="Style16"/>
               <w:spacing w:lineRule="auto" w:line="240"/>
               <w:ind w:hanging="0" w:left="0"/>
               <w:rPr/>
@@ -4093,7 +4093,7 @@
           </w:tcPr>
           <w:p>
             <w:pPr>
-              <w:pStyle w:val="user4"/>
+              <w:pStyle w:val="Style16"/>
               <w:spacing w:lineRule="auto" w:line="240"/>
               <w:ind w:hanging="0" w:left="0"/>
               <w:rPr/>
@@ -4117,7 +4117,7 @@
           </w:tcPr>
           <w:p>
             <w:pPr>
-              <w:pStyle w:val="user4"/>
+              <w:pStyle w:val="Style16"/>
               <w:spacing w:lineRule="auto" w:line="240"/>
               <w:ind w:hanging="0" w:left="0"/>
               <w:rPr/>
@@ -4139,7 +4139,7 @@
           </w:tcPr>
           <w:p>
             <w:pPr>
-              <w:pStyle w:val="user4"/>
+              <w:pStyle w:val="Style16"/>
               <w:spacing w:lineRule="auto" w:line="240"/>
               <w:ind w:hanging="0" w:left="0"/>
               <w:rPr/>
@@ -5319,6 +5319,16 @@
     </w:p>
     <w:p>
       <w:pPr>
+        <w:pStyle w:val="H3"/>
+        <w:rPr/>
+      </w:pPr>
+      <w:r>
+        <w:rPr/>
+        <w:t>Глосарій (15 термінів)</w:t>
+      </w:r>
+    </w:p>
+    <w:p>
+      <w:pPr>
         <w:pStyle w:val="P1"/>
         <w:widowControl/>
         <w:suppressAutoHyphens w:val="true"/>
@@ -5334,26 +5344,6 @@
         <w:rPr>
           <w:lang w:val="uk-UA"/>
         </w:rPr>
-      </w:r>
-    </w:p>
-    <w:p>
-      <w:pPr>
-        <w:pStyle w:val="P1"/>
-        <w:widowControl/>
-        <w:suppressAutoHyphens w:val="true"/>
-        <w:bidi w:val="0"/>
-        <w:spacing w:lineRule="auto" w:line="360" w:before="0" w:after="0"/>
-        <w:ind w:firstLine="850" w:left="0" w:right="0"/>
-        <w:jc w:val="both"/>
-        <w:rPr>
-          <w:lang w:val="uk-UA"/>
-        </w:rPr>
-      </w:pPr>
-      <w:r>
-        <w:rPr>
-          <w:lang w:val="uk-UA"/>
-        </w:rPr>
-        <w:t>Глосарій (15 термінів)</w:t>
       </w:r>
     </w:p>
     <w:p>
@@ -5364,6 +5354,414 @@
           <w:ilvl w:val="0"/>
           <w:numId w:val="25"/>
         </w:numPr>
+        <w:suppressAutoHyphens w:val="true"/>
+        <w:bidi w:val="0"/>
+        <w:spacing w:lineRule="auto" w:line="360" w:before="0" w:after="0"/>
+        <w:ind w:firstLine="850" w:left="0" w:right="0"/>
+        <w:jc w:val="both"/>
+        <w:rPr>
+          <w:lang w:val="uk-UA"/>
+        </w:rPr>
+      </w:pPr>
+      <w:r>
+        <w:rPr>
+          <w:lang w:val="uk-UA"/>
+        </w:rPr>
+        <w:t>психологія — наука, що вивчає поведінку людини.</w:t>
+      </w:r>
+    </w:p>
+    <w:p>
+      <w:pPr>
+        <w:pStyle w:val="P1"/>
+        <w:widowControl/>
+        <w:numPr>
+          <w:ilvl w:val="0"/>
+          <w:numId w:val="25"/>
+        </w:numPr>
+        <w:suppressAutoHyphens w:val="true"/>
+        <w:bidi w:val="0"/>
+        <w:spacing w:lineRule="auto" w:line="360" w:before="0" w:after="0"/>
+        <w:ind w:firstLine="850" w:left="0" w:right="0"/>
+        <w:jc w:val="both"/>
+        <w:rPr>
+          <w:lang w:val="uk-UA"/>
+        </w:rPr>
+      </w:pPr>
+      <w:r>
+        <w:rPr>
+          <w:lang w:val="uk-UA"/>
+        </w:rPr>
+        <w:t>кар’єра — процес професійного становлення людини.</w:t>
+      </w:r>
+    </w:p>
+    <w:p>
+      <w:pPr>
+        <w:pStyle w:val="P1"/>
+        <w:widowControl/>
+        <w:numPr>
+          <w:ilvl w:val="0"/>
+          <w:numId w:val="25"/>
+        </w:numPr>
+        <w:suppressAutoHyphens w:val="true"/>
+        <w:bidi w:val="0"/>
+        <w:spacing w:lineRule="auto" w:line="360" w:before="0" w:after="0"/>
+        <w:ind w:firstLine="850" w:left="0" w:right="0"/>
+        <w:jc w:val="both"/>
+        <w:rPr>
+          <w:lang w:val="uk-UA"/>
+        </w:rPr>
+      </w:pPr>
+      <w:r>
+        <w:rPr>
+          <w:lang w:val="uk-UA"/>
+        </w:rPr>
+        <w:t>кар’єрна модель — схема професійного зростання людини.</w:t>
+      </w:r>
+    </w:p>
+    <w:p>
+      <w:pPr>
+        <w:pStyle w:val="P1"/>
+        <w:widowControl/>
+        <w:numPr>
+          <w:ilvl w:val="0"/>
+          <w:numId w:val="25"/>
+        </w:numPr>
+        <w:suppressAutoHyphens w:val="true"/>
+        <w:bidi w:val="0"/>
+        <w:spacing w:lineRule="auto" w:line="360" w:before="0" w:after="0"/>
+        <w:ind w:firstLine="850" w:left="0" w:right="0"/>
+        <w:jc w:val="both"/>
+        <w:rPr>
+          <w:lang w:val="uk-UA"/>
+        </w:rPr>
+      </w:pPr>
+      <w:r>
+        <w:rPr>
+          <w:lang w:val="uk-UA"/>
+        </w:rPr>
+        <w:t>психологічний чинник — процес, що впливає на рішення.</w:t>
+      </w:r>
+    </w:p>
+    <w:p>
+      <w:pPr>
+        <w:pStyle w:val="P1"/>
+        <w:widowControl/>
+        <w:numPr>
+          <w:ilvl w:val="0"/>
+          <w:numId w:val="25"/>
+        </w:numPr>
+        <w:suppressAutoHyphens w:val="true"/>
+        <w:bidi w:val="0"/>
+        <w:spacing w:lineRule="auto" w:line="360" w:before="0" w:after="0"/>
+        <w:ind w:firstLine="850" w:left="0" w:right="0"/>
+        <w:jc w:val="both"/>
+        <w:rPr>
+          <w:lang w:val="uk-UA"/>
+        </w:rPr>
+      </w:pPr>
+      <w:r>
+        <w:rPr>
+          <w:lang w:val="uk-UA"/>
+        </w:rPr>
+        <w:t>психологія кар’єри — галузь психологічної науки, яка вивчає закономірності становлення, розвитку та реалізації людини у професійній сфері.</w:t>
+      </w:r>
+    </w:p>
+    <w:p>
+      <w:pPr>
+        <w:pStyle w:val="P1"/>
+        <w:widowControl/>
+        <w:numPr>
+          <w:ilvl w:val="0"/>
+          <w:numId w:val="25"/>
+        </w:numPr>
+        <w:suppressAutoHyphens w:val="true"/>
+        <w:bidi w:val="0"/>
+        <w:spacing w:lineRule="auto" w:line="360" w:before="0" w:after="0"/>
+        <w:ind w:firstLine="850" w:left="0" w:right="0"/>
+        <w:jc w:val="both"/>
+        <w:rPr>
+          <w:lang w:val="uk-UA"/>
+        </w:rPr>
+      </w:pPr>
+      <w:r>
+        <w:rPr>
+          <w:lang w:val="uk-UA"/>
+        </w:rPr>
+        <w:t>бар’єр — перешкода, що ускладнює чи зупиняє шлях до досягнення мети.</w:t>
+      </w:r>
+    </w:p>
+    <w:p>
+      <w:pPr>
+        <w:pStyle w:val="P1"/>
+        <w:widowControl/>
+        <w:numPr>
+          <w:ilvl w:val="0"/>
+          <w:numId w:val="25"/>
+        </w:numPr>
+        <w:suppressAutoHyphens w:val="true"/>
+        <w:bidi w:val="0"/>
+        <w:spacing w:lineRule="auto" w:line="360" w:before="0" w:after="0"/>
+        <w:ind w:firstLine="850" w:left="0" w:right="0"/>
+        <w:jc w:val="both"/>
+        <w:rPr>
+          <w:lang w:val="uk-UA"/>
+        </w:rPr>
+      </w:pPr>
+      <w:r>
+        <w:rPr>
+          <w:lang w:val="uk-UA"/>
+        </w:rPr>
+        <w:t>мотив — намір щось зробити.</w:t>
+      </w:r>
+    </w:p>
+    <w:p>
+      <w:pPr>
+        <w:pStyle w:val="P1"/>
+        <w:widowControl/>
+        <w:numPr>
+          <w:ilvl w:val="0"/>
+          <w:numId w:val="25"/>
+        </w:numPr>
+        <w:suppressAutoHyphens w:val="true"/>
+        <w:bidi w:val="0"/>
+        <w:spacing w:lineRule="auto" w:line="360" w:before="0" w:after="0"/>
+        <w:ind w:firstLine="850" w:left="0" w:right="0"/>
+        <w:jc w:val="both"/>
+        <w:rPr>
+          <w:lang w:val="uk-UA"/>
+        </w:rPr>
+      </w:pPr>
+      <w:r>
+        <w:rPr>
+          <w:lang w:val="uk-UA"/>
+        </w:rPr>
+        <w:t>синдром самозванця — відчуття власної некомпетентності</w:t>
+      </w:r>
+    </w:p>
+    <w:p>
+      <w:pPr>
+        <w:pStyle w:val="P1"/>
+        <w:widowControl/>
+        <w:numPr>
+          <w:ilvl w:val="0"/>
+          <w:numId w:val="25"/>
+        </w:numPr>
+        <w:suppressAutoHyphens w:val="true"/>
+        <w:bidi w:val="0"/>
+        <w:spacing w:lineRule="auto" w:line="360" w:before="0" w:after="0"/>
+        <w:ind w:firstLine="850" w:left="0" w:right="0"/>
+        <w:jc w:val="both"/>
+        <w:rPr>
+          <w:lang w:val="uk-UA"/>
+        </w:rPr>
+      </w:pPr>
+      <w:r>
+        <w:rPr>
+          <w:lang w:val="uk-UA"/>
+        </w:rPr>
+        <w:t>калейдоскопічна кар’єра — гнучка зміна кар’єри відповідно до талантів, навичок.</w:t>
+      </w:r>
+    </w:p>
+    <w:p>
+      <w:pPr>
+        <w:pStyle w:val="P1"/>
+        <w:widowControl/>
+        <w:numPr>
+          <w:ilvl w:val="0"/>
+          <w:numId w:val="25"/>
+        </w:numPr>
+        <w:suppressAutoHyphens w:val="true"/>
+        <w:bidi w:val="0"/>
+        <w:spacing w:lineRule="auto" w:line="360" w:before="0" w:after="0"/>
+        <w:ind w:firstLine="850" w:left="0" w:right="0"/>
+        <w:jc w:val="both"/>
+        <w:rPr>
+          <w:lang w:val="uk-UA"/>
+        </w:rPr>
+      </w:pPr>
+      <w:r>
+        <w:rPr>
+          <w:lang w:val="uk-UA"/>
+        </w:rPr>
+        <w:t>множинна ідентичність — наявність у людині кількох соціальних чи професійних ролей.</w:t>
+      </w:r>
+    </w:p>
+    <w:p>
+      <w:pPr>
+        <w:pStyle w:val="P1"/>
+        <w:widowControl/>
+        <w:numPr>
+          <w:ilvl w:val="0"/>
+          <w:numId w:val="25"/>
+        </w:numPr>
+        <w:suppressAutoHyphens w:val="true"/>
+        <w:bidi w:val="0"/>
+        <w:spacing w:lineRule="auto" w:line="360" w:before="0" w:after="0"/>
+        <w:ind w:firstLine="850" w:left="0" w:right="0"/>
+        <w:jc w:val="both"/>
+        <w:rPr>
+          <w:lang w:val="uk-UA"/>
+        </w:rPr>
+      </w:pPr>
+      <w:r>
+        <w:rPr>
+          <w:lang w:val="uk-UA"/>
+        </w:rPr>
+        <w:t>цифрова економіка — система економічної діяльності, яка використовує сучасні цифрові технології.</w:t>
+      </w:r>
+    </w:p>
+    <w:p>
+      <w:pPr>
+        <w:pStyle w:val="P1"/>
+        <w:widowControl/>
+        <w:numPr>
+          <w:ilvl w:val="0"/>
+          <w:numId w:val="25"/>
+        </w:numPr>
+        <w:suppressAutoHyphens w:val="true"/>
+        <w:bidi w:val="0"/>
+        <w:spacing w:lineRule="auto" w:line="360" w:before="0" w:after="0"/>
+        <w:ind w:firstLine="850" w:left="0" w:right="0"/>
+        <w:jc w:val="both"/>
+        <w:rPr>
+          <w:lang w:val="uk-UA"/>
+        </w:rPr>
+      </w:pPr>
+      <w:r>
+        <w:rPr>
+          <w:lang w:val="uk-UA"/>
+        </w:rPr>
+        <w:t>вертикальна кар’єра — професійне зростання шляхом переходу на вищі посади.</w:t>
+      </w:r>
+    </w:p>
+    <w:p>
+      <w:pPr>
+        <w:pStyle w:val="P1"/>
+        <w:widowControl/>
+        <w:numPr>
+          <w:ilvl w:val="0"/>
+          <w:numId w:val="25"/>
+        </w:numPr>
+        <w:suppressAutoHyphens w:val="true"/>
+        <w:bidi w:val="0"/>
+        <w:spacing w:lineRule="auto" w:line="360" w:before="0" w:after="0"/>
+        <w:ind w:firstLine="850" w:left="0" w:right="0"/>
+        <w:jc w:val="both"/>
+        <w:rPr>
+          <w:lang w:val="uk-UA"/>
+        </w:rPr>
+      </w:pPr>
+      <w:r>
+        <w:rPr>
+          <w:lang w:val="uk-UA"/>
+        </w:rPr>
+        <w:t>горизонтальна кар’єра — професійний розвиток шляхом зміни сфер.</w:t>
+      </w:r>
+    </w:p>
+    <w:p>
+      <w:pPr>
+        <w:pStyle w:val="P1"/>
+        <w:widowControl/>
+        <w:numPr>
+          <w:ilvl w:val="0"/>
+          <w:numId w:val="25"/>
+        </w:numPr>
+        <w:suppressAutoHyphens w:val="true"/>
+        <w:bidi w:val="0"/>
+        <w:spacing w:lineRule="auto" w:line="360" w:before="0" w:after="0"/>
+        <w:ind w:firstLine="850" w:left="0" w:right="0"/>
+        <w:jc w:val="both"/>
+        <w:rPr>
+          <w:lang w:val="uk-UA"/>
+        </w:rPr>
+      </w:pPr>
+      <w:r>
+        <w:rPr>
+          <w:lang w:val="uk-UA"/>
+        </w:rPr>
+        <w:t>об’єктивна кар’єра — видимі зміни посад, зарплат, організацій.</w:t>
+      </w:r>
+    </w:p>
+    <w:p>
+      <w:pPr>
+        <w:pStyle w:val="P1"/>
+        <w:widowControl/>
+        <w:numPr>
+          <w:ilvl w:val="0"/>
+          <w:numId w:val="25"/>
+        </w:numPr>
+        <w:suppressAutoHyphens w:val="true"/>
+        <w:bidi w:val="0"/>
+        <w:spacing w:lineRule="auto" w:line="360" w:before="0" w:after="0"/>
+        <w:ind w:firstLine="850" w:left="0" w:right="0"/>
+        <w:jc w:val="both"/>
+        <w:rPr>
+          <w:lang w:val="uk-UA"/>
+        </w:rPr>
+      </w:pPr>
+      <w:r>
+        <w:rPr>
+          <w:lang w:val="uk-UA"/>
+        </w:rPr>
+        <w:t>суб’єктивна кар’єра — внутрішнє переживання власного шляху.</w:t>
+      </w:r>
+    </w:p>
+    <w:p>
+      <w:pPr>
+        <w:pStyle w:val="P1"/>
+        <w:widowControl/>
+        <w:suppressAutoHyphens w:val="true"/>
+        <w:bidi w:val="0"/>
+        <w:spacing w:lineRule="auto" w:line="360" w:before="0" w:after="0"/>
+        <w:ind w:firstLine="850" w:left="0" w:right="0"/>
+        <w:jc w:val="both"/>
+        <w:rPr>
+          <w:lang w:val="uk-UA"/>
+        </w:rPr>
+      </w:pPr>
+      <w:r>
+        <w:rPr>
+          <w:lang w:val="uk-UA"/>
+        </w:rPr>
+      </w:r>
+    </w:p>
+    <w:p>
+      <w:pPr>
+        <w:pStyle w:val="H3"/>
+        <w:rPr/>
+      </w:pPr>
+      <w:r>
+        <w:rPr/>
+        <w:t>Есе на тему «</w:t>
+      </w:r>
+      <w:r>
+        <w:rPr/>
+        <w:t>Якою буде моя професія у 2035 році»</w:t>
+      </w:r>
+    </w:p>
+    <w:p>
+      <w:pPr>
+        <w:pStyle w:val="P1"/>
+        <w:widowControl/>
+        <w:suppressAutoHyphens w:val="true"/>
+        <w:bidi w:val="0"/>
+        <w:spacing w:lineRule="auto" w:line="360" w:before="0" w:after="0"/>
+        <w:ind w:firstLine="850" w:left="0" w:right="0"/>
+        <w:jc w:val="both"/>
+        <w:rPr>
+          <w:lang w:val="uk-UA"/>
+        </w:rPr>
+      </w:pPr>
+      <w:r>
+        <w:rPr>
+          <w:lang w:val="uk-UA"/>
+        </w:rPr>
+      </w:r>
+    </w:p>
+    <w:p>
+      <w:pPr>
+        <w:pStyle w:val="P1"/>
+        <w:widowControl/>
         <w:suppressAutoHyphens w:val="true"/>
         <w:bidi w:val="0"/>
         <w:spacing w:lineRule="auto" w:line="360" w:before="0" w:after="0"/>
@@ -9688,24 +10086,24 @@
       <w:lang w:val="en-US" w:eastAsia="uk-UA"/>
     </w:rPr>
   </w:style>
+  <w:style w:type="character" w:styleId="user">
+    <w:name w:val="Символ нумерації (user)"/>
+    <w:qFormat/>
+    <w:rPr/>
+  </w:style>
   <w:style w:type="character" w:styleId="Style12">
     <w:name w:val="Символ нумерації"/>
     <w:qFormat/>
     <w:rPr/>
   </w:style>
-  <w:style w:type="character" w:styleId="user">
-    <w:name w:val="Символ нумерації (user)"/>
-    <w:qFormat/>
-    <w:rPr/>
-  </w:style>
-  <w:style w:type="character" w:styleId="user1">
-    <w:name w:val="Маркери (user)"/>
+  <w:style w:type="character" w:styleId="Style13">
+    <w:name w:val="Маркери"/>
     <w:qFormat/>
     <w:rPr>
       <w:rFonts w:ascii="OpenSymbol" w:hAnsi="OpenSymbol" w:eastAsia="OpenSymbol" w:cs="OpenSymbol"/>
     </w:rPr>
   </w:style>
-  <w:style w:type="paragraph" w:styleId="Style13">
+  <w:style w:type="paragraph" w:styleId="Style14">
     <w:name w:val="Заголовок"/>
     <w:basedOn w:val="Normal"/>
     <w:next w:val="BodyText"/>
@@ -9715,7 +10113,7 @@
       <w:spacing w:before="240" w:after="120"/>
     </w:pPr>
     <w:rPr>
-      <w:rFonts w:ascii="Liberation Sans" w:hAnsi="Liberation Sans" w:eastAsia="Microsoft YaHei" w:cs="Lucida Sans"/>
+      <w:rFonts w:ascii="Liberation Sans" w:hAnsi="Liberation Sans" w:eastAsia="Microsoft YaHei" w:cs="Arial Unicode MS"/>
       <w:sz w:val="28"/>
       <w:szCs w:val="28"/>
     </w:rPr>
@@ -9752,8 +10150,34 @@
       <w:szCs w:val="24"/>
     </w:rPr>
   </w:style>
-  <w:style w:type="paragraph" w:styleId="Style14">
+  <w:style w:type="paragraph" w:styleId="Style15">
     <w:name w:val="Покажчик"/>
+    <w:basedOn w:val="Normal"/>
+    <w:qFormat/>
+    <w:pPr>
+      <w:suppressLineNumbers/>
+    </w:pPr>
+    <w:rPr>
+      <w:rFonts w:cs="Arial Unicode MS"/>
+    </w:rPr>
+  </w:style>
+  <w:style w:type="paragraph" w:styleId="user1">
+    <w:name w:val="Заголовок (user)"/>
+    <w:basedOn w:val="Normal"/>
+    <w:next w:val="BodyText"/>
+    <w:qFormat/>
+    <w:pPr>
+      <w:keepNext w:val="true"/>
+      <w:spacing w:before="240" w:after="120"/>
+    </w:pPr>
+    <w:rPr>
+      <w:rFonts w:ascii="Liberation Sans" w:hAnsi="Liberation Sans" w:eastAsia="Microsoft YaHei" w:cs="Lucida Sans"/>
+      <w:sz w:val="28"/>
+      <w:szCs w:val="28"/>
+    </w:rPr>
+  </w:style>
+  <w:style w:type="paragraph" w:styleId="user2">
+    <w:name w:val="Покажчик (user)"/>
     <w:basedOn w:val="Normal"/>
     <w:qFormat/>
     <w:pPr>
@@ -9763,35 +10187,9 @@
       <w:rFonts w:cs="Lucida Sans"/>
     </w:rPr>
   </w:style>
-  <w:style w:type="paragraph" w:styleId="user2">
-    <w:name w:val="Заголовок (user)"/>
-    <w:basedOn w:val="Normal"/>
-    <w:next w:val="BodyText"/>
-    <w:qFormat/>
-    <w:pPr>
-      <w:keepNext w:val="true"/>
-      <w:spacing w:before="240" w:after="120"/>
-    </w:pPr>
-    <w:rPr>
-      <w:rFonts w:ascii="Liberation Sans" w:hAnsi="Liberation Sans" w:eastAsia="Microsoft YaHei" w:cs="Arial Unicode MS"/>
-      <w:sz w:val="28"/>
-      <w:szCs w:val="28"/>
-    </w:rPr>
-  </w:style>
-  <w:style w:type="paragraph" w:styleId="user3">
-    <w:name w:val="Покажчик (user)"/>
-    <w:basedOn w:val="Normal"/>
-    <w:qFormat/>
-    <w:pPr>
-      <w:suppressLineNumbers/>
-    </w:pPr>
-    <w:rPr>
-      <w:rFonts w:cs="Arial Unicode MS"/>
-    </w:rPr>
-  </w:style>
   <w:style w:type="paragraph" w:styleId="IndexHeading">
     <w:name w:val="index heading"/>
-    <w:basedOn w:val="user2"/>
+    <w:basedOn w:val="Style14"/>
     <w:pPr/>
     <w:rPr/>
   </w:style>
@@ -10069,8 +10467,8 @@
     </w:pPr>
     <w:rPr/>
   </w:style>
-  <w:style w:type="paragraph" w:styleId="user4">
-    <w:name w:val="Вміст таблиці (user)"/>
+  <w:style w:type="paragraph" w:styleId="Style16">
+    <w:name w:val="Вміст таблиці"/>
     <w:basedOn w:val="Normal"/>
     <w:qFormat/>
     <w:pPr>
@@ -10079,8 +10477,8 @@
     </w:pPr>
     <w:rPr/>
   </w:style>
-  <w:style w:type="numbering" w:styleId="user5" w:default="1">
-    <w:name w:val="Без маркерів (user)"/>
+  <w:style w:type="numbering" w:styleId="Style17" w:default="1">
+    <w:name w:val="Без маркерів"/>
     <w:uiPriority w:val="99"/>
     <w:semiHidden/>
     <w:unhideWhenUsed/>

</xml_diff>

<commit_message>
feat: PK1 done, Jesus thank you
</commit_message>
<xml_diff>
--- a/51PK Psyhologija karjery/1/PK1_KNT-116m_Onyshchenko_15.docx
+++ b/51PK Psyhologija karjery/1/PK1_KNT-116m_Onyshchenko_15.docx
@@ -907,7 +907,7 @@
           </w:tcPr>
           <w:p>
             <w:pPr>
-              <w:pStyle w:val="Style16"/>
+              <w:pStyle w:val="user4"/>
               <w:spacing w:lineRule="auto" w:line="240"/>
               <w:ind w:hanging="0" w:left="0"/>
               <w:rPr>
@@ -936,7 +936,7 @@
           </w:tcPr>
           <w:p>
             <w:pPr>
-              <w:pStyle w:val="Style16"/>
+              <w:pStyle w:val="user4"/>
               <w:spacing w:lineRule="auto" w:line="240"/>
               <w:ind w:hanging="0" w:left="0"/>
               <w:rPr>
@@ -966,7 +966,7 @@
           </w:tcPr>
           <w:p>
             <w:pPr>
-              <w:pStyle w:val="Style16"/>
+              <w:pStyle w:val="user4"/>
               <w:spacing w:lineRule="auto" w:line="240"/>
               <w:ind w:hanging="0" w:left="0"/>
               <w:rPr/>
@@ -988,7 +988,7 @@
           </w:tcPr>
           <w:p>
             <w:pPr>
-              <w:pStyle w:val="Style16"/>
+              <w:pStyle w:val="user4"/>
               <w:spacing w:lineRule="auto" w:line="240"/>
               <w:ind w:hanging="0" w:left="0"/>
               <w:rPr/>
@@ -1011,7 +1011,7 @@
           </w:tcPr>
           <w:p>
             <w:pPr>
-              <w:pStyle w:val="Style16"/>
+              <w:pStyle w:val="user4"/>
               <w:spacing w:lineRule="auto" w:line="240"/>
               <w:ind w:hanging="0" w:left="0"/>
               <w:rPr/>
@@ -1033,7 +1033,7 @@
           </w:tcPr>
           <w:p>
             <w:pPr>
-              <w:pStyle w:val="Style16"/>
+              <w:pStyle w:val="user4"/>
               <w:spacing w:lineRule="auto" w:line="240"/>
               <w:ind w:hanging="0" w:left="0"/>
               <w:rPr/>
@@ -1056,7 +1056,7 @@
           </w:tcPr>
           <w:p>
             <w:pPr>
-              <w:pStyle w:val="Style16"/>
+              <w:pStyle w:val="user4"/>
               <w:spacing w:lineRule="auto" w:line="240"/>
               <w:ind w:hanging="0" w:left="0"/>
               <w:rPr/>
@@ -1078,7 +1078,7 @@
           </w:tcPr>
           <w:p>
             <w:pPr>
-              <w:pStyle w:val="Style16"/>
+              <w:pStyle w:val="user4"/>
               <w:spacing w:lineRule="auto" w:line="240"/>
               <w:ind w:hanging="0" w:left="0"/>
               <w:rPr/>
@@ -1101,7 +1101,7 @@
           </w:tcPr>
           <w:p>
             <w:pPr>
-              <w:pStyle w:val="Style16"/>
+              <w:pStyle w:val="user4"/>
               <w:spacing w:lineRule="auto" w:line="240"/>
               <w:ind w:hanging="0" w:left="0"/>
               <w:rPr/>
@@ -1123,7 +1123,7 @@
           </w:tcPr>
           <w:p>
             <w:pPr>
-              <w:pStyle w:val="Style16"/>
+              <w:pStyle w:val="user4"/>
               <w:spacing w:lineRule="auto" w:line="240"/>
               <w:ind w:hanging="0" w:left="0"/>
               <w:rPr/>
@@ -1146,7 +1146,7 @@
           </w:tcPr>
           <w:p>
             <w:pPr>
-              <w:pStyle w:val="Style16"/>
+              <w:pStyle w:val="user4"/>
               <w:spacing w:lineRule="auto" w:line="240"/>
               <w:ind w:hanging="0" w:left="0"/>
               <w:rPr/>
@@ -1168,7 +1168,7 @@
           </w:tcPr>
           <w:p>
             <w:pPr>
-              <w:pStyle w:val="Style16"/>
+              <w:pStyle w:val="user4"/>
               <w:spacing w:lineRule="auto" w:line="240"/>
               <w:ind w:hanging="0" w:left="0"/>
               <w:rPr/>
@@ -1715,7 +1715,7 @@
           </w:tcPr>
           <w:p>
             <w:pPr>
-              <w:pStyle w:val="Style16"/>
+              <w:pStyle w:val="user4"/>
               <w:ind w:hanging="0" w:left="0"/>
               <w:rPr/>
             </w:pPr>
@@ -1737,7 +1737,7 @@
           </w:tcPr>
           <w:p>
             <w:pPr>
-              <w:pStyle w:val="Style16"/>
+              <w:pStyle w:val="user4"/>
               <w:ind w:hanging="0" w:left="0"/>
               <w:rPr/>
             </w:pPr>
@@ -1788,7 +1788,7 @@
           </w:tcPr>
           <w:p>
             <w:pPr>
-              <w:pStyle w:val="Style16"/>
+              <w:pStyle w:val="user4"/>
               <w:ind w:hanging="0" w:left="0"/>
               <w:rPr/>
             </w:pPr>
@@ -1810,7 +1810,7 @@
           </w:tcPr>
           <w:p>
             <w:pPr>
-              <w:pStyle w:val="Style16"/>
+              <w:pStyle w:val="user4"/>
               <w:ind w:hanging="0" w:left="0"/>
               <w:rPr/>
             </w:pPr>
@@ -3062,7 +3062,7 @@
           </w:tcPr>
           <w:p>
             <w:pPr>
-              <w:pStyle w:val="Style16"/>
+              <w:pStyle w:val="user4"/>
               <w:spacing w:lineRule="auto" w:line="240"/>
               <w:ind w:hanging="0" w:left="0"/>
               <w:rPr>
@@ -3091,7 +3091,7 @@
           </w:tcPr>
           <w:p>
             <w:pPr>
-              <w:pStyle w:val="Style16"/>
+              <w:pStyle w:val="user4"/>
               <w:spacing w:lineRule="auto" w:line="240"/>
               <w:ind w:hanging="0" w:left="0"/>
               <w:rPr>
@@ -3121,7 +3121,7 @@
           </w:tcPr>
           <w:p>
             <w:pPr>
-              <w:pStyle w:val="Style16"/>
+              <w:pStyle w:val="user4"/>
               <w:spacing w:lineRule="auto" w:line="240"/>
               <w:ind w:hanging="0" w:left="0"/>
               <w:rPr/>
@@ -3143,7 +3143,7 @@
           </w:tcPr>
           <w:p>
             <w:pPr>
-              <w:pStyle w:val="Style16"/>
+              <w:pStyle w:val="user4"/>
               <w:spacing w:lineRule="auto" w:line="240"/>
               <w:ind w:hanging="0" w:left="0"/>
               <w:rPr/>
@@ -3167,7 +3167,7 @@
           </w:tcPr>
           <w:p>
             <w:pPr>
-              <w:pStyle w:val="Style16"/>
+              <w:pStyle w:val="user4"/>
               <w:spacing w:lineRule="auto" w:line="240"/>
               <w:ind w:hanging="0" w:left="0"/>
               <w:rPr/>
@@ -3189,7 +3189,7 @@
           </w:tcPr>
           <w:p>
             <w:pPr>
-              <w:pStyle w:val="Style16"/>
+              <w:pStyle w:val="user4"/>
               <w:spacing w:lineRule="auto" w:line="240"/>
               <w:ind w:hanging="0" w:left="0"/>
               <w:rPr/>
@@ -3213,7 +3213,7 @@
           </w:tcPr>
           <w:p>
             <w:pPr>
-              <w:pStyle w:val="Style16"/>
+              <w:pStyle w:val="user4"/>
               <w:spacing w:lineRule="auto" w:line="240"/>
               <w:ind w:hanging="0" w:left="0"/>
               <w:rPr/>
@@ -3235,7 +3235,7 @@
           </w:tcPr>
           <w:p>
             <w:pPr>
-              <w:pStyle w:val="Style16"/>
+              <w:pStyle w:val="user4"/>
               <w:spacing w:lineRule="auto" w:line="240"/>
               <w:ind w:hanging="0" w:left="0"/>
               <w:rPr/>
@@ -3259,7 +3259,7 @@
           </w:tcPr>
           <w:p>
             <w:pPr>
-              <w:pStyle w:val="Style16"/>
+              <w:pStyle w:val="user4"/>
               <w:spacing w:lineRule="auto" w:line="240"/>
               <w:ind w:hanging="0" w:left="0"/>
               <w:rPr/>
@@ -3281,7 +3281,7 @@
           </w:tcPr>
           <w:p>
             <w:pPr>
-              <w:pStyle w:val="Style16"/>
+              <w:pStyle w:val="user4"/>
               <w:spacing w:lineRule="auto" w:line="240"/>
               <w:ind w:hanging="0" w:left="0"/>
               <w:rPr/>
@@ -3305,7 +3305,7 @@
           </w:tcPr>
           <w:p>
             <w:pPr>
-              <w:pStyle w:val="Style16"/>
+              <w:pStyle w:val="user4"/>
               <w:spacing w:lineRule="auto" w:line="240"/>
               <w:ind w:hanging="0" w:left="0"/>
               <w:rPr/>
@@ -3327,7 +3327,7 @@
           </w:tcPr>
           <w:p>
             <w:pPr>
-              <w:pStyle w:val="Style16"/>
+              <w:pStyle w:val="user4"/>
               <w:spacing w:lineRule="auto" w:line="240"/>
               <w:ind w:hanging="0" w:left="0"/>
               <w:rPr/>
@@ -3741,7 +3741,7 @@
           </w:tcPr>
           <w:p>
             <w:pPr>
-              <w:pStyle w:val="Style16"/>
+              <w:pStyle w:val="user4"/>
               <w:spacing w:lineRule="auto" w:line="240"/>
               <w:ind w:hanging="0" w:left="0"/>
               <w:rPr>
@@ -3770,7 +3770,7 @@
           </w:tcPr>
           <w:p>
             <w:pPr>
-              <w:pStyle w:val="Style16"/>
+              <w:pStyle w:val="user4"/>
               <w:spacing w:lineRule="auto" w:line="240"/>
               <w:ind w:hanging="0" w:left="0"/>
               <w:rPr>
@@ -3800,7 +3800,7 @@
           </w:tcPr>
           <w:p>
             <w:pPr>
-              <w:pStyle w:val="Style16"/>
+              <w:pStyle w:val="user4"/>
               <w:spacing w:lineRule="auto" w:line="240"/>
               <w:ind w:hanging="0" w:left="0"/>
               <w:rPr/>
@@ -3822,7 +3822,7 @@
           </w:tcPr>
           <w:p>
             <w:pPr>
-              <w:pStyle w:val="Style16"/>
+              <w:pStyle w:val="user4"/>
               <w:spacing w:lineRule="auto" w:line="240"/>
               <w:ind w:hanging="0" w:left="0"/>
               <w:rPr/>
@@ -3846,7 +3846,7 @@
           </w:tcPr>
           <w:p>
             <w:pPr>
-              <w:pStyle w:val="Style16"/>
+              <w:pStyle w:val="user4"/>
               <w:spacing w:lineRule="auto" w:line="240"/>
               <w:ind w:hanging="0" w:left="0"/>
               <w:rPr/>
@@ -3868,7 +3868,7 @@
           </w:tcPr>
           <w:p>
             <w:pPr>
-              <w:pStyle w:val="Style16"/>
+              <w:pStyle w:val="user4"/>
               <w:spacing w:lineRule="auto" w:line="240"/>
               <w:ind w:hanging="0" w:left="0"/>
               <w:rPr/>
@@ -3892,7 +3892,7 @@
           </w:tcPr>
           <w:p>
             <w:pPr>
-              <w:pStyle w:val="Style16"/>
+              <w:pStyle w:val="user4"/>
               <w:spacing w:lineRule="auto" w:line="240"/>
               <w:ind w:hanging="0" w:left="0"/>
               <w:rPr/>
@@ -3914,7 +3914,7 @@
           </w:tcPr>
           <w:p>
             <w:pPr>
-              <w:pStyle w:val="Style16"/>
+              <w:pStyle w:val="user4"/>
               <w:spacing w:lineRule="auto" w:line="240"/>
               <w:ind w:hanging="0" w:left="0"/>
               <w:rPr/>
@@ -3966,7 +3966,7 @@
           </w:tcPr>
           <w:p>
             <w:pPr>
-              <w:pStyle w:val="Style16"/>
+              <w:pStyle w:val="user4"/>
               <w:spacing w:lineRule="auto" w:line="240"/>
               <w:ind w:hanging="0" w:left="0"/>
               <w:rPr>
@@ -3995,7 +3995,7 @@
           </w:tcPr>
           <w:p>
             <w:pPr>
-              <w:pStyle w:val="Style16"/>
+              <w:pStyle w:val="user4"/>
               <w:spacing w:lineRule="auto" w:line="240"/>
               <w:ind w:hanging="0" w:left="0"/>
               <w:rPr>
@@ -4025,7 +4025,7 @@
           </w:tcPr>
           <w:p>
             <w:pPr>
-              <w:pStyle w:val="Style16"/>
+              <w:pStyle w:val="user4"/>
               <w:spacing w:lineRule="auto" w:line="240"/>
               <w:ind w:hanging="0" w:left="0"/>
               <w:rPr/>
@@ -4047,7 +4047,7 @@
           </w:tcPr>
           <w:p>
             <w:pPr>
-              <w:pStyle w:val="Style16"/>
+              <w:pStyle w:val="user4"/>
               <w:spacing w:lineRule="auto" w:line="240"/>
               <w:ind w:hanging="0" w:left="0"/>
               <w:rPr/>
@@ -4071,7 +4071,7 @@
           </w:tcPr>
           <w:p>
             <w:pPr>
-              <w:pStyle w:val="Style16"/>
+              <w:pStyle w:val="user4"/>
               <w:spacing w:lineRule="auto" w:line="240"/>
               <w:ind w:hanging="0" w:left="0"/>
               <w:rPr/>
@@ -4093,7 +4093,7 @@
           </w:tcPr>
           <w:p>
             <w:pPr>
-              <w:pStyle w:val="Style16"/>
+              <w:pStyle w:val="user4"/>
               <w:spacing w:lineRule="auto" w:line="240"/>
               <w:ind w:hanging="0" w:left="0"/>
               <w:rPr/>
@@ -4117,7 +4117,7 @@
           </w:tcPr>
           <w:p>
             <w:pPr>
-              <w:pStyle w:val="Style16"/>
+              <w:pStyle w:val="user4"/>
               <w:spacing w:lineRule="auto" w:line="240"/>
               <w:ind w:hanging="0" w:left="0"/>
               <w:rPr/>
@@ -4139,7 +4139,7 @@
           </w:tcPr>
           <w:p>
             <w:pPr>
-              <w:pStyle w:val="Style16"/>
+              <w:pStyle w:val="user4"/>
               <w:spacing w:lineRule="auto" w:line="240"/>
               <w:ind w:hanging="0" w:left="0"/>
               <w:rPr/>
@@ -5732,11 +5732,7 @@
       </w:pPr>
       <w:r>
         <w:rPr/>
-        <w:t>Есе на тему «</w:t>
-      </w:r>
-      <w:r>
-        <w:rPr/>
-        <w:t>Якою буде моя професія у 2035 році»</w:t>
+        <w:t>Есе на тему «Якою буде моя професія у 2035 році»</w:t>
       </w:r>
     </w:p>
     <w:p>
@@ -5775,6 +5771,86 @@
         <w:rPr>
           <w:lang w:val="uk-UA"/>
         </w:rPr>
+        <w:t>У 2035 році я бачу себе програмістом. Я думаю, що професія програміста буде важливої, бо люди все більше використовують комп’ютери та різні програми.</w:t>
+      </w:r>
+    </w:p>
+    <w:p>
+      <w:pPr>
+        <w:pStyle w:val="P1"/>
+        <w:widowControl/>
+        <w:suppressAutoHyphens w:val="true"/>
+        <w:bidi w:val="0"/>
+        <w:spacing w:lineRule="auto" w:line="360" w:before="0" w:after="0"/>
+        <w:ind w:firstLine="850" w:left="0" w:right="0"/>
+        <w:jc w:val="both"/>
+        <w:rPr>
+          <w:lang w:val="uk-UA"/>
+        </w:rPr>
+      </w:pPr>
+      <w:r>
+        <w:rPr>
+          <w:lang w:val="uk-UA"/>
+        </w:rPr>
+        <w:t>У майбутньому штучний інтелект помагатиме програмістам писати код і швидше виконувати роботу. Проте людина все одно повинна розуміти, як працюють програми, знаходити помилки та розв’язувати проблеми.</w:t>
+      </w:r>
+    </w:p>
+    <w:p>
+      <w:pPr>
+        <w:pStyle w:val="P1"/>
+        <w:widowControl/>
+        <w:suppressAutoHyphens w:val="true"/>
+        <w:bidi w:val="0"/>
+        <w:spacing w:lineRule="auto" w:line="360" w:before="0" w:after="0"/>
+        <w:ind w:firstLine="850" w:left="0" w:right="0"/>
+        <w:jc w:val="both"/>
+        <w:rPr>
+          <w:lang w:val="uk-UA"/>
+        </w:rPr>
+      </w:pPr>
+      <w:r>
+        <w:rPr>
+          <w:lang w:val="uk-UA"/>
+        </w:rPr>
+        <w:t>Щоб бути хорошим програмістом, мені потрібно постійно вчитися, розвивати свої навички та вивчати нові технології. Також важливо вміти працювати в команді й відповідально ставитися до своєї роботи.</w:t>
+      </w:r>
+    </w:p>
+    <w:p>
+      <w:pPr>
+        <w:pStyle w:val="P1"/>
+        <w:widowControl/>
+        <w:suppressAutoHyphens w:val="true"/>
+        <w:bidi w:val="0"/>
+        <w:spacing w:lineRule="auto" w:line="360" w:before="0" w:after="0"/>
+        <w:ind w:firstLine="850" w:left="0" w:right="0"/>
+        <w:jc w:val="both"/>
+        <w:rPr>
+          <w:lang w:val="uk-UA"/>
+        </w:rPr>
+      </w:pPr>
+      <w:r>
+        <w:rPr>
+          <w:lang w:val="uk-UA"/>
+        </w:rPr>
+        <w:t>Я сподіваюсь, що у 2035 році матиму хороші знання та цікаву роботу, дасть Бог. Я хочу створювати корисні програми, які допомагатимуть людям у повсякденному житті.</w:t>
+      </w:r>
+    </w:p>
+    <w:p>
+      <w:pPr>
+        <w:pStyle w:val="P1"/>
+        <w:widowControl/>
+        <w:suppressAutoHyphens w:val="true"/>
+        <w:bidi w:val="0"/>
+        <w:spacing w:lineRule="auto" w:line="360" w:before="0" w:after="0"/>
+        <w:ind w:firstLine="850" w:left="0" w:right="0"/>
+        <w:jc w:val="both"/>
+        <w:rPr>
+          <w:lang w:val="uk-UA"/>
+        </w:rPr>
+      </w:pPr>
+      <w:r>
+        <w:rPr>
+          <w:lang w:val="uk-UA"/>
+        </w:rPr>
       </w:r>
     </w:p>
     <w:p>
@@ -5785,6 +5861,569 @@
       <w:r>
         <w:rPr/>
         <w:t>Питання</w:t>
+      </w:r>
+    </w:p>
+    <w:p>
+      <w:pPr>
+        <w:pStyle w:val="H2"/>
+        <w:rPr/>
+      </w:pPr>
+      <w:r>
+        <w:rPr/>
+        <w:t xml:space="preserve">1 </w:t>
+      </w:r>
+      <w:r>
+        <w:rPr/>
+        <w:t>Що є предметом психології кар'єри?</w:t>
+      </w:r>
+    </w:p>
+    <w:p>
+      <w:pPr>
+        <w:pStyle w:val="P1"/>
+        <w:rPr/>
+      </w:pPr>
+      <w:r>
+        <w:rPr/>
+      </w:r>
+    </w:p>
+    <w:p>
+      <w:pPr>
+        <w:pStyle w:val="P1"/>
+        <w:rPr/>
+      </w:pPr>
+      <w:r>
+        <w:rPr/>
+        <w:t>Предметом психології кар’єри є становлення людини як робітника.</w:t>
+      </w:r>
+    </w:p>
+    <w:p>
+      <w:pPr>
+        <w:pStyle w:val="P1"/>
+        <w:rPr/>
+      </w:pPr>
+      <w:r>
+        <w:rPr/>
+      </w:r>
+    </w:p>
+    <w:p>
+      <w:pPr>
+        <w:pStyle w:val="H2"/>
+        <w:rPr/>
+      </w:pPr>
+      <w:r>
+        <w:rPr/>
+        <w:t xml:space="preserve">2 </w:t>
+      </w:r>
+      <w:r>
+        <w:rPr/>
+        <w:t>У чому полягає відмінність між поняттями «робота», «професія» та «кар'єра»?</w:t>
+      </w:r>
+    </w:p>
+    <w:p>
+      <w:pPr>
+        <w:pStyle w:val="P1"/>
+        <w:rPr/>
+      </w:pPr>
+      <w:r>
+        <w:rPr/>
+      </w:r>
+    </w:p>
+    <w:p>
+      <w:pPr>
+        <w:pStyle w:val="P1"/>
+        <w:rPr/>
+      </w:pPr>
+      <w:r>
+        <w:rPr/>
+        <w:t xml:space="preserve">Робота — діяльність, яку людина виконує для отримання </w:t>
+      </w:r>
+      <w:r>
+        <w:rPr/>
+        <w:t xml:space="preserve">якогось </w:t>
+      </w:r>
+      <w:r>
+        <w:rPr/>
+        <w:t xml:space="preserve">результату, заробітку </w:t>
+      </w:r>
+      <w:r>
+        <w:rPr/>
+        <w:t xml:space="preserve">чи </w:t>
+      </w:r>
+      <w:r>
+        <w:rPr/>
+        <w:t>користі.</w:t>
+      </w:r>
+    </w:p>
+    <w:p>
+      <w:pPr>
+        <w:pStyle w:val="P1"/>
+        <w:rPr/>
+      </w:pPr>
+      <w:r>
+        <w:rPr/>
+        <w:t>Професія — вид трудової діяльності, що потребує певних знань, умінь і навичок.</w:t>
+      </w:r>
+    </w:p>
+    <w:p>
+      <w:pPr>
+        <w:pStyle w:val="P1"/>
+        <w:rPr/>
+      </w:pPr>
+      <w:r>
+        <w:rPr/>
+        <w:t>Кар'єра — поступовий професійний розвиток, який може передбачати підвищення кваліфікації, зміну посад, зростання відповідальності та досягнення професійних цілей.</w:t>
+      </w:r>
+    </w:p>
+    <w:p>
+      <w:pPr>
+        <w:pStyle w:val="P1"/>
+        <w:rPr/>
+      </w:pPr>
+      <w:r>
+        <w:rPr/>
+      </w:r>
+    </w:p>
+    <w:p>
+      <w:pPr>
+        <w:pStyle w:val="H2"/>
+        <w:rPr/>
+      </w:pPr>
+      <w:r>
+        <w:rPr/>
+        <w:t xml:space="preserve">3 </w:t>
+      </w:r>
+      <w:r>
+        <w:rPr/>
+        <w:t>Які чинники визначають професійний успіх?</w:t>
+      </w:r>
+    </w:p>
+    <w:p>
+      <w:pPr>
+        <w:pStyle w:val="P1"/>
+        <w:rPr/>
+      </w:pPr>
+      <w:r>
+        <w:rPr/>
+      </w:r>
+    </w:p>
+    <w:p>
+      <w:pPr>
+        <w:pStyle w:val="P1"/>
+        <w:rPr/>
+      </w:pPr>
+      <w:r>
+        <w:rPr/>
+        <w:t>Професійний успіх залежить від рівня знань і навичок, досвіду, мотивації, працездатності, відповідальності, комунікативних здібностей, уміння адаптуватися до змін, а також від можливостей на ринку праці та підтримки з боку колег і керівництва.</w:t>
+      </w:r>
+    </w:p>
+    <w:p>
+      <w:pPr>
+        <w:pStyle w:val="P1"/>
+        <w:rPr/>
+      </w:pPr>
+      <w:r>
+        <w:rPr/>
+      </w:r>
+    </w:p>
+    <w:p>
+      <w:pPr>
+        <w:pStyle w:val="H2"/>
+        <w:rPr/>
+      </w:pPr>
+      <w:r>
+        <w:rPr/>
+        <w:t xml:space="preserve">4 </w:t>
+      </w:r>
+      <w:r>
+        <w:rPr/>
+        <w:t>Які сучасні моделі кар'єри існують?</w:t>
+      </w:r>
+    </w:p>
+    <w:p>
+      <w:pPr>
+        <w:pStyle w:val="P1"/>
+        <w:rPr/>
+      </w:pPr>
+      <w:r>
+        <w:rPr/>
+      </w:r>
+    </w:p>
+    <w:p>
+      <w:pPr>
+        <w:pStyle w:val="P1"/>
+        <w:rPr/>
+      </w:pPr>
+      <w:r>
+        <w:rPr/>
+        <w:t>Основними моделями кар'єри є:</w:t>
+      </w:r>
+    </w:p>
+    <w:p>
+      <w:pPr>
+        <w:pStyle w:val="P1"/>
+        <w:widowControl/>
+        <w:numPr>
+          <w:ilvl w:val="0"/>
+          <w:numId w:val="26"/>
+        </w:numPr>
+        <w:suppressAutoHyphens w:val="true"/>
+        <w:bidi w:val="0"/>
+        <w:spacing w:lineRule="auto" w:line="360" w:before="0" w:after="0"/>
+        <w:ind w:firstLine="850" w:left="0" w:right="0"/>
+        <w:jc w:val="both"/>
+        <w:rPr/>
+      </w:pPr>
+      <w:r>
+        <w:rPr/>
+        <w:t>Традиційна кар'єра — поступове просування на вищі посади в одній організації.</w:t>
+      </w:r>
+    </w:p>
+    <w:p>
+      <w:pPr>
+        <w:pStyle w:val="P1"/>
+        <w:widowControl/>
+        <w:numPr>
+          <w:ilvl w:val="0"/>
+          <w:numId w:val="26"/>
+        </w:numPr>
+        <w:suppressAutoHyphens w:val="true"/>
+        <w:bidi w:val="0"/>
+        <w:spacing w:lineRule="auto" w:line="360" w:before="0" w:after="0"/>
+        <w:ind w:firstLine="850" w:left="0" w:right="0"/>
+        <w:jc w:val="both"/>
+        <w:rPr/>
+      </w:pPr>
+      <w:r>
+        <w:rPr/>
+        <w:t>Лінійна кар'єра — послідовне професійне зростання та збільшення відповідальності.</w:t>
+      </w:r>
+    </w:p>
+    <w:p>
+      <w:pPr>
+        <w:pStyle w:val="P1"/>
+        <w:widowControl/>
+        <w:numPr>
+          <w:ilvl w:val="0"/>
+          <w:numId w:val="26"/>
+        </w:numPr>
+        <w:suppressAutoHyphens w:val="true"/>
+        <w:bidi w:val="0"/>
+        <w:spacing w:lineRule="auto" w:line="360" w:before="0" w:after="0"/>
+        <w:ind w:firstLine="850" w:left="0" w:right="0"/>
+        <w:jc w:val="both"/>
+        <w:rPr/>
+      </w:pPr>
+      <w:r>
+        <w:rPr/>
+        <w:t>Експертна кар'єра — поглиблення знань і розвиток майстерності в одній галузі.</w:t>
+      </w:r>
+    </w:p>
+    <w:p>
+      <w:pPr>
+        <w:pStyle w:val="P1"/>
+        <w:widowControl/>
+        <w:numPr>
+          <w:ilvl w:val="0"/>
+          <w:numId w:val="26"/>
+        </w:numPr>
+        <w:suppressAutoHyphens w:val="true"/>
+        <w:bidi w:val="0"/>
+        <w:spacing w:lineRule="auto" w:line="360" w:before="0" w:after="0"/>
+        <w:ind w:firstLine="850" w:left="0" w:right="0"/>
+        <w:jc w:val="both"/>
+        <w:rPr/>
+      </w:pPr>
+      <w:r>
+        <w:rPr/>
+        <w:t>Спіральна кар'єра — періодична зміна напрямів діяльності з використанням попереднього досвіду.</w:t>
+      </w:r>
+    </w:p>
+    <w:p>
+      <w:pPr>
+        <w:pStyle w:val="P1"/>
+        <w:widowControl/>
+        <w:numPr>
+          <w:ilvl w:val="0"/>
+          <w:numId w:val="26"/>
+        </w:numPr>
+        <w:suppressAutoHyphens w:val="true"/>
+        <w:bidi w:val="0"/>
+        <w:spacing w:lineRule="auto" w:line="360" w:before="0" w:after="0"/>
+        <w:ind w:firstLine="850" w:left="0" w:right="0"/>
+        <w:jc w:val="both"/>
+        <w:rPr/>
+      </w:pPr>
+      <w:r>
+        <w:rPr/>
+        <w:t>Протеанська кар'єра — самостійне управління професійним розвитком відповідно до власних цінностей і цілей.</w:t>
+      </w:r>
+    </w:p>
+    <w:p>
+      <w:pPr>
+        <w:pStyle w:val="P1"/>
+        <w:widowControl/>
+        <w:numPr>
+          <w:ilvl w:val="0"/>
+          <w:numId w:val="26"/>
+        </w:numPr>
+        <w:suppressAutoHyphens w:val="true"/>
+        <w:bidi w:val="0"/>
+        <w:spacing w:lineRule="auto" w:line="360" w:before="0" w:after="0"/>
+        <w:ind w:firstLine="850" w:left="0" w:right="0"/>
+        <w:jc w:val="both"/>
+        <w:rPr/>
+      </w:pPr>
+      <w:r>
+        <w:rPr/>
+        <w:t>Безмежна кар'єра — професійний розвиток через перехід між організаціями, професіями або країнами.</w:t>
+      </w:r>
+    </w:p>
+    <w:p>
+      <w:pPr>
+        <w:pStyle w:val="P1"/>
+        <w:rPr/>
+      </w:pPr>
+      <w:r>
+        <w:rPr/>
+      </w:r>
+    </w:p>
+    <w:p>
+      <w:pPr>
+        <w:pStyle w:val="H2"/>
+        <w:rPr/>
+      </w:pPr>
+      <w:r>
+        <w:rPr/>
+        <w:t xml:space="preserve">5 </w:t>
+      </w:r>
+      <w:r>
+        <w:rPr/>
+        <w:t>Як цифровізація впливає на професійний розвиток?</w:t>
+      </w:r>
+    </w:p>
+    <w:p>
+      <w:pPr>
+        <w:pStyle w:val="P1"/>
+        <w:rPr/>
+      </w:pPr>
+      <w:r>
+        <w:rPr/>
+      </w:r>
+    </w:p>
+    <w:p>
+      <w:pPr>
+        <w:pStyle w:val="P1"/>
+        <w:rPr/>
+      </w:pPr>
+      <w:r>
+        <w:rPr/>
+        <w:t>Цифровізація створює нові професії, розширює можливості дистанційної роботи та онлайн-навчання, а також автоматизує частину робочих завдань. Водночас вона вимагає цифрової грамотності, уміння працювати зі штучним інтелектом, критичного мислення та готовності постійно опановувати нові технології.</w:t>
+      </w:r>
+    </w:p>
+    <w:p>
+      <w:pPr>
+        <w:pStyle w:val="P1"/>
+        <w:rPr/>
+      </w:pPr>
+      <w:r>
+        <w:rPr/>
+      </w:r>
+    </w:p>
+    <w:p>
+      <w:pPr>
+        <w:pStyle w:val="H2"/>
+        <w:rPr/>
+      </w:pPr>
+      <w:r>
+        <w:rPr/>
+        <w:t xml:space="preserve">6 </w:t>
+      </w:r>
+      <w:r>
+        <w:rPr/>
+        <w:t>Які особливості кар'єрного розвитку випускників різних спеціальностей?</w:t>
+      </w:r>
+    </w:p>
+    <w:p>
+      <w:pPr>
+        <w:pStyle w:val="P1"/>
+        <w:rPr/>
+      </w:pPr>
+      <w:r>
+        <w:rPr/>
+      </w:r>
+    </w:p>
+    <w:p>
+      <w:pPr>
+        <w:pStyle w:val="P1"/>
+        <w:rPr/>
+      </w:pPr>
+      <w:r>
+        <w:rPr/>
+        <w:t>Кар'єрний розвиток залежить від специфіки професії:</w:t>
+      </w:r>
+    </w:p>
+    <w:p>
+      <w:pPr>
+        <w:pStyle w:val="P1"/>
+        <w:widowControl/>
+        <w:numPr>
+          <w:ilvl w:val="0"/>
+          <w:numId w:val="27"/>
+        </w:numPr>
+        <w:suppressAutoHyphens w:val="true"/>
+        <w:bidi w:val="0"/>
+        <w:spacing w:lineRule="auto" w:line="360" w:before="0" w:after="0"/>
+        <w:ind w:firstLine="850" w:left="0" w:right="0"/>
+        <w:jc w:val="both"/>
+        <w:rPr/>
+      </w:pPr>
+      <w:r>
+        <w:rPr/>
+        <w:t>Технічні спеціальності та IT — потребують постійного оновлення технічних знань, практичного досвіду й виконаних проєктів.</w:t>
+      </w:r>
+    </w:p>
+    <w:p>
+      <w:pPr>
+        <w:pStyle w:val="P1"/>
+        <w:widowControl/>
+        <w:numPr>
+          <w:ilvl w:val="0"/>
+          <w:numId w:val="27"/>
+        </w:numPr>
+        <w:suppressAutoHyphens w:val="true"/>
+        <w:bidi w:val="0"/>
+        <w:spacing w:lineRule="auto" w:line="360" w:before="0" w:after="0"/>
+        <w:ind w:firstLine="850" w:left="0" w:right="0"/>
+        <w:jc w:val="both"/>
+        <w:rPr/>
+      </w:pPr>
+      <w:r>
+        <w:rPr/>
+        <w:t>Медичні та педагогічні спеціальності — передбачають практичну підготовку, досвід роботи та постійне підвищення кваліфікації.</w:t>
+      </w:r>
+    </w:p>
+    <w:p>
+      <w:pPr>
+        <w:pStyle w:val="P1"/>
+        <w:widowControl/>
+        <w:numPr>
+          <w:ilvl w:val="0"/>
+          <w:numId w:val="27"/>
+        </w:numPr>
+        <w:suppressAutoHyphens w:val="true"/>
+        <w:bidi w:val="0"/>
+        <w:spacing w:lineRule="auto" w:line="360" w:before="0" w:after="0"/>
+        <w:ind w:firstLine="850" w:left="0" w:right="0"/>
+        <w:jc w:val="both"/>
+        <w:rPr/>
+      </w:pPr>
+      <w:r>
+        <w:rPr/>
+        <w:t>Економічні та юридичні спеціальності — вимагають аналітичного мислення, професійних знань, комунікативних навичок і досвіду.</w:t>
+      </w:r>
+    </w:p>
+    <w:p>
+      <w:pPr>
+        <w:pStyle w:val="P1"/>
+        <w:widowControl/>
+        <w:numPr>
+          <w:ilvl w:val="0"/>
+          <w:numId w:val="27"/>
+        </w:numPr>
+        <w:suppressAutoHyphens w:val="true"/>
+        <w:bidi w:val="0"/>
+        <w:spacing w:lineRule="auto" w:line="360" w:before="0" w:after="0"/>
+        <w:ind w:firstLine="850" w:left="0" w:right="0"/>
+        <w:jc w:val="both"/>
+        <w:rPr/>
+      </w:pPr>
+      <w:r>
+        <w:rPr/>
+        <w:t>Творчі спеціальності — потребують креативності, формування портфоліо та розвитку індивідуального стилю.</w:t>
+      </w:r>
+    </w:p>
+    <w:p>
+      <w:pPr>
+        <w:pStyle w:val="P1"/>
+        <w:rPr/>
+      </w:pPr>
+      <w:r>
+        <w:rPr/>
+      </w:r>
+    </w:p>
+    <w:p>
+      <w:pPr>
+        <w:pStyle w:val="H2"/>
+        <w:rPr/>
+      </w:pPr>
+      <w:r>
+        <w:rPr/>
+        <w:t xml:space="preserve">7 </w:t>
+      </w:r>
+      <w:r>
+        <w:rPr/>
+        <w:t>Які психологічні якості сприяють професійній самореалізації?</w:t>
+      </w:r>
+    </w:p>
+    <w:p>
+      <w:pPr>
+        <w:pStyle w:val="P1"/>
+        <w:rPr/>
+      </w:pPr>
+      <w:r>
+        <w:rPr/>
+      </w:r>
+    </w:p>
+    <w:p>
+      <w:pPr>
+        <w:pStyle w:val="P1"/>
+        <w:rPr/>
+      </w:pPr>
+      <w:r>
+        <w:rPr/>
+        <w:t>Професійній самореалізації сприяють відповідальність, наполегливість, упевненість у собі, самодисципліна, емоційна стійкість, комунікабельність, креативність, здатність до самоаналізу та готовність адаптуватися до змін.</w:t>
+      </w:r>
+    </w:p>
+    <w:p>
+      <w:pPr>
+        <w:pStyle w:val="P1"/>
+        <w:rPr/>
+      </w:pPr>
+      <w:r>
+        <w:rPr/>
+      </w:r>
+    </w:p>
+    <w:p>
+      <w:pPr>
+        <w:pStyle w:val="H2"/>
+        <w:rPr/>
+      </w:pPr>
+      <w:r>
+        <w:rPr/>
+        <w:t xml:space="preserve">8 </w:t>
+      </w:r>
+      <w:r>
+        <w:rPr/>
+        <w:t>Чому безперервне навчання стало необхідною умовою сучасної кар'єри?</w:t>
+      </w:r>
+    </w:p>
+    <w:p>
+      <w:pPr>
+        <w:pStyle w:val="P1"/>
+        <w:rPr/>
+      </w:pPr>
+      <w:r>
+        <w:rPr/>
+      </w:r>
+    </w:p>
+    <w:p>
+      <w:pPr>
+        <w:pStyle w:val="P1"/>
+        <w:rPr/>
+      </w:pPr>
+      <w:r>
+        <w:rPr/>
+        <w:t>Безперервне навчання необхідне, оскільки технології, вимоги роботодавців і способи виконання професійних завдань постійно змінюються. Воно допомагає підтримувати актуальність знань, розвивати нові компетентності, залишатися конкурентоспроможним на ринку праці та відкривати можливості для кар'єрного зростання.</w:t>
       </w:r>
     </w:p>
     <w:sectPr>
@@ -9102,6 +9741,280 @@
     </w:lvl>
   </w:abstractNum>
   <w:abstractNum w:abstractNumId="26">
+    <w:lvl w:ilvl="0">
+      <w:start w:val="1"/>
+      <w:numFmt w:val="bullet"/>
+      <w:lvlText w:val=""/>
+      <w:lvlJc w:val="left"/>
+      <w:pPr>
+        <w:tabs>
+          <w:tab w:val="num" w:pos="720"/>
+        </w:tabs>
+        <w:ind w:left="720" w:hanging="360"/>
+      </w:pPr>
+      <w:rPr>
+        <w:rFonts w:ascii="Symbol" w:hAnsi="Symbol" w:cs="Symbol" w:hint="default"/>
+      </w:rPr>
+    </w:lvl>
+    <w:lvl w:ilvl="1">
+      <w:start w:val="1"/>
+      <w:numFmt w:val="bullet"/>
+      <w:lvlText w:val="◦"/>
+      <w:lvlJc w:val="left"/>
+      <w:pPr>
+        <w:tabs>
+          <w:tab w:val="num" w:pos="1080"/>
+        </w:tabs>
+        <w:ind w:left="1080" w:hanging="360"/>
+      </w:pPr>
+      <w:rPr>
+        <w:rFonts w:ascii="OpenSymbol" w:hAnsi="OpenSymbol" w:cs="OpenSymbol" w:hint="default"/>
+      </w:rPr>
+    </w:lvl>
+    <w:lvl w:ilvl="2">
+      <w:start w:val="1"/>
+      <w:numFmt w:val="bullet"/>
+      <w:lvlText w:val="▪"/>
+      <w:lvlJc w:val="left"/>
+      <w:pPr>
+        <w:tabs>
+          <w:tab w:val="num" w:pos="1440"/>
+        </w:tabs>
+        <w:ind w:left="1440" w:hanging="360"/>
+      </w:pPr>
+      <w:rPr>
+        <w:rFonts w:ascii="OpenSymbol" w:hAnsi="OpenSymbol" w:cs="OpenSymbol" w:hint="default"/>
+      </w:rPr>
+    </w:lvl>
+    <w:lvl w:ilvl="3">
+      <w:start w:val="1"/>
+      <w:numFmt w:val="bullet"/>
+      <w:lvlText w:val=""/>
+      <w:lvlJc w:val="left"/>
+      <w:pPr>
+        <w:tabs>
+          <w:tab w:val="num" w:pos="1800"/>
+        </w:tabs>
+        <w:ind w:left="1800" w:hanging="360"/>
+      </w:pPr>
+      <w:rPr>
+        <w:rFonts w:ascii="Symbol" w:hAnsi="Symbol" w:cs="Symbol" w:hint="default"/>
+      </w:rPr>
+    </w:lvl>
+    <w:lvl w:ilvl="4">
+      <w:start w:val="1"/>
+      <w:numFmt w:val="bullet"/>
+      <w:lvlText w:val="◦"/>
+      <w:lvlJc w:val="left"/>
+      <w:pPr>
+        <w:tabs>
+          <w:tab w:val="num" w:pos="2160"/>
+        </w:tabs>
+        <w:ind w:left="2160" w:hanging="360"/>
+      </w:pPr>
+      <w:rPr>
+        <w:rFonts w:ascii="OpenSymbol" w:hAnsi="OpenSymbol" w:cs="OpenSymbol" w:hint="default"/>
+      </w:rPr>
+    </w:lvl>
+    <w:lvl w:ilvl="5">
+      <w:start w:val="1"/>
+      <w:numFmt w:val="bullet"/>
+      <w:lvlText w:val="▪"/>
+      <w:lvlJc w:val="left"/>
+      <w:pPr>
+        <w:tabs>
+          <w:tab w:val="num" w:pos="2520"/>
+        </w:tabs>
+        <w:ind w:left="2520" w:hanging="360"/>
+      </w:pPr>
+      <w:rPr>
+        <w:rFonts w:ascii="OpenSymbol" w:hAnsi="OpenSymbol" w:cs="OpenSymbol" w:hint="default"/>
+      </w:rPr>
+    </w:lvl>
+    <w:lvl w:ilvl="6">
+      <w:start w:val="1"/>
+      <w:numFmt w:val="bullet"/>
+      <w:lvlText w:val=""/>
+      <w:lvlJc w:val="left"/>
+      <w:pPr>
+        <w:tabs>
+          <w:tab w:val="num" w:pos="2880"/>
+        </w:tabs>
+        <w:ind w:left="2880" w:hanging="360"/>
+      </w:pPr>
+      <w:rPr>
+        <w:rFonts w:ascii="Symbol" w:hAnsi="Symbol" w:cs="Symbol" w:hint="default"/>
+      </w:rPr>
+    </w:lvl>
+    <w:lvl w:ilvl="7">
+      <w:start w:val="1"/>
+      <w:numFmt w:val="bullet"/>
+      <w:lvlText w:val="◦"/>
+      <w:lvlJc w:val="left"/>
+      <w:pPr>
+        <w:tabs>
+          <w:tab w:val="num" w:pos="3240"/>
+        </w:tabs>
+        <w:ind w:left="3240" w:hanging="360"/>
+      </w:pPr>
+      <w:rPr>
+        <w:rFonts w:ascii="OpenSymbol" w:hAnsi="OpenSymbol" w:cs="OpenSymbol" w:hint="default"/>
+      </w:rPr>
+    </w:lvl>
+    <w:lvl w:ilvl="8">
+      <w:start w:val="1"/>
+      <w:numFmt w:val="bullet"/>
+      <w:lvlText w:val="▪"/>
+      <w:lvlJc w:val="left"/>
+      <w:pPr>
+        <w:tabs>
+          <w:tab w:val="num" w:pos="3600"/>
+        </w:tabs>
+        <w:ind w:left="3600" w:hanging="360"/>
+      </w:pPr>
+      <w:rPr>
+        <w:rFonts w:ascii="OpenSymbol" w:hAnsi="OpenSymbol" w:cs="OpenSymbol" w:hint="default"/>
+      </w:rPr>
+    </w:lvl>
+  </w:abstractNum>
+  <w:abstractNum w:abstractNumId="27">
+    <w:lvl w:ilvl="0">
+      <w:start w:val="1"/>
+      <w:numFmt w:val="bullet"/>
+      <w:lvlText w:val=""/>
+      <w:lvlJc w:val="left"/>
+      <w:pPr>
+        <w:tabs>
+          <w:tab w:val="num" w:pos="720"/>
+        </w:tabs>
+        <w:ind w:left="720" w:hanging="360"/>
+      </w:pPr>
+      <w:rPr>
+        <w:rFonts w:ascii="Symbol" w:hAnsi="Symbol" w:cs="Symbol" w:hint="default"/>
+      </w:rPr>
+    </w:lvl>
+    <w:lvl w:ilvl="1">
+      <w:start w:val="1"/>
+      <w:numFmt w:val="bullet"/>
+      <w:lvlText w:val="◦"/>
+      <w:lvlJc w:val="left"/>
+      <w:pPr>
+        <w:tabs>
+          <w:tab w:val="num" w:pos="1080"/>
+        </w:tabs>
+        <w:ind w:left="1080" w:hanging="360"/>
+      </w:pPr>
+      <w:rPr>
+        <w:rFonts w:ascii="OpenSymbol" w:hAnsi="OpenSymbol" w:cs="OpenSymbol" w:hint="default"/>
+      </w:rPr>
+    </w:lvl>
+    <w:lvl w:ilvl="2">
+      <w:start w:val="1"/>
+      <w:numFmt w:val="bullet"/>
+      <w:lvlText w:val="▪"/>
+      <w:lvlJc w:val="left"/>
+      <w:pPr>
+        <w:tabs>
+          <w:tab w:val="num" w:pos="1440"/>
+        </w:tabs>
+        <w:ind w:left="1440" w:hanging="360"/>
+      </w:pPr>
+      <w:rPr>
+        <w:rFonts w:ascii="OpenSymbol" w:hAnsi="OpenSymbol" w:cs="OpenSymbol" w:hint="default"/>
+      </w:rPr>
+    </w:lvl>
+    <w:lvl w:ilvl="3">
+      <w:start w:val="1"/>
+      <w:numFmt w:val="bullet"/>
+      <w:lvlText w:val=""/>
+      <w:lvlJc w:val="left"/>
+      <w:pPr>
+        <w:tabs>
+          <w:tab w:val="num" w:pos="1800"/>
+        </w:tabs>
+        <w:ind w:left="1800" w:hanging="360"/>
+      </w:pPr>
+      <w:rPr>
+        <w:rFonts w:ascii="Symbol" w:hAnsi="Symbol" w:cs="Symbol" w:hint="default"/>
+      </w:rPr>
+    </w:lvl>
+    <w:lvl w:ilvl="4">
+      <w:start w:val="1"/>
+      <w:numFmt w:val="bullet"/>
+      <w:lvlText w:val="◦"/>
+      <w:lvlJc w:val="left"/>
+      <w:pPr>
+        <w:tabs>
+          <w:tab w:val="num" w:pos="2160"/>
+        </w:tabs>
+        <w:ind w:left="2160" w:hanging="360"/>
+      </w:pPr>
+      <w:rPr>
+        <w:rFonts w:ascii="OpenSymbol" w:hAnsi="OpenSymbol" w:cs="OpenSymbol" w:hint="default"/>
+      </w:rPr>
+    </w:lvl>
+    <w:lvl w:ilvl="5">
+      <w:start w:val="1"/>
+      <w:numFmt w:val="bullet"/>
+      <w:lvlText w:val="▪"/>
+      <w:lvlJc w:val="left"/>
+      <w:pPr>
+        <w:tabs>
+          <w:tab w:val="num" w:pos="2520"/>
+        </w:tabs>
+        <w:ind w:left="2520" w:hanging="360"/>
+      </w:pPr>
+      <w:rPr>
+        <w:rFonts w:ascii="OpenSymbol" w:hAnsi="OpenSymbol" w:cs="OpenSymbol" w:hint="default"/>
+      </w:rPr>
+    </w:lvl>
+    <w:lvl w:ilvl="6">
+      <w:start w:val="1"/>
+      <w:numFmt w:val="bullet"/>
+      <w:lvlText w:val=""/>
+      <w:lvlJc w:val="left"/>
+      <w:pPr>
+        <w:tabs>
+          <w:tab w:val="num" w:pos="2880"/>
+        </w:tabs>
+        <w:ind w:left="2880" w:hanging="360"/>
+      </w:pPr>
+      <w:rPr>
+        <w:rFonts w:ascii="Symbol" w:hAnsi="Symbol" w:cs="Symbol" w:hint="default"/>
+      </w:rPr>
+    </w:lvl>
+    <w:lvl w:ilvl="7">
+      <w:start w:val="1"/>
+      <w:numFmt w:val="bullet"/>
+      <w:lvlText w:val="◦"/>
+      <w:lvlJc w:val="left"/>
+      <w:pPr>
+        <w:tabs>
+          <w:tab w:val="num" w:pos="3240"/>
+        </w:tabs>
+        <w:ind w:left="3240" w:hanging="360"/>
+      </w:pPr>
+      <w:rPr>
+        <w:rFonts w:ascii="OpenSymbol" w:hAnsi="OpenSymbol" w:cs="OpenSymbol" w:hint="default"/>
+      </w:rPr>
+    </w:lvl>
+    <w:lvl w:ilvl="8">
+      <w:start w:val="1"/>
+      <w:numFmt w:val="bullet"/>
+      <w:lvlText w:val="▪"/>
+      <w:lvlJc w:val="left"/>
+      <w:pPr>
+        <w:tabs>
+          <w:tab w:val="num" w:pos="3600"/>
+        </w:tabs>
+        <w:ind w:left="3600" w:hanging="360"/>
+      </w:pPr>
+      <w:rPr>
+        <w:rFonts w:ascii="OpenSymbol" w:hAnsi="OpenSymbol" w:cs="OpenSymbol" w:hint="default"/>
+      </w:rPr>
+    </w:lvl>
+  </w:abstractNum>
+  <w:abstractNum w:abstractNumId="28">
     <w:lvl w:ilvl="0">
       <w:start w:val="1"/>
       <w:numFmt w:val="none"/>
@@ -9297,6 +10210,12 @@
   </w:num>
   <w:num w:numId="26">
     <w:abstractNumId w:val="26"/>
+  </w:num>
+  <w:num w:numId="27">
+    <w:abstractNumId w:val="27"/>
+  </w:num>
+  <w:num w:numId="28">
+    <w:abstractNumId w:val="28"/>
   </w:num>
 </w:numbering>
 </file>
@@ -10086,15 +11005,22 @@
       <w:lang w:val="en-US" w:eastAsia="uk-UA"/>
     </w:rPr>
   </w:style>
+  <w:style w:type="character" w:styleId="Style12">
+    <w:name w:val="Символ нумерації"/>
+    <w:qFormat/>
+    <w:rPr/>
+  </w:style>
   <w:style w:type="character" w:styleId="user">
     <w:name w:val="Символ нумерації (user)"/>
     <w:qFormat/>
     <w:rPr/>
   </w:style>
-  <w:style w:type="character" w:styleId="Style12">
-    <w:name w:val="Символ нумерації"/>
+  <w:style w:type="character" w:styleId="user1">
+    <w:name w:val="Маркери (user)"/>
     <w:qFormat/>
-    <w:rPr/>
+    <w:rPr>
+      <w:rFonts w:ascii="OpenSymbol" w:hAnsi="OpenSymbol" w:eastAsia="OpenSymbol" w:cs="OpenSymbol"/>
+    </w:rPr>
   </w:style>
   <w:style w:type="character" w:styleId="Style13">
     <w:name w:val="Маркери"/>
@@ -10113,7 +11039,7 @@
       <w:spacing w:before="240" w:after="120"/>
     </w:pPr>
     <w:rPr>
-      <w:rFonts w:ascii="Liberation Sans" w:hAnsi="Liberation Sans" w:eastAsia="Microsoft YaHei" w:cs="Arial Unicode MS"/>
+      <w:rFonts w:ascii="Liberation Sans" w:hAnsi="Liberation Sans" w:eastAsia="Microsoft YaHei" w:cs="Lucida Sans"/>
       <w:sz w:val="28"/>
       <w:szCs w:val="28"/>
     </w:rPr>
@@ -10158,10 +11084,10 @@
       <w:suppressLineNumbers/>
     </w:pPr>
     <w:rPr>
-      <w:rFonts w:cs="Arial Unicode MS"/>
+      <w:rFonts w:cs="Lucida Sans"/>
     </w:rPr>
   </w:style>
-  <w:style w:type="paragraph" w:styleId="user1">
+  <w:style w:type="paragraph" w:styleId="user2">
     <w:name w:val="Заголовок (user)"/>
     <w:basedOn w:val="Normal"/>
     <w:next w:val="BodyText"/>
@@ -10171,12 +11097,12 @@
       <w:spacing w:before="240" w:after="120"/>
     </w:pPr>
     <w:rPr>
-      <w:rFonts w:ascii="Liberation Sans" w:hAnsi="Liberation Sans" w:eastAsia="Microsoft YaHei" w:cs="Lucida Sans"/>
+      <w:rFonts w:ascii="Liberation Sans" w:hAnsi="Liberation Sans" w:eastAsia="Microsoft YaHei" w:cs="Arial Unicode MS"/>
       <w:sz w:val="28"/>
       <w:szCs w:val="28"/>
     </w:rPr>
   </w:style>
-  <w:style w:type="paragraph" w:styleId="user2">
+  <w:style w:type="paragraph" w:styleId="user3">
     <w:name w:val="Покажчик (user)"/>
     <w:basedOn w:val="Normal"/>
     <w:qFormat/>
@@ -10184,12 +11110,12 @@
       <w:suppressLineNumbers/>
     </w:pPr>
     <w:rPr>
-      <w:rFonts w:cs="Lucida Sans"/>
+      <w:rFonts w:cs="Arial Unicode MS"/>
     </w:rPr>
   </w:style>
   <w:style w:type="paragraph" w:styleId="IndexHeading">
     <w:name w:val="index heading"/>
-    <w:basedOn w:val="Style14"/>
+    <w:basedOn w:val="user2"/>
     <w:pPr/>
     <w:rPr/>
   </w:style>
@@ -10467,8 +11393,8 @@
     </w:pPr>
     <w:rPr/>
   </w:style>
-  <w:style w:type="paragraph" w:styleId="Style16">
-    <w:name w:val="Вміст таблиці"/>
+  <w:style w:type="paragraph" w:styleId="user4">
+    <w:name w:val="Вміст таблиці (user)"/>
     <w:basedOn w:val="Normal"/>
     <w:qFormat/>
     <w:pPr>
@@ -10477,8 +11403,8 @@
     </w:pPr>
     <w:rPr/>
   </w:style>
-  <w:style w:type="numbering" w:styleId="Style17" w:default="1">
-    <w:name w:val="Без маркерів"/>
+  <w:style w:type="numbering" w:styleId="user5" w:default="1">
+    <w:name w:val="Без маркерів (user)"/>
     <w:uiPriority w:val="99"/>
     <w:semiHidden/>
     <w:unhideWhenUsed/>

</xml_diff>

<commit_message>
chore: PK lecture done
</commit_message>
<xml_diff>
--- a/51PK Psyhologija karjery/1/PK1_KNT-116m_Onyshchenko_15.docx
+++ b/51PK Psyhologija karjery/1/PK1_KNT-116m_Onyshchenko_15.docx
@@ -907,7 +907,7 @@
           </w:tcPr>
           <w:p>
             <w:pPr>
-              <w:pStyle w:val="user4"/>
+              <w:pStyle w:val="Style16"/>
               <w:spacing w:lineRule="auto" w:line="240"/>
               <w:ind w:hanging="0" w:left="0"/>
               <w:rPr>
@@ -936,7 +936,7 @@
           </w:tcPr>
           <w:p>
             <w:pPr>
-              <w:pStyle w:val="user4"/>
+              <w:pStyle w:val="Style16"/>
               <w:spacing w:lineRule="auto" w:line="240"/>
               <w:ind w:hanging="0" w:left="0"/>
               <w:rPr>
@@ -966,7 +966,7 @@
           </w:tcPr>
           <w:p>
             <w:pPr>
-              <w:pStyle w:val="user4"/>
+              <w:pStyle w:val="Style16"/>
               <w:spacing w:lineRule="auto" w:line="240"/>
               <w:ind w:hanging="0" w:left="0"/>
               <w:rPr/>
@@ -988,7 +988,7 @@
           </w:tcPr>
           <w:p>
             <w:pPr>
-              <w:pStyle w:val="user4"/>
+              <w:pStyle w:val="Style16"/>
               <w:spacing w:lineRule="auto" w:line="240"/>
               <w:ind w:hanging="0" w:left="0"/>
               <w:rPr/>
@@ -1011,7 +1011,7 @@
           </w:tcPr>
           <w:p>
             <w:pPr>
-              <w:pStyle w:val="user4"/>
+              <w:pStyle w:val="Style16"/>
               <w:spacing w:lineRule="auto" w:line="240"/>
               <w:ind w:hanging="0" w:left="0"/>
               <w:rPr/>
@@ -1033,7 +1033,7 @@
           </w:tcPr>
           <w:p>
             <w:pPr>
-              <w:pStyle w:val="user4"/>
+              <w:pStyle w:val="Style16"/>
               <w:spacing w:lineRule="auto" w:line="240"/>
               <w:ind w:hanging="0" w:left="0"/>
               <w:rPr/>
@@ -1056,7 +1056,7 @@
           </w:tcPr>
           <w:p>
             <w:pPr>
-              <w:pStyle w:val="user4"/>
+              <w:pStyle w:val="Style16"/>
               <w:spacing w:lineRule="auto" w:line="240"/>
               <w:ind w:hanging="0" w:left="0"/>
               <w:rPr/>
@@ -1078,7 +1078,7 @@
           </w:tcPr>
           <w:p>
             <w:pPr>
-              <w:pStyle w:val="user4"/>
+              <w:pStyle w:val="Style16"/>
               <w:spacing w:lineRule="auto" w:line="240"/>
               <w:ind w:hanging="0" w:left="0"/>
               <w:rPr/>
@@ -1101,7 +1101,7 @@
           </w:tcPr>
           <w:p>
             <w:pPr>
-              <w:pStyle w:val="user4"/>
+              <w:pStyle w:val="Style16"/>
               <w:spacing w:lineRule="auto" w:line="240"/>
               <w:ind w:hanging="0" w:left="0"/>
               <w:rPr/>
@@ -1123,7 +1123,7 @@
           </w:tcPr>
           <w:p>
             <w:pPr>
-              <w:pStyle w:val="user4"/>
+              <w:pStyle w:val="Style16"/>
               <w:spacing w:lineRule="auto" w:line="240"/>
               <w:ind w:hanging="0" w:left="0"/>
               <w:rPr/>
@@ -1146,7 +1146,7 @@
           </w:tcPr>
           <w:p>
             <w:pPr>
-              <w:pStyle w:val="user4"/>
+              <w:pStyle w:val="Style16"/>
               <w:spacing w:lineRule="auto" w:line="240"/>
               <w:ind w:hanging="0" w:left="0"/>
               <w:rPr/>
@@ -1168,7 +1168,7 @@
           </w:tcPr>
           <w:p>
             <w:pPr>
-              <w:pStyle w:val="user4"/>
+              <w:pStyle w:val="Style16"/>
               <w:spacing w:lineRule="auto" w:line="240"/>
               <w:ind w:hanging="0" w:left="0"/>
               <w:rPr/>
@@ -1715,7 +1715,7 @@
           </w:tcPr>
           <w:p>
             <w:pPr>
-              <w:pStyle w:val="user4"/>
+              <w:pStyle w:val="Style16"/>
               <w:ind w:hanging="0" w:left="0"/>
               <w:rPr/>
             </w:pPr>
@@ -1737,7 +1737,7 @@
           </w:tcPr>
           <w:p>
             <w:pPr>
-              <w:pStyle w:val="user4"/>
+              <w:pStyle w:val="Style16"/>
               <w:ind w:hanging="0" w:left="0"/>
               <w:rPr/>
             </w:pPr>
@@ -1788,7 +1788,7 @@
           </w:tcPr>
           <w:p>
             <w:pPr>
-              <w:pStyle w:val="user4"/>
+              <w:pStyle w:val="Style16"/>
               <w:ind w:hanging="0" w:left="0"/>
               <w:rPr/>
             </w:pPr>
@@ -1810,7 +1810,7 @@
           </w:tcPr>
           <w:p>
             <w:pPr>
-              <w:pStyle w:val="user4"/>
+              <w:pStyle w:val="Style16"/>
               <w:ind w:hanging="0" w:left="0"/>
               <w:rPr/>
             </w:pPr>
@@ -3062,7 +3062,7 @@
           </w:tcPr>
           <w:p>
             <w:pPr>
-              <w:pStyle w:val="user4"/>
+              <w:pStyle w:val="Style16"/>
               <w:spacing w:lineRule="auto" w:line="240"/>
               <w:ind w:hanging="0" w:left="0"/>
               <w:rPr>
@@ -3091,7 +3091,7 @@
           </w:tcPr>
           <w:p>
             <w:pPr>
-              <w:pStyle w:val="user4"/>
+              <w:pStyle w:val="Style16"/>
               <w:spacing w:lineRule="auto" w:line="240"/>
               <w:ind w:hanging="0" w:left="0"/>
               <w:rPr>
@@ -3121,7 +3121,7 @@
           </w:tcPr>
           <w:p>
             <w:pPr>
-              <w:pStyle w:val="user4"/>
+              <w:pStyle w:val="Style16"/>
               <w:spacing w:lineRule="auto" w:line="240"/>
               <w:ind w:hanging="0" w:left="0"/>
               <w:rPr/>
@@ -3143,7 +3143,7 @@
           </w:tcPr>
           <w:p>
             <w:pPr>
-              <w:pStyle w:val="user4"/>
+              <w:pStyle w:val="Style16"/>
               <w:spacing w:lineRule="auto" w:line="240"/>
               <w:ind w:hanging="0" w:left="0"/>
               <w:rPr/>
@@ -3167,7 +3167,7 @@
           </w:tcPr>
           <w:p>
             <w:pPr>
-              <w:pStyle w:val="user4"/>
+              <w:pStyle w:val="Style16"/>
               <w:spacing w:lineRule="auto" w:line="240"/>
               <w:ind w:hanging="0" w:left="0"/>
               <w:rPr/>
@@ -3189,7 +3189,7 @@
           </w:tcPr>
           <w:p>
             <w:pPr>
-              <w:pStyle w:val="user4"/>
+              <w:pStyle w:val="Style16"/>
               <w:spacing w:lineRule="auto" w:line="240"/>
               <w:ind w:hanging="0" w:left="0"/>
               <w:rPr/>
@@ -3213,7 +3213,7 @@
           </w:tcPr>
           <w:p>
             <w:pPr>
-              <w:pStyle w:val="user4"/>
+              <w:pStyle w:val="Style16"/>
               <w:spacing w:lineRule="auto" w:line="240"/>
               <w:ind w:hanging="0" w:left="0"/>
               <w:rPr/>
@@ -3235,7 +3235,7 @@
           </w:tcPr>
           <w:p>
             <w:pPr>
-              <w:pStyle w:val="user4"/>
+              <w:pStyle w:val="Style16"/>
               <w:spacing w:lineRule="auto" w:line="240"/>
               <w:ind w:hanging="0" w:left="0"/>
               <w:rPr/>
@@ -3259,7 +3259,7 @@
           </w:tcPr>
           <w:p>
             <w:pPr>
-              <w:pStyle w:val="user4"/>
+              <w:pStyle w:val="Style16"/>
               <w:spacing w:lineRule="auto" w:line="240"/>
               <w:ind w:hanging="0" w:left="0"/>
               <w:rPr/>
@@ -3281,7 +3281,7 @@
           </w:tcPr>
           <w:p>
             <w:pPr>
-              <w:pStyle w:val="user4"/>
+              <w:pStyle w:val="Style16"/>
               <w:spacing w:lineRule="auto" w:line="240"/>
               <w:ind w:hanging="0" w:left="0"/>
               <w:rPr/>
@@ -3305,7 +3305,7 @@
           </w:tcPr>
           <w:p>
             <w:pPr>
-              <w:pStyle w:val="user4"/>
+              <w:pStyle w:val="Style16"/>
               <w:spacing w:lineRule="auto" w:line="240"/>
               <w:ind w:hanging="0" w:left="0"/>
               <w:rPr/>
@@ -3327,7 +3327,7 @@
           </w:tcPr>
           <w:p>
             <w:pPr>
-              <w:pStyle w:val="user4"/>
+              <w:pStyle w:val="Style16"/>
               <w:spacing w:lineRule="auto" w:line="240"/>
               <w:ind w:hanging="0" w:left="0"/>
               <w:rPr/>
@@ -3741,7 +3741,7 @@
           </w:tcPr>
           <w:p>
             <w:pPr>
-              <w:pStyle w:val="user4"/>
+              <w:pStyle w:val="Style16"/>
               <w:spacing w:lineRule="auto" w:line="240"/>
               <w:ind w:hanging="0" w:left="0"/>
               <w:rPr>
@@ -3770,7 +3770,7 @@
           </w:tcPr>
           <w:p>
             <w:pPr>
-              <w:pStyle w:val="user4"/>
+              <w:pStyle w:val="Style16"/>
               <w:spacing w:lineRule="auto" w:line="240"/>
               <w:ind w:hanging="0" w:left="0"/>
               <w:rPr>
@@ -3800,7 +3800,7 @@
           </w:tcPr>
           <w:p>
             <w:pPr>
-              <w:pStyle w:val="user4"/>
+              <w:pStyle w:val="Style16"/>
               <w:spacing w:lineRule="auto" w:line="240"/>
               <w:ind w:hanging="0" w:left="0"/>
               <w:rPr/>
@@ -3822,7 +3822,7 @@
           </w:tcPr>
           <w:p>
             <w:pPr>
-              <w:pStyle w:val="user4"/>
+              <w:pStyle w:val="Style16"/>
               <w:spacing w:lineRule="auto" w:line="240"/>
               <w:ind w:hanging="0" w:left="0"/>
               <w:rPr/>
@@ -3846,7 +3846,7 @@
           </w:tcPr>
           <w:p>
             <w:pPr>
-              <w:pStyle w:val="user4"/>
+              <w:pStyle w:val="Style16"/>
               <w:spacing w:lineRule="auto" w:line="240"/>
               <w:ind w:hanging="0" w:left="0"/>
               <w:rPr/>
@@ -3868,7 +3868,7 @@
           </w:tcPr>
           <w:p>
             <w:pPr>
-              <w:pStyle w:val="user4"/>
+              <w:pStyle w:val="Style16"/>
               <w:spacing w:lineRule="auto" w:line="240"/>
               <w:ind w:hanging="0" w:left="0"/>
               <w:rPr/>
@@ -3892,7 +3892,7 @@
           </w:tcPr>
           <w:p>
             <w:pPr>
-              <w:pStyle w:val="user4"/>
+              <w:pStyle w:val="Style16"/>
               <w:spacing w:lineRule="auto" w:line="240"/>
               <w:ind w:hanging="0" w:left="0"/>
               <w:rPr/>
@@ -3914,7 +3914,7 @@
           </w:tcPr>
           <w:p>
             <w:pPr>
-              <w:pStyle w:val="user4"/>
+              <w:pStyle w:val="Style16"/>
               <w:spacing w:lineRule="auto" w:line="240"/>
               <w:ind w:hanging="0" w:left="0"/>
               <w:rPr/>
@@ -3966,7 +3966,7 @@
           </w:tcPr>
           <w:p>
             <w:pPr>
-              <w:pStyle w:val="user4"/>
+              <w:pStyle w:val="Style16"/>
               <w:spacing w:lineRule="auto" w:line="240"/>
               <w:ind w:hanging="0" w:left="0"/>
               <w:rPr>
@@ -3995,7 +3995,7 @@
           </w:tcPr>
           <w:p>
             <w:pPr>
-              <w:pStyle w:val="user4"/>
+              <w:pStyle w:val="Style16"/>
               <w:spacing w:lineRule="auto" w:line="240"/>
               <w:ind w:hanging="0" w:left="0"/>
               <w:rPr>
@@ -4025,7 +4025,7 @@
           </w:tcPr>
           <w:p>
             <w:pPr>
-              <w:pStyle w:val="user4"/>
+              <w:pStyle w:val="Style16"/>
               <w:spacing w:lineRule="auto" w:line="240"/>
               <w:ind w:hanging="0" w:left="0"/>
               <w:rPr/>
@@ -4047,7 +4047,7 @@
           </w:tcPr>
           <w:p>
             <w:pPr>
-              <w:pStyle w:val="user4"/>
+              <w:pStyle w:val="Style16"/>
               <w:spacing w:lineRule="auto" w:line="240"/>
               <w:ind w:hanging="0" w:left="0"/>
               <w:rPr/>
@@ -4071,7 +4071,7 @@
           </w:tcPr>
           <w:p>
             <w:pPr>
-              <w:pStyle w:val="user4"/>
+              <w:pStyle w:val="Style16"/>
               <w:spacing w:lineRule="auto" w:line="240"/>
               <w:ind w:hanging="0" w:left="0"/>
               <w:rPr/>
@@ -4093,7 +4093,7 @@
           </w:tcPr>
           <w:p>
             <w:pPr>
-              <w:pStyle w:val="user4"/>
+              <w:pStyle w:val="Style16"/>
               <w:spacing w:lineRule="auto" w:line="240"/>
               <w:ind w:hanging="0" w:left="0"/>
               <w:rPr/>
@@ -4117,7 +4117,7 @@
           </w:tcPr>
           <w:p>
             <w:pPr>
-              <w:pStyle w:val="user4"/>
+              <w:pStyle w:val="Style16"/>
               <w:spacing w:lineRule="auto" w:line="240"/>
               <w:ind w:hanging="0" w:left="0"/>
               <w:rPr/>
@@ -4139,7 +4139,7 @@
           </w:tcPr>
           <w:p>
             <w:pPr>
-              <w:pStyle w:val="user4"/>
+              <w:pStyle w:val="Style16"/>
               <w:spacing w:lineRule="auto" w:line="240"/>
               <w:ind w:hanging="0" w:left="0"/>
               <w:rPr/>
@@ -5870,11 +5870,7 @@
       </w:pPr>
       <w:r>
         <w:rPr/>
-        <w:t xml:space="preserve">1 </w:t>
-      </w:r>
-      <w:r>
-        <w:rPr/>
-        <w:t>Що є предметом психології кар'єри?</w:t>
+        <w:t>1 Що є предметом психології кар'єри?</w:t>
       </w:r>
     </w:p>
     <w:p>
@@ -5912,46 +5908,26 @@
       </w:pPr>
       <w:r>
         <w:rPr/>
-        <w:t xml:space="preserve">2 </w:t>
-      </w:r>
-      <w:r>
-        <w:rPr/>
-        <w:t>У чому полягає відмінність між поняттями «робота», «професія» та «кар'єра»?</w:t>
-      </w:r>
-    </w:p>
-    <w:p>
-      <w:pPr>
-        <w:pStyle w:val="P1"/>
-        <w:rPr/>
-      </w:pPr>
-      <w:r>
-        <w:rPr/>
-      </w:r>
-    </w:p>
-    <w:p>
-      <w:pPr>
-        <w:pStyle w:val="P1"/>
-        <w:rPr/>
-      </w:pPr>
-      <w:r>
-        <w:rPr/>
-        <w:t xml:space="preserve">Робота — діяльність, яку людина виконує для отримання </w:t>
-      </w:r>
-      <w:r>
-        <w:rPr/>
-        <w:t xml:space="preserve">якогось </w:t>
-      </w:r>
-      <w:r>
-        <w:rPr/>
-        <w:t xml:space="preserve">результату, заробітку </w:t>
-      </w:r>
-      <w:r>
-        <w:rPr/>
-        <w:t xml:space="preserve">чи </w:t>
-      </w:r>
-      <w:r>
-        <w:rPr/>
-        <w:t>користі.</w:t>
+        <w:t>2 У чому полягає відмінність між поняттями «робота», «професія» та «кар'єра»?</w:t>
+      </w:r>
+    </w:p>
+    <w:p>
+      <w:pPr>
+        <w:pStyle w:val="P1"/>
+        <w:rPr/>
+      </w:pPr>
+      <w:r>
+        <w:rPr/>
+      </w:r>
+    </w:p>
+    <w:p>
+      <w:pPr>
+        <w:pStyle w:val="P1"/>
+        <w:rPr/>
+      </w:pPr>
+      <w:r>
+        <w:rPr/>
+        <w:t>Робота — діяльність, яку людина виконує для отримання якогось результату, заробітку чи користі.</w:t>
       </w:r>
     </w:p>
     <w:p>
@@ -5990,11 +5966,7 @@
       </w:pPr>
       <w:r>
         <w:rPr/>
-        <w:t xml:space="preserve">3 </w:t>
-      </w:r>
-      <w:r>
-        <w:rPr/>
-        <w:t>Які чинники визначають професійний успіх?</w:t>
+        <w:t>3 Які чинники визначають професійний успіх?</w:t>
       </w:r>
     </w:p>
     <w:p>
@@ -6032,11 +6004,7 @@
       </w:pPr>
       <w:r>
         <w:rPr/>
-        <w:t xml:space="preserve">4 </w:t>
-      </w:r>
-      <w:r>
-        <w:rPr/>
-        <w:t>Які сучасні моделі кар'єри існують?</w:t>
+        <w:t>4 Які сучасні моделі кар'єри існують?</w:t>
       </w:r>
     </w:p>
     <w:p>
@@ -6194,11 +6162,7 @@
       </w:pPr>
       <w:r>
         <w:rPr/>
-        <w:t xml:space="preserve">5 </w:t>
-      </w:r>
-      <w:r>
-        <w:rPr/>
-        <w:t>Як цифровізація впливає на професійний розвиток?</w:t>
+        <w:t>5 Як цифровізація впливає на професійний розвиток?</w:t>
       </w:r>
     </w:p>
     <w:p>
@@ -6236,11 +6200,7 @@
       </w:pPr>
       <w:r>
         <w:rPr/>
-        <w:t xml:space="preserve">6 </w:t>
-      </w:r>
-      <w:r>
-        <w:rPr/>
-        <w:t>Які особливості кар'єрного розвитку випускників різних спеціальностей?</w:t>
+        <w:t>6 Які особливості кар'єрного розвитку випускників різних спеціальностей?</w:t>
       </w:r>
     </w:p>
     <w:p>
@@ -6358,11 +6318,7 @@
       </w:pPr>
       <w:r>
         <w:rPr/>
-        <w:t xml:space="preserve">7 </w:t>
-      </w:r>
-      <w:r>
-        <w:rPr/>
-        <w:t>Які психологічні якості сприяють професійній самореалізації?</w:t>
+        <w:t>7 Які психологічні якості сприяють професійній самореалізації?</w:t>
       </w:r>
     </w:p>
     <w:p>
@@ -6400,11 +6356,7 @@
       </w:pPr>
       <w:r>
         <w:rPr/>
-        <w:t xml:space="preserve">8 </w:t>
-      </w:r>
-      <w:r>
-        <w:rPr/>
-        <w:t>Чому безперервне навчання стало необхідною умовою сучасної кар'єри?</w:t>
+        <w:t>8 Чому безперервне навчання стало необхідною умовою сучасної кар'єри?</w:t>
       </w:r>
     </w:p>
     <w:p>
@@ -11005,25 +10957,25 @@
       <w:lang w:val="en-US" w:eastAsia="uk-UA"/>
     </w:rPr>
   </w:style>
+  <w:style w:type="character" w:styleId="user">
+    <w:name w:val="Символ нумерації (user)"/>
+    <w:qFormat/>
+    <w:rPr/>
+  </w:style>
   <w:style w:type="character" w:styleId="Style12">
     <w:name w:val="Символ нумерації"/>
     <w:qFormat/>
     <w:rPr/>
   </w:style>
-  <w:style w:type="character" w:styleId="user">
-    <w:name w:val="Символ нумерації (user)"/>
-    <w:qFormat/>
-    <w:rPr/>
-  </w:style>
-  <w:style w:type="character" w:styleId="user1">
-    <w:name w:val="Маркери (user)"/>
+  <w:style w:type="character" w:styleId="Style13">
+    <w:name w:val="Маркери"/>
     <w:qFormat/>
     <w:rPr>
       <w:rFonts w:ascii="OpenSymbol" w:hAnsi="OpenSymbol" w:eastAsia="OpenSymbol" w:cs="OpenSymbol"/>
     </w:rPr>
   </w:style>
-  <w:style w:type="character" w:styleId="Style13">
-    <w:name w:val="Маркери"/>
+  <w:style w:type="character" w:styleId="user1">
+    <w:name w:val="Маркери (user)"/>
     <w:qFormat/>
     <w:rPr>
       <w:rFonts w:ascii="OpenSymbol" w:hAnsi="OpenSymbol" w:eastAsia="OpenSymbol" w:cs="OpenSymbol"/>
@@ -11039,7 +10991,7 @@
       <w:spacing w:before="240" w:after="120"/>
     </w:pPr>
     <w:rPr>
-      <w:rFonts w:ascii="Liberation Sans" w:hAnsi="Liberation Sans" w:eastAsia="Microsoft YaHei" w:cs="Lucida Sans"/>
+      <w:rFonts w:ascii="Liberation Sans" w:hAnsi="Liberation Sans" w:eastAsia="Microsoft YaHei" w:cs="Arial Unicode MS"/>
       <w:sz w:val="28"/>
       <w:szCs w:val="28"/>
     </w:rPr>
@@ -11084,7 +11036,7 @@
       <w:suppressLineNumbers/>
     </w:pPr>
     <w:rPr>
-      <w:rFonts w:cs="Lucida Sans"/>
+      <w:rFonts w:cs="Arial Unicode MS"/>
     </w:rPr>
   </w:style>
   <w:style w:type="paragraph" w:styleId="user2">
@@ -11097,7 +11049,7 @@
       <w:spacing w:before="240" w:after="120"/>
     </w:pPr>
     <w:rPr>
-      <w:rFonts w:ascii="Liberation Sans" w:hAnsi="Liberation Sans" w:eastAsia="Microsoft YaHei" w:cs="Arial Unicode MS"/>
+      <w:rFonts w:ascii="Liberation Sans" w:hAnsi="Liberation Sans" w:eastAsia="Microsoft YaHei" w:cs="Lucida Sans"/>
       <w:sz w:val="28"/>
       <w:szCs w:val="28"/>
     </w:rPr>
@@ -11110,12 +11062,12 @@
       <w:suppressLineNumbers/>
     </w:pPr>
     <w:rPr>
-      <w:rFonts w:cs="Arial Unicode MS"/>
+      <w:rFonts w:cs="Lucida Sans"/>
     </w:rPr>
   </w:style>
   <w:style w:type="paragraph" w:styleId="IndexHeading">
     <w:name w:val="index heading"/>
-    <w:basedOn w:val="user2"/>
+    <w:basedOn w:val="Style14"/>
     <w:pPr/>
     <w:rPr/>
   </w:style>
@@ -11393,8 +11345,8 @@
     </w:pPr>
     <w:rPr/>
   </w:style>
-  <w:style w:type="paragraph" w:styleId="user4">
-    <w:name w:val="Вміст таблиці (user)"/>
+  <w:style w:type="paragraph" w:styleId="Style16">
+    <w:name w:val="Вміст таблиці"/>
     <w:basedOn w:val="Normal"/>
     <w:qFormat/>
     <w:pPr>
@@ -11403,8 +11355,8 @@
     </w:pPr>
     <w:rPr/>
   </w:style>
-  <w:style w:type="numbering" w:styleId="user5" w:default="1">
-    <w:name w:val="Без маркерів (user)"/>
+  <w:style w:type="numbering" w:styleId="Style17" w:default="1">
+    <w:name w:val="Без маркерів"/>
     <w:uiPriority w:val="99"/>
     <w:semiHidden/>
     <w:unhideWhenUsed/>

</xml_diff>